<commit_message>
feat(plan-universal): formalizacion plan universal 3a8, alineacion skills y correccion canonica mat-oa04
</commit_message>
<xml_diff>
--- a/LECCIONES/110-7/Matematica/OA04/Plan_Maestro_7Básico_110-7-MAT-OA04_6Lecciones.docx
+++ b/LECCIONES/110-7/Matematica/OA04/Plan_Maestro_7Básico_110-7-MAT-OA04_6Lecciones.docx
@@ -52,7 +52,8 @@
           <w:szCs w:val="20"/>
         </w:rPr>
         <w:t xml:space="preserve">Desglose Instruccional en 6 Lecciones de 30 Minutos (8 Pasos Pedagógicos Oficiales)
-Incluye Enlaces a Videos en Cloudflare R2, Prompts Anime Moderno 16:9 y Ficha Técnica de Aula</w:t>
+Incluye Enlaces a Videos en Cloudflare R2, Prompts Anime Moderno 16:9 y Ficha Técnica de Aula
+Fecha de Actualización Oficial: 08-10-2026, 3:56:16 p. m. (America/Santiago)</w:t>
       </w:r>
     </w:p>
     <w:p>
@@ -1147,11 +1148,11 @@
         <w:rPr>
           <w:b/>
           <w:bCs/>
-          <w:color w:val="B45309"/>
+          <w:color w:val="0F766E"/>
           <w:sz w:val="19"/>
           <w:szCs w:val="19"/>
         </w:rPr>
-        <w:t xml:space="preserve">• Protocolo de Comprobación Acústica Obligatoria (Google Vids): </w:t>
+        <w:t xml:space="preserve">• Calibración Audiovisual (Google Vids): </w:t>
       </w:r>
       <w:r>
         <w:rPr>
@@ -1159,7 +1160,7 @@
           <w:sz w:val="19"/>
           <w:szCs w:val="19"/>
         </w:rPr>
-        <w:t xml:space="preserve">Tras generar y exportar el audio en Google Vids, medir la duración real del archivo exportado con cronómetro o analizador de audio. El conteo de palabras no garantiza por sí solo que se obtengan 60 o 90 segundos exactos. Si la duración real no es exacta (60 s en gancho y 90 s en explicación), ajustar la narración, las pausas o el ritmo, volver a exportar y medir nuevamente. Registrar la duración comprobada; no marcar el requisito como cumplido basándose solo en el número de palabras o en una duración estimada.</w:t>
+        <w:t xml:space="preserve">El guion continuo está redactado con un presupuesto léxico referencial adaptado al nivel escolar. La calibración acústica, pausas y ritmo de locución se ajustan directamente en Google Vids durante la síntesis y renderizado, sin que el conteo de palabras ni la duración en segundos constituyan un criterio de bloqueo pedagógico.</w:t>
       </w:r>
     </w:p>
     <w:tbl>
@@ -1401,7 +1402,7 @@
                 <w:sz w:val="17"/>
                 <w:szCs w:val="17"/>
               </w:rPr>
-              <w:t xml:space="preserve">Modern anime style 16:9 widescreen illustration. Two 13-year-old student explorers, a girl with braided hair and a boy in a teal jacket, standing on a sunny school rooftop looking at a large square solar panel divided into a grid of 100 square cells. High contrast, bright sunny day, clean vector lines, ample negative space on the left. No text drawn by AI.</w:t>
+              <w:t xml:space="preserve">Modern anime style 16:9 widescreen illustration. Two 13-year-old student explorers, a girl with braided hair and a boy in a teal jacket, Two 13-year-old student explorers, a girl with braided hair and a boy in a teal jacket, standing on a sunny school rooftop looking at a large square solar panel divided into a grid of 100 square cells. High contrast, bright sunny day, clean vector lines, ample negative space on the left.. Clear lighting, vibrant colors, clear negative space for layout. No text drawn by AI.</w:t>
             </w:r>
           </w:p>
           <w:p>
@@ -1576,7 +1577,7 @@
                 <w:sz w:val="17"/>
                 <w:szCs w:val="17"/>
               </w:rPr>
-              <w:t xml:space="preserve">Modern anime style 16:9 widescreen illustration. The 13-year-old girl with braided hair pointing with a digital tablet at the solar panel grid, while the 13-year-old boy in a teal jacket counts illuminated blue cells. Clean modern anime aesthetic, bright flat saturated colors, generous negative space on top. No text drawn by AI.</w:t>
+              <w:t xml:space="preserve">Modern anime style 16:9 widescreen illustration. Two 13-year-old student explorers, a girl with braided hair and a boy in a teal jacket, The 13-year-old girl with braided hair pointing with a digital tablet at the solar panel grid, while the 13-year-old boy in a teal jacket counts illuminated blue cells. Clean modern anime aesthetic, bright flat saturated colors, generous negative space on top.. Clear lighting, vibrant colors, clear negative space for layout. No text drawn by AI.</w:t>
             </w:r>
           </w:p>
           <w:p>
@@ -1751,7 +1752,7 @@
                 <w:sz w:val="17"/>
                 <w:szCs w:val="17"/>
               </w:rPr>
-              <w:t xml:space="preserve">Modern anime style 16:9 widescreen illustration. The two 13-year-old students looking curiously at a digital display showing a glowing percent symbol. Thoughtful expressions, scientific classroom rooftop setting, sharp clean lines, negative space for layout. No text drawn by AI.</w:t>
+              <w:t xml:space="preserve">Modern anime style 16:9 widescreen illustration. Two 13-year-old student explorers, a girl with braided hair and a boy in a teal jacket, looking curiously at a digital display showing a glowing percent symbol. Thoughtful expressions, scientific classroom rooftop setting, sharp clean lines, negative space for layout.. Clear lighting, vibrant colors, clear negative space for layout. No text drawn by AI.</w:t>
             </w:r>
           </w:p>
           <w:p>
@@ -1926,7 +1927,7 @@
                 <w:sz w:val="17"/>
                 <w:szCs w:val="17"/>
               </w:rPr>
-              <w:t xml:space="preserve">Modern anime style 16:9 widescreen illustration. The 13-year-old boy and girl examining a clear holographic 10 by 10 grid floating between them. Crisp vector aesthetic, bright turquoise and orange accents, clean white highlights, negative space. No text drawn by AI.</w:t>
+              <w:t xml:space="preserve">Modern anime style 16:9 widescreen illustration. Two 13-year-old student explorers, a girl with braided hair and a boy in a teal jacket, examining a clear holographic 10 by 10 grid floating between them. Crisp vector aesthetic, bright turquoise and orange accents, clean white highlights, negative space.. Clear lighting, vibrant colors, clear negative space for layout. No text drawn by AI.</w:t>
             </w:r>
           </w:p>
           <w:p>
@@ -2101,7 +2102,7 @@
                 <w:sz w:val="17"/>
                 <w:szCs w:val="17"/>
               </w:rPr>
-              <w:t xml:space="preserve">Modern anime style 16:9 widescreen illustration. The two 13-year-old students happily observing four full rows of ten cells lighting up in bright energy glow on the panel. Cheerful collaborative atmosphere, negative space on the right. No text drawn by AI.</w:t>
+              <w:t xml:space="preserve">Modern anime style 16:9 widescreen illustration. Two 13-year-old student explorers, a girl with braided hair and a boy in a teal jacket, happily observing four full rows of ten cells lighting up in bright energy glow on the panel. Cheerful collaborative atmosphere, negative space on the right.. Clear lighting, vibrant colors, clear negative space for layout. No text drawn by AI.</w:t>
             </w:r>
           </w:p>
           <w:p>
@@ -2276,7 +2277,7 @@
                 <w:sz w:val="17"/>
                 <w:szCs w:val="17"/>
               </w:rPr>
-              <w:t xml:space="preserve">Modern anime style 16:9 widescreen illustration. The 13-year-old girl with braided hair writing on her digital notebook while the boy in a teal jacket gives a thumbs up. Clean bright modern anime, high clarity, negative space for mathematical formulas. No text drawn by AI.</w:t>
+              <w:t xml:space="preserve">Modern anime style 16:9 widescreen illustration. Two 13-year-old student explorers, a girl with braided hair and a boy in a teal jacket, The 13-year-old girl with braided hair writing on her digital notebook while the boy in a teal jacket gives a thumbs up. Clean bright modern anime, high clarity, negative space for mathematical formulas.. Clear lighting, vibrant colors, clear negative space for layout. No text drawn by AI.</w:t>
             </w:r>
           </w:p>
           <w:p>
@@ -2451,7 +2452,7 @@
                 <w:sz w:val="17"/>
                 <w:szCs w:val="17"/>
               </w:rPr>
-              <w:t xml:space="preserve">Modern anime style 16:9 widescreen illustration. Both 13-year-old student explorers smiling confidently toward the camera, inviting the viewer into the mathematics laboratory. Sunlit morning, bright clean colors, spacious negative space. No text drawn by AI.</w:t>
+              <w:t xml:space="preserve">Modern anime style 16:9 widescreen illustration. Two 13-year-old student explorers, a girl with braided hair and a boy in a teal jacket, Both 13-year-old student explorers smiling confidently toward the camera, inviting the viewer into the mathematics laboratory. Sunlit morning, bright clean colors, spacious negative space.. Clear lighting, vibrant colors, clear negative space for layout. No text drawn by AI.</w:t>
             </w:r>
           </w:p>
           <w:p>
@@ -2777,11 +2778,11 @@
         <w:rPr>
           <w:b/>
           <w:bCs/>
-          <w:color w:val="B45309"/>
+          <w:color w:val="0F766E"/>
           <w:sz w:val="19"/>
           <w:szCs w:val="19"/>
         </w:rPr>
-        <w:t xml:space="preserve">• Protocolo de Comprobación Acústica Obligatoria (Google Vids): </w:t>
+        <w:t xml:space="preserve">• Calibración Audiovisual (Google Vids): </w:t>
       </w:r>
       <w:r>
         <w:rPr>
@@ -2789,7 +2790,7 @@
           <w:sz w:val="19"/>
           <w:szCs w:val="19"/>
         </w:rPr>
-        <w:t xml:space="preserve">Tras generar y exportar el audio en Google Vids, medir la duración real del archivo exportado con cronómetro o analizador de audio. El conteo de palabras no garantiza por sí solo que se obtengan 60 o 90 segundos exactos. Si la duración real no es exacta (60 s en gancho y 90 s en explicación), ajustar la narración, las pausas o el ritmo, volver a exportar y medir nuevamente. Registrar la duración comprobada; no marcar el requisito como cumplido basándose solo en el número de palabras o en una duración estimada.</w:t>
+        <w:t xml:space="preserve">El guion continuo está redactado con un presupuesto léxico referencial adaptado al nivel escolar. La calibración acústica, pausas y ritmo de locución se ajustan directamente en Google Vids durante la síntesis y renderizado, sin que el conteo de palabras ni la duración en segundos constituyan un criterio de bloqueo pedagógico.</w:t>
       </w:r>
     </w:p>
     <w:tbl>
@@ -3031,7 +3032,7 @@
                 <w:sz w:val="17"/>
                 <w:szCs w:val="17"/>
               </w:rPr>
-              <w:t xml:space="preserve">Modern anime style 16:9 widescreen illustration. Two 13-year-old students, a girl with braided hair and a boy in a teal jacket, in a clean modern classroom looking at a digital blackboard. Generous negative space on the left. High contrast, bright flat colors. No text drawn by AI.</w:t>
+              <w:t xml:space="preserve">Modern anime style 16:9 widescreen illustration. Two 13-year-old student explorers, a girl with braided hair and a boy in a teal jacket, , a girl with braided hair and a boy in a teal jacket, in a clean modern classroom looking at a digital blackboard. Generous negative space on the left. High contrast, bright flat colors.. Clear lighting, vibrant colors, clear negative space for layout. No text drawn by AI.</w:t>
             </w:r>
           </w:p>
           <w:p>
@@ -3206,7 +3207,7 @@
                 <w:sz w:val="17"/>
                 <w:szCs w:val="17"/>
               </w:rPr>
-              <w:t xml:space="preserve">Modern anime style 16:9 widescreen illustration. The 13-year-old girl explaining with an open notebook, pointing to an illustrated ratio concept. Clean lines, bright cheerful classroom background, negative space on the right. No text drawn by AI.</w:t>
+              <w:t xml:space="preserve">Modern anime style 16:9 widescreen illustration. Two 13-year-old student explorers, a girl with braided hair and a boy in a teal jacket, The 13-year-old girl explaining with an open notebook, pointing to an illustrated ratio concept. Clean lines, bright cheerful classroom background, negative space on the right.. Clear lighting, vibrant colors, clear negative space for layout. No text drawn by AI.</w:t>
             </w:r>
           </w:p>
           <w:p>
@@ -3381,7 +3382,7 @@
                 <w:sz w:val="17"/>
                 <w:szCs w:val="17"/>
               </w:rPr>
-              <w:t xml:space="preserve">Modern anime style 16:9 widescreen illustration. A close-up view of the 13-year-old boy in teal jacket highlighting a single colored square within a large 100-cell grid. Sharp focus, clean modern anime, negative space. No text drawn by AI.</w:t>
+              <w:t xml:space="preserve">Modern anime style 16:9 widescreen illustration. Two 13-year-old student explorers, a girl with braided hair and a boy in a teal jacket, A close-up view of the 13-year-old boy in teal jacket highlighting a single colored square within a large 100-cell grid. Sharp focus, clean modern anime, negative space.. Clear lighting, vibrant colors, clear negative space for layout. No text drawn by AI.</w:t>
             </w:r>
           </w:p>
           <w:p>
@@ -3556,7 +3557,7 @@
                 <w:sz w:val="17"/>
                 <w:szCs w:val="17"/>
               </w:rPr>
-              <w:t xml:space="preserve">Modern anime style 16:9 widescreen illustration. Both 13-year-old students reviewing examples on an interactive tablet display. Clear lighting, neat classroom setup, negative space for mathematical notation. No text drawn by AI.</w:t>
+              <w:t xml:space="preserve">Modern anime style 16:9 widescreen illustration. Two 13-year-old student explorers, a girl with braided hair and a boy in a teal jacket, reviewing examples on an interactive tablet display.. Clear lighting, vibrant colors, clear negative space for layout. No text drawn by AI.</w:t>
             </w:r>
           </w:p>
           <w:p>
@@ -3731,7 +3732,7 @@
                 <w:sz w:val="17"/>
                 <w:szCs w:val="17"/>
               </w:rPr>
-              <w:t xml:space="preserve">Modern anime style 16:9 widescreen illustration. The full 100-cell grid glowing completely in warm golden light while the two 13-year-old students smile in comprehension. Clean vibrant aesthetic, negative space on left. No text drawn by AI.</w:t>
+              <w:t xml:space="preserve">Modern anime style 16:9 widescreen illustration. Two 13-year-old student explorers, a girl with braided hair and a boy in a teal jacket, The full 100-cell grid glowing completely in warm golden light while smile in comprehension. Clean vibrant aesthetic, negative space on left.. Clear lighting, vibrant colors, clear negative space for layout. No text drawn by AI.</w:t>
             </w:r>
           </w:p>
           <w:p>
@@ -3856,7 +3857,7 @@
                 <w:sz w:val="18"/>
                 <w:szCs w:val="18"/>
               </w:rPr>
-              <w:t xml:space="preserve">EJEMPLO MODELADO</w:t>
+              <w:t xml:space="preserve">EJEMPLO MODELADO: CASO 1</w:t>
             </w:r>
           </w:p>
           <w:p>
@@ -3878,7 +3879,7 @@
                 <w:sz w:val="18"/>
                 <w:szCs w:val="18"/>
               </w:rPr>
-              <w:t xml:space="preserve">En una cuadrícula de 100 cuadritos, se colorean exactamente 40</w:t>
+              <w:t xml:space="preserve">En una cuadrícula de 100 cuadritos iguales, se colorean exactamente 40 cuadritos</w:t>
             </w:r>
           </w:p>
         </w:tc>
@@ -3906,7 +3907,7 @@
                 <w:sz w:val="17"/>
                 <w:szCs w:val="17"/>
               </w:rPr>
-              <w:t xml:space="preserve">Modern anime style 16:9 widescreen illustration. The 13-year-old girl and boy pointing together at a grid of 100 cells where exactly 40 blue cells are neatly colored. Perfect visual clarity, spacious negative space for practice step. No text drawn by AI.</w:t>
+              <w:t xml:space="preserve">Modern anime style 16:9 widescreen illustration. Two 13-year-old student explorers, a girl with braided hair and a boy in a teal jacket, The 13-year-old girl and boy pointing together at a grid of 100 cells where exactly 40 blue cells are neatly colored. Perfect visual clarity, spacious negative space for practice step.. Clear lighting, vibrant colors, clear negative space for layout. No text drawn by AI.</w:t>
             </w:r>
           </w:p>
           <w:p>
@@ -3928,7 +3929,7 @@
                 <w:sz w:val="17"/>
                 <w:szCs w:val="17"/>
               </w:rPr>
-              <w:t xml:space="preserve">Cuadrícula 10x10 con exactamente 40 celdas coloreadas en azul: 40/100 = 40%</w:t>
+              <w:t xml:space="preserve">Resolución canónica: La razón es 40/100, lo que por definición es 40%.</w:t>
             </w:r>
           </w:p>
         </w:tc>
@@ -3949,7 +3950,7 @@
                 <w:sz w:val="18"/>
                 <w:szCs w:val="18"/>
               </w:rPr>
-              <w:t xml:space="preserve">Analicemos este caso: en una cuadrícula de cien cuadritos, coloreamos exactamente cuarenta. Al contar cuarenta de cien, el porcentaje representado es cuarenta por ciento.</w:t>
+              <w:t xml:space="preserve">Analicemos paso a paso el caso modelado: En una cuadrícula de 100 cuadritos iguales, se colorean exactamente 40 cuadritos de color azul. ¿Qué porcentaje de la cuadrícula está coloreado de azul? La razón es 40/100, lo que por definición es 40%. Por lo tanto, el resultado esperado es: 40%.</w:t>
             </w:r>
           </w:p>
         </w:tc>
@@ -4031,7 +4032,7 @@
                 <w:sz w:val="18"/>
                 <w:szCs w:val="18"/>
               </w:rPr>
-              <w:t xml:space="preserve">REGLA DE ORO DEL PORCENTAJE</w:t>
+              <w:t xml:space="preserve">REGLA DE ORO DE LA LECCIÓN</w:t>
             </w:r>
           </w:p>
           <w:p>
@@ -4081,7 +4082,7 @@
                 <w:sz w:val="17"/>
                 <w:szCs w:val="17"/>
               </w:rPr>
-              <w:t xml:space="preserve">Modern anime style 16:9 widescreen illustration. The two 13-year-old student explorers holding their notebooks, ready to begin interactive exercises. Modern anime style, bright friendly expressions, negative space. No text drawn by AI.</w:t>
+              <w:t xml:space="preserve">Modern anime style 16:9 widescreen illustration. Two 13-year-old student explorers, a girl with braided hair and a boy in a teal jacket, The two 13-year-old student explorers holding their notebooks, ready to begin interactive exercises. Modern anime style, bright friendly expressions, negative space.. Clear lighting, vibrant colors, clear negative space for layout. No text drawn by AI.</w:t>
             </w:r>
           </w:p>
           <w:p>
@@ -4124,7 +4125,7 @@
                 <w:sz w:val="18"/>
                 <w:szCs w:val="18"/>
               </w:rPr>
-              <w:t xml:space="preserve">Regla de oro: cualquier cantidad comparada directamente con cien se convierte de inmediato en su porcentaje correspondiente: p por ciento es p dividido en cien. Ahora continuemos con la práctica interactiva.</w:t>
+              <w:t xml:space="preserve">Regla de oro: El porcentaje es una razón de consecuente 100. Ahora pon a prueba lo aprendido resolviendo los casos de práctica en la plataforma interactiva.</w:t>
             </w:r>
           </w:p>
         </w:tc>
@@ -4152,10 +4153,10 @@
           <w:b/>
           <w:bCs/>
         </w:rPr>
-        <w:t xml:space="preserve">Comprobación 1 (En el video explicativo analizamos una cuadrícula de 100 cuadritos con 40 celdas coloreadas.): </w:t>
-      </w:r>
-      <w:r>
-        <w:t xml:space="preserve">¿Por qué 40 cuadritos de 100 representan directamente el 40%?</w:t>
+        <w:t xml:space="preserve">Comprobación 1 (En una cuadrícula de 100 cuadritos iguales, se colorean exactamente 40 cuadritos de color azul.): </w:t>
+      </w:r>
+      <w:r>
+        <w:t xml:space="preserve">¿Qué porcentaje de la cuadrícula está coloreado de azul?</w:t>
       </w:r>
     </w:p>
     <w:p>
@@ -4171,7 +4172,7 @@
         <w:t xml:space="preserve">• Respuesta esperada: </w:t>
       </w:r>
       <w:r>
-        <w:t xml:space="preserve">Porque cada cuadrito es 1%, por lo que 40 cuadritos equivalen a 40%.</w:t>
+        <w:t xml:space="preserve">40%</w:t>
       </w:r>
       <w:r>
         <w:rPr>
@@ -4182,7 +4183,7 @@
         <w:t xml:space="preserve"> | Pista socrática: </w:t>
       </w:r>
       <w:r>
-        <w:t xml:space="preserve">Recuerda que el porcentaje expresa cuántas partes se toman de cada 100.</w:t>
+        <w:t xml:space="preserve">Cuenta las partes pintadas sobre el total de 100 cuadritos.</w:t>
       </w:r>
     </w:p>
     <w:p>
@@ -4198,7 +4199,65 @@
         <w:t xml:space="preserve">• Texto revelado al estudiante: </w:t>
       </w:r>
       <w:r>
-        <w:t xml:space="preserve">Representa el 40% porque son 40 partes de un total de 100.</w:t>
+        <w:t xml:space="preserve">Está coloreado el 40%.</w:t>
+      </w:r>
+    </w:p>
+    <w:p>
+      <w:pPr>
+        <w:spacing w:after="40" w:before="60"/>
+      </w:pPr>
+      <w:r>
+        <w:rPr>
+          <w:b/>
+          <w:bCs/>
+        </w:rPr>
+        <w:t xml:space="preserve">Comprobación 2 (En un mosaico de 100 baldosas cuadradas en el patio de la escuela, 65 baldosas son de color verde y el resto son blancas.): </w:t>
+      </w:r>
+      <w:r>
+        <w:t xml:space="preserve">¿Qué porcentaje del mosaico está formado por baldosas verdes?</w:t>
+      </w:r>
+    </w:p>
+    <w:p>
+      <w:pPr>
+        <w:spacing w:after="40"/>
+      </w:pPr>
+      <w:r>
+        <w:rPr>
+          <w:b/>
+          <w:bCs/>
+          <w:color w:val="0284C7"/>
+        </w:rPr>
+        <w:t xml:space="preserve">• Respuesta esperada: </w:t>
+      </w:r>
+      <w:r>
+        <w:t xml:space="preserve">65%</w:t>
+      </w:r>
+      <w:r>
+        <w:rPr>
+          <w:b/>
+          <w:bCs/>
+          <w:color w:val="D97706"/>
+        </w:rPr>
+        <w:t xml:space="preserve"> | Pista socrática: </w:t>
+      </w:r>
+      <w:r>
+        <w:t xml:space="preserve">El total de baldosas es 100. Compara las 65 verdes con ese total.</w:t>
+      </w:r>
+    </w:p>
+    <w:p>
+      <w:pPr>
+        <w:spacing w:after="60"/>
+      </w:pPr>
+      <w:r>
+        <w:rPr>
+          <w:b/>
+          <w:bCs/>
+          <w:color w:val="0F766E"/>
+        </w:rPr>
+        <w:t xml:space="preserve">• Texto revelado al estudiante: </w:t>
+      </w:r>
+      <w:r>
+        <w:t xml:space="preserve">El 65% de las baldosas son verdes.</w:t>
       </w:r>
     </w:p>
     <w:p>
@@ -5460,11 +5519,11 @@
         <w:rPr>
           <w:b/>
           <w:bCs/>
-          <w:color w:val="B45309"/>
+          <w:color w:val="0F766E"/>
           <w:sz w:val="19"/>
           <w:szCs w:val="19"/>
         </w:rPr>
-        <w:t xml:space="preserve">• Protocolo de Comprobación Acústica Obligatoria (Google Vids): </w:t>
+        <w:t xml:space="preserve">• Calibración Audiovisual (Google Vids): </w:t>
       </w:r>
       <w:r>
         <w:rPr>
@@ -5472,7 +5531,7 @@
           <w:sz w:val="19"/>
           <w:szCs w:val="19"/>
         </w:rPr>
-        <w:t xml:space="preserve">Tras generar y exportar el audio en Google Vids, medir la duración real del archivo exportado con cronómetro o analizador de audio. El conteo de palabras no garantiza por sí solo que se obtengan 60 o 90 segundos exactos. Si la duración real no es exacta (60 s en gancho y 90 s en explicación), ajustar la narración, las pausas o el ritmo, volver a exportar y medir nuevamente. Registrar la duración comprobada; no marcar el requisito como cumplido basándose solo en el número de palabras o en una duración estimada.</w:t>
+        <w:t xml:space="preserve">El guion continuo está redactado con un presupuesto léxico referencial adaptado al nivel escolar. La calibración acústica, pausas y ritmo de locución se ajustan directamente en Google Vids durante la síntesis y renderizado, sin que el conteo de palabras ni la duración en segundos constituyan un criterio de bloqueo pedagógico.</w:t>
       </w:r>
     </w:p>
     <w:tbl>
@@ -5714,7 +5773,7 @@
                 <w:sz w:val="17"/>
                 <w:szCs w:val="17"/>
               </w:rPr>
-              <w:t xml:space="preserve">Modern anime style 16:9 widescreen illustration. Two 13-year-old student explorers, a girl with braided hair and a boy in a teal jacket, in a bright home economics kitchen classroom looking at a recipe chalkboard. Clean kitchen counters, glass measuring cups, bright daylight, generous negative space on the left. No text drawn by AI.</w:t>
+              <w:t xml:space="preserve">Modern anime style 16:9 widescreen illustration. Two 13-year-old student explorers, a girl with braided hair and a boy in a teal jacket, Two 13-year-old student explorers, a girl with braided hair and a boy in a teal jacket, in a bright home economics kitchen classroom looking at a recipe chalkboard. Clean kitchen counters, glass measuring cups, bright daylight, generous negative space on the left.. Clear lighting, vibrant colors, clear negative space for layout. No text drawn by AI.</w:t>
             </w:r>
           </w:p>
           <w:p>
@@ -5889,7 +5948,7 @@
                 <w:sz w:val="17"/>
                 <w:szCs w:val="17"/>
               </w:rPr>
-              <w:t xml:space="preserve">Modern anime style 16:9 widescreen illustration. The 13-year-old girl holding a clear measuring cup showing liquid at the one-fourth mark, while the boy checks a digital scale. Modern anime style, bright flat saturated colors, negative space on top. No text drawn by AI.</w:t>
+              <w:t xml:space="preserve">Modern anime style 16:9 widescreen illustration. Two 13-year-old student explorers, a girl with braided hair and a boy in a teal jacket, The 13-year-old girl holding a clear measuring cup showing liquid at the one-fourth mark, while the boy checks a digital scale. Modern anime style, bright flat saturated colors, negative space on top.. Clear lighting, vibrant colors, clear negative space for layout. No text drawn by AI.</w:t>
             </w:r>
           </w:p>
           <w:p>
@@ -6064,7 +6123,7 @@
                 <w:sz w:val="17"/>
                 <w:szCs w:val="17"/>
               </w:rPr>
-              <w:t xml:space="preserve">Modern anime style 16:9 widescreen illustration. The 13-year-old boy in a teal jacket pointing to the digital scale display showing decimal numbers. Inquisitive expression, clean scientific aesthetic, negative space. No text drawn by AI.</w:t>
+              <w:t xml:space="preserve">Modern anime style 16:9 widescreen illustration. Two 13-year-old student explorers, a girl with braided hair and a boy in a teal jacket, The 13-year-old boy in a teal jacket pointing to the digital scale display showing decimal numbers. Inquisitive expression, clean scientific aesthetic, negative space.. Clear lighting, vibrant colors, clear negative space for layout. No text drawn by AI.</w:t>
             </w:r>
           </w:p>
           <w:p>
@@ -6239,7 +6298,7 @@
                 <w:sz w:val="17"/>
                 <w:szCs w:val="17"/>
               </w:rPr>
-              <w:t xml:space="preserve">Modern anime style 16:9 widescreen illustration. Both 13-year-old students calculating on a digital whiteboard, showing the decimal point shifting two places to the left. Sharp focus, clean graphics, negative space on the right. No text drawn by AI.</w:t>
+              <w:t xml:space="preserve">Modern anime style 16:9 widescreen illustration. Two 13-year-old student explorers, a girl with braided hair and a boy in a teal jacket, calculating on a digital whiteboard, showing the decimal point shifting two places to the left. Sharp focus, clean graphics, negative space on the right.. Clear lighting, vibrant colors, clear negative space for layout. No text drawn by AI.</w:t>
             </w:r>
           </w:p>
           <w:p>
@@ -6414,7 +6473,7 @@
                 <w:sz w:val="17"/>
                 <w:szCs w:val="17"/>
               </w:rPr>
-              <w:t xml:space="preserve">Modern anime style 16:9 widescreen illustration. The two 13-year-old students smiling in agreement as the ingredients measure perfectly. Bright kitchen atmosphere, high contrast, clean vector overlays. No text drawn by AI.</w:t>
+              <w:t xml:space="preserve">Modern anime style 16:9 widescreen illustration. Two 13-year-old student explorers, a girl with braided hair and a boy in a teal jacket, smiling in agreement as the ingredients measure perfectly. Bright kitchen atmosphere, high contrast, clean vector overlays.. Clear lighting, vibrant colors, clear negative space for layout. No text drawn by AI.</w:t>
             </w:r>
           </w:p>
           <w:p>
@@ -6589,7 +6648,7 @@
                 <w:sz w:val="17"/>
                 <w:szCs w:val="17"/>
               </w:rPr>
-              <w:t xml:space="preserve">Modern anime style 16:9 widescreen illustration. The 13-year-old girl writing a new problem in her notebook: 20%. The boy watches attentively. Clean lines, negative space for calculations. No text drawn by AI.</w:t>
+              <w:t xml:space="preserve">Modern anime style 16:9 widescreen illustration. Two 13-year-old student explorers, a girl with braided hair and a boy in a teal jacket, The 13-year-old girl writing a new problem in her notebook: 20%. The boy watches attentively. Clean lines, negative space for calculations.. Clear lighting, vibrant colors, clear negative space for layout. No text drawn by AI.</w:t>
             </w:r>
           </w:p>
           <w:p>
@@ -6764,7 +6823,7 @@
                 <w:sz w:val="17"/>
                 <w:szCs w:val="17"/>
               </w:rPr>
-              <w:t xml:space="preserve">Modern anime style 16:9 widescreen illustration. Both 13-year-old students waving cheerfully in front of a neat blackboard filled with fraction and percent relations. Bright welcoming mood, spacious negative space. No text drawn by AI.</w:t>
+              <w:t xml:space="preserve">Modern anime style 16:9 widescreen illustration. Two 13-year-old student explorers, a girl with braided hair and a boy in a teal jacket, waving cheerfully in front of a neat blackboard filled with fraction and percent relations. Bright welcoming mood, spacious negative space.. Clear lighting, vibrant colors, clear negative space for layout. No text drawn by AI.</w:t>
             </w:r>
           </w:p>
           <w:p>
@@ -7090,11 +7149,11 @@
         <w:rPr>
           <w:b/>
           <w:bCs/>
-          <w:color w:val="B45309"/>
+          <w:color w:val="0F766E"/>
           <w:sz w:val="19"/>
           <w:szCs w:val="19"/>
         </w:rPr>
-        <w:t xml:space="preserve">• Protocolo de Comprobación Acústica Obligatoria (Google Vids): </w:t>
+        <w:t xml:space="preserve">• Calibración Audiovisual (Google Vids): </w:t>
       </w:r>
       <w:r>
         <w:rPr>
@@ -7102,7 +7161,7 @@
           <w:sz w:val="19"/>
           <w:szCs w:val="19"/>
         </w:rPr>
-        <w:t xml:space="preserve">Tras generar y exportar el audio en Google Vids, medir la duración real del archivo exportado con cronómetro o analizador de audio. El conteo de palabras no garantiza por sí solo que se obtengan 60 o 90 segundos exactos. Si la duración real no es exacta (60 s en gancho y 90 s en explicación), ajustar la narración, las pausas o el ritmo, volver a exportar y medir nuevamente. Registrar la duración comprobada; no marcar el requisito como cumplido basándose solo en el número de palabras o en una duración estimada.</w:t>
+        <w:t xml:space="preserve">El guion continuo está redactado con un presupuesto léxico referencial adaptado al nivel escolar. La calibración acústica, pausas y ritmo de locución se ajustan directamente en Google Vids durante la síntesis y renderizado, sin que el conteo de palabras ni la duración en segundos constituyan un criterio de bloqueo pedagógico.</w:t>
       </w:r>
     </w:p>
     <w:tbl>
@@ -7316,7 +7375,7 @@
                 <w:sz w:val="18"/>
                 <w:szCs w:val="18"/>
               </w:rPr>
-              <w:t xml:space="preserve">Convertir porcentajes a fracciones irreductibles y números decimales</w:t>
+              <w:t xml:space="preserve">Equivalencia triple: porcentaje, fracción simplificada y número decimal</w:t>
             </w:r>
           </w:p>
         </w:tc>
@@ -7344,7 +7403,7 @@
                 <w:sz w:val="17"/>
                 <w:szCs w:val="17"/>
               </w:rPr>
-              <w:t xml:space="preserve">Modern anime style 16:9 widescreen illustration. Two 13-year-old students, a girl with braided hair and a boy in a teal jacket, standing beside a digital display in a bright classroom. Spacious negative space on left. Clean vector style. No text drawn by AI.</w:t>
+              <w:t xml:space="preserve">Modern anime style 16:9 widescreen illustration. Two 13-year-old student explorers, a girl with braided hair and a boy in a teal jacket, , a girl with braided hair and a boy in a teal jacket, standing beside a digital display in a bright classroom. Spacious negative space on left. Clean vector style.. Clear lighting, vibrant colors, clear negative space for layout. No text drawn by AI.</w:t>
             </w:r>
           </w:p>
           <w:p>
@@ -7387,7 +7446,7 @@
                 <w:sz w:val="18"/>
                 <w:szCs w:val="18"/>
               </w:rPr>
-              <w:t xml:space="preserve">Hoy aprenderemos a transformar cualquier porcentaje en su fracción irreducible y en su número decimal correspondiente mediante procedimientos matemáticos directos.</w:t>
+              <w:t xml:space="preserve">Hoy aprenderemos la equivalencia triple entre porcentaje, fracción simplificada y número decimal, utilizando simplificaciones rigurosas.</w:t>
             </w:r>
           </w:p>
         </w:tc>
@@ -7519,7 +7578,7 @@
                 <w:sz w:val="17"/>
                 <w:szCs w:val="17"/>
               </w:rPr>
-              <w:t xml:space="preserve">Modern anime style 16:9 widescreen illustration. The 13-year-old girl writing a fraction on a chalkboard. Clean neat numbers, bright daytime light, negative space on the right. No text drawn by AI.</w:t>
+              <w:t xml:space="preserve">Modern anime style 16:9 widescreen illustration. Two 13-year-old student explorers, a girl with braided hair and a boy in a teal jacket, The 13-year-old girl writing a fraction on a chalkboard. Clean neat numbers, bright daytime light, negative space on the right.. Clear lighting, vibrant colors, clear negative space for layout. No text drawn by AI.</w:t>
             </w:r>
           </w:p>
           <w:p>
@@ -7694,7 +7753,7 @@
                 <w:sz w:val="17"/>
                 <w:szCs w:val="17"/>
               </w:rPr>
-              <w:t xml:space="preserve">Modern anime style 16:9 widescreen illustration. The 13-year-old boy demonstrating step-by-step division by common factors on a notebook. High contrast, clear diagrams, negative space. No text drawn by AI.</w:t>
+              <w:t xml:space="preserve">Modern anime style 16:9 widescreen illustration. Two 13-year-old student explorers, a girl with braided hair and a boy in a teal jacket, The 13-year-old boy demonstrating step-by-step division by common factors on a notebook. High contrast, clear diagrams, negative space.. Clear lighting, vibrant colors, clear negative space for layout. No text drawn by AI.</w:t>
             </w:r>
           </w:p>
           <w:p>
@@ -7869,7 +7928,7 @@
                 <w:sz w:val="17"/>
                 <w:szCs w:val="17"/>
               </w:rPr>
-              <w:t xml:space="preserve">Modern anime style 16:9 widescreen illustration. Two 13-year-old students pointing at a number line with decimal steps. Bright clean graphics, negative space for decimal notation. No text drawn by AI.</w:t>
+              <w:t xml:space="preserve">Modern anime style 16:9 widescreen illustration. Two 13-year-old student explorers, a girl with braided hair and a boy in a teal jacket, pointing at a number line with decimal steps. Bright clean graphics, negative space for decimal notation.. Clear lighting, vibrant colors, clear negative space for layout. No text drawn by AI.</w:t>
             </w:r>
           </w:p>
           <w:p>
@@ -8044,7 +8103,7 @@
                 <w:sz w:val="17"/>
                 <w:szCs w:val="17"/>
               </w:rPr>
-              <w:t xml:space="preserve">Modern anime style 16:9 widescreen illustration. A tidy comparative chart floating in the classroom with clean columns for %, Fracción y Decimal. Ample negative space. No text drawn by AI.</w:t>
+              <w:t xml:space="preserve">Modern anime style 16:9 widescreen illustration. Two 13-year-old student explorers, a girl with braided hair and a boy in a teal jacket, A tidy comparative chart floating in the classroom with clean columns for %, Fracción y Decimal. Ample negative space.. Clear lighting, vibrant colors, clear negative space for layout. No text drawn by AI.</w:t>
             </w:r>
           </w:p>
           <w:p>
@@ -8169,7 +8228,7 @@
                 <w:sz w:val="18"/>
                 <w:szCs w:val="18"/>
               </w:rPr>
-              <w:t xml:space="preserve">EJEMPLO MODELADO: 20%</w:t>
+              <w:t xml:space="preserve">EJEMPLO MODELADO: CASO 1</w:t>
             </w:r>
           </w:p>
           <w:p>
@@ -8191,7 +8250,7 @@
                 <w:sz w:val="18"/>
                 <w:szCs w:val="18"/>
               </w:rPr>
-              <w:t xml:space="preserve">Fracción irreductible y decimal del 20%</w:t>
+              <w:t xml:space="preserve">Queremos transformar el 20% en su expresión fraccionaria irreductible y en su nú</w:t>
             </w:r>
           </w:p>
         </w:tc>
@@ -8219,7 +8278,7 @@
                 <w:sz w:val="17"/>
                 <w:szCs w:val="17"/>
               </w:rPr>
-              <w:t xml:space="preserve">Modern anime style 16:9 widescreen illustration. The two 13-year-old students solving the 20% case together on an interactive tablet. Clear, high contrast, negative space on the right. No text drawn by AI.</w:t>
+              <w:t xml:space="preserve">Modern anime style 16:9 widescreen illustration. Two 13-year-old student explorers, a girl with braided hair and a boy in a teal jacket, solving the 20% case together on an interactive tablet. Clear, high contrast, negative space on the right.. Clear lighting, vibrant colors, clear negative space for layout. No text drawn by AI.</w:t>
             </w:r>
           </w:p>
           <w:p>
@@ -8241,7 +8300,7 @@
                 <w:sz w:val="17"/>
                 <w:szCs w:val="17"/>
               </w:rPr>
-              <w:t xml:space="preserve">Resolución: 20% = 20/100 = 1/5 (dividiendo por 20) | 20 : 100 = 0,2</w:t>
+              <w:t xml:space="preserve">Resolución canónica: 20% = 20/100 = 1/5 = 0,2.</w:t>
             </w:r>
           </w:p>
         </w:tc>
@@ -8262,7 +8321,7 @@
                 <w:sz w:val="18"/>
                 <w:szCs w:val="18"/>
               </w:rPr>
-              <w:t xml:space="preserve">Resolvamos juntos el caso del veinte por ciento: como fracción es veinte sobre cien, que simplificado entre veinte nos da un quinto. Como decimal es cero coma dos.</w:t>
+              <w:t xml:space="preserve">Analicemos paso a paso el caso modelado: Queremos transformar el 20% en su expresión fraccionaria irreductible y en su número decimal correspondiente. ¿Cuál es la fracción irreductible y el número decimal equivalente al 20%? 20% = 20/100 = 1/5 = 0,2. Por lo tanto, el resultado esperado es: Fracción: 1/5 y Decimal: 0,2.</w:t>
             </w:r>
           </w:p>
         </w:tc>
@@ -8344,7 +8403,7 @@
                 <w:sz w:val="18"/>
                 <w:szCs w:val="18"/>
               </w:rPr>
-              <w:t xml:space="preserve">REGLA DE ORO DE LA CONVERSIÓN</w:t>
+              <w:t xml:space="preserve">REGLA DE ORO DE LA LECCIÓN</w:t>
             </w:r>
           </w:p>
           <w:p>
@@ -8394,7 +8453,7 @@
                 <w:sz w:val="17"/>
                 <w:szCs w:val="17"/>
               </w:rPr>
-              <w:t xml:space="preserve">Modern anime style 16:9 widescreen illustration. The 13-year-old girl and boy smiling confidently, holding their pencils ready for practice. Bright classroom, negative space. No text drawn by AI.</w:t>
+              <w:t xml:space="preserve">Modern anime style 16:9 widescreen illustration. Two 13-year-old student explorers, a girl with braided hair and a boy in a teal jacket, The 13-year-old girl and boy smiling confidently, holding their pencils ready for practice. Bright classroom, negative space.. Clear lighting, vibrant colors, clear negative space for layout. No text drawn by AI.</w:t>
             </w:r>
           </w:p>
           <w:p>
@@ -8437,7 +8496,7 @@
                 <w:sz w:val="18"/>
                 <w:szCs w:val="18"/>
               </w:rPr>
-              <w:t xml:space="preserve">Regla de oro: el porcentaje, la fracción irreducible y el decimal representan la misma cantidad en lenguajes distintos: p por ciento es siempre p dividido en cien. Ahora practiquemos en la plataforma.</w:t>
+              <w:t xml:space="preserve">Regla de oro: Todo porcentaje tiene su gemelo fraccionario y decimal. Ahora pon a prueba lo aprendido resolviendo los casos de práctica en la plataforma interactiva.</w:t>
             </w:r>
           </w:p>
         </w:tc>
@@ -8465,10 +8524,10 @@
           <w:b/>
           <w:bCs/>
         </w:rPr>
-        <w:t xml:space="preserve">Comprobación 1 (En el video modelamos la conversión del 20%.): </w:t>
-      </w:r>
-      <w:r>
-        <w:t xml:space="preserve">¿Por qué 20/100 se simplifica a 1/5 y no a 2/10 como resultado final?</w:t>
+        <w:t xml:space="preserve">Comprobación 1 (Queremos transformar el 20% en su expresión fraccionaria irreductible y en su número decimal correspondiente.): </w:t>
+      </w:r>
+      <w:r>
+        <w:t xml:space="preserve">¿Cuál es la fracción irreductible y el número decimal equivalente al 20%?</w:t>
       </w:r>
     </w:p>
     <w:p>
@@ -8484,7 +8543,7 @@
         <w:t xml:space="preserve">• Respuesta esperada: </w:t>
       </w:r>
       <w:r>
-        <w:t xml:space="preserve">Porque 2/10 aún se puede simplificar dividiendo por 2, hasta llegar a la fracción irreducible 1/5.</w:t>
+        <w:t xml:space="preserve">Fracción: 1/5 y Decimal: 0,2</w:t>
       </w:r>
       <w:r>
         <w:rPr>
@@ -8495,7 +8554,7 @@
         <w:t xml:space="preserve"> | Pista socrática: </w:t>
       </w:r>
       <w:r>
-        <w:t xml:space="preserve">Recuerda que una fracción es irreductible cuando el numerador y el denominador ya no se pueden dividir por un factor común mayor que 1.</w:t>
+        <w:t xml:space="preserve">Escribe 20/100 y divide ambos términos por 20. Luego divide 20 por 100 para el decimal.</w:t>
       </w:r>
     </w:p>
     <w:p>
@@ -8511,7 +8570,65 @@
         <w:t xml:space="preserve">• Texto revelado al estudiante: </w:t>
       </w:r>
       <w:r>
-        <w:t xml:space="preserve">Porque 1/5 es la fracción irreductible máxima.</w:t>
+        <w:t xml:space="preserve">Fracción: 1/5 | Decimal: 0,2.</w:t>
+      </w:r>
+    </w:p>
+    <w:p>
+      <w:pPr>
+        <w:spacing w:after="40" w:before="60"/>
+      </w:pPr>
+      <w:r>
+        <w:rPr>
+          <w:b/>
+          <w:bCs/>
+        </w:rPr>
+        <w:t xml:space="preserve">Comprobación 2 (Un estudiante desea expresar el 75% como fracción irreductible y como decimal.): </w:t>
+      </w:r>
+      <w:r>
+        <w:t xml:space="preserve">¿Cuáles son los valores correspondientes al 75%?</w:t>
+      </w:r>
+    </w:p>
+    <w:p>
+      <w:pPr>
+        <w:spacing w:after="40"/>
+      </w:pPr>
+      <w:r>
+        <w:rPr>
+          <w:b/>
+          <w:bCs/>
+          <w:color w:val="0284C7"/>
+        </w:rPr>
+        <w:t xml:space="preserve">• Respuesta esperada: </w:t>
+      </w:r>
+      <w:r>
+        <w:t xml:space="preserve">Fracción: 3/4 y Decimal: 0,75</w:t>
+      </w:r>
+      <w:r>
+        <w:rPr>
+          <w:b/>
+          <w:bCs/>
+          <w:color w:val="D97706"/>
+        </w:rPr>
+        <w:t xml:space="preserve"> | Pista socrática: </w:t>
+      </w:r>
+      <w:r>
+        <w:t xml:space="preserve">Divide 75 y 100 por 25 para la fracción. Para el decimal, corre la coma dos lugares a la izquierda.</w:t>
+      </w:r>
+    </w:p>
+    <w:p>
+      <w:pPr>
+        <w:spacing w:after="60"/>
+      </w:pPr>
+      <w:r>
+        <w:rPr>
+          <w:b/>
+          <w:bCs/>
+          <w:color w:val="0F766E"/>
+        </w:rPr>
+        <w:t xml:space="preserve">• Texto revelado al estudiante: </w:t>
+      </w:r>
+      <w:r>
+        <w:t xml:space="preserve">Fracción: 3/4 | Decimal: 0,75.</w:t>
       </w:r>
     </w:p>
     <w:p>
@@ -9758,11 +9875,11 @@
         <w:rPr>
           <w:b/>
           <w:bCs/>
-          <w:color w:val="B45309"/>
+          <w:color w:val="0F766E"/>
           <w:sz w:val="19"/>
           <w:szCs w:val="19"/>
         </w:rPr>
-        <w:t xml:space="preserve">• Protocolo de Comprobación Acústica Obligatoria (Google Vids): </w:t>
+        <w:t xml:space="preserve">• Calibración Audiovisual (Google Vids): </w:t>
       </w:r>
       <w:r>
         <w:rPr>
@@ -9770,7 +9887,7 @@
           <w:sz w:val="19"/>
           <w:szCs w:val="19"/>
         </w:rPr>
-        <w:t xml:space="preserve">Tras generar y exportar el audio en Google Vids, medir la duración real del archivo exportado con cronómetro o analizador de audio. El conteo de palabras no garantiza por sí solo que se obtengan 60 o 90 segundos exactos. Si la duración real no es exacta (60 s en gancho y 90 s en explicación), ajustar la narración, las pausas o el ritmo, volver a exportar y medir nuevamente. Registrar la duración comprobada; no marcar el requisito como cumplido basándose solo en el número de palabras o en una duración estimada.</w:t>
+        <w:t xml:space="preserve">El guion continuo está redactado con un presupuesto léxico referencial adaptado al nivel escolar. La calibración acústica, pausas y ritmo de locución se ajustan directamente en Google Vids durante la síntesis y renderizado, sin que el conteo de palabras ni la duración en segundos constituyan un criterio de bloqueo pedagógico.</w:t>
       </w:r>
     </w:p>
     <w:tbl>
@@ -10012,7 +10129,7 @@
                 <w:sz w:val="17"/>
                 <w:szCs w:val="17"/>
               </w:rPr>
-              <w:t xml:space="preserve">Modern anime style 16:9 widescreen illustration. Two 13-year-old students, a girl with braided hair and a boy in a teal jacket, walking through a lively school book fair with colorful discount banners. High contrast, bright sunny afternoon, spacious negative space on the left. No text drawn by AI.</w:t>
+              <w:t xml:space="preserve">Modern anime style 16:9 widescreen illustration. Two 13-year-old student explorers, a girl with braided hair and a boy in a teal jacket, , a girl with braided hair and a boy in a teal jacket, walking through a lively school book fair with colorful discount banners. High contrast, bright sunny afternoon, spacious negative space on the left.. Clear lighting, vibrant colors, clear negative space for layout. No text drawn by AI.</w:t>
             </w:r>
           </w:p>
           <w:p>
@@ -10187,7 +10304,7 @@
                 <w:sz w:val="17"/>
                 <w:szCs w:val="17"/>
               </w:rPr>
-              <w:t xml:space="preserve">Modern anime style 16:9 widescreen illustration. The 13-year-old girl pointing at an adventure novel marked at 8000 pesos with a 50 percent off sticker. Clean anime aesthetic, cheerful expression, negative space on top. No text drawn by AI.</w:t>
+              <w:t xml:space="preserve">Modern anime style 16:9 widescreen illustration. Two 13-year-old student explorers, a girl with braided hair and a boy in a teal jacket, The 13-year-old girl pointing at an adventure novel marked at 8000 pesos with a 50 percent off sticker. Clean anime aesthetic, cheerful expression, negative space on top.. Clear lighting, vibrant colors, clear negative space for layout. No text drawn by AI.</w:t>
             </w:r>
           </w:p>
           <w:p>
@@ -10362,7 +10479,7 @@
                 <w:sz w:val="17"/>
                 <w:szCs w:val="17"/>
               </w:rPr>
-              <w:t xml:space="preserve">Modern anime style 16:9 widescreen illustration. The 13-year-old boy in a teal jacket thinking with fingers on his chin looking at a 25 percent banner. Thought bubble with clean division diagram, negative space. No text drawn by AI.</w:t>
+              <w:t xml:space="preserve">Modern anime style 16:9 widescreen illustration. Two 13-year-old student explorers, a girl with braided hair and a boy in a teal jacket, The 13-year-old boy in a teal jacket thinking with fingers on his chin looking at a 25 percent banner. Thought bubble with clean division diagram, negative space.. Clear lighting, vibrant colors, clear negative space for layout. No text drawn by AI.</w:t>
             </w:r>
           </w:p>
           <w:p>
@@ -10537,7 +10654,7 @@
                 <w:sz w:val="17"/>
                 <w:szCs w:val="17"/>
               </w:rPr>
-              <w:t xml:space="preserve">Modern anime style 16:9 widescreen illustration. Both 13-year-old students examining a science encyclopedia marked at 10 percent off. Clear lighting, neat book stalls, negative space for calculations. No text drawn by AI.</w:t>
+              <w:t xml:space="preserve">Modern anime style 16:9 widescreen illustration. Two 13-year-old student explorers, a girl with braided hair and a boy in a teal jacket, examining a science encyclopedia marked at 10 percent off.. Clear lighting, vibrant colors, clear negative space for layout. No text drawn by AI.</w:t>
             </w:r>
           </w:p>
           <w:p>
@@ -10712,7 +10829,7 @@
                 <w:sz w:val="17"/>
                 <w:szCs w:val="17"/>
               </w:rPr>
-              <w:t xml:space="preserve">Modern anime style 16:9 widescreen illustration. The 13-year-old girl showing the boy a mental trick with two quick hand gestures. Modern anime style, bright colors, generous negative space. No text drawn by AI.</w:t>
+              <w:t xml:space="preserve">Modern anime style 16:9 widescreen illustration. Two 13-year-old student explorers, a girl with braided hair and a boy in a teal jacket, The 13-year-old girl showing the boy a mental trick with two quick hand gestures. Modern anime style, bright colors, generous negative space.. Clear lighting, vibrant colors, clear negative space for layout. No text drawn by AI.</w:t>
             </w:r>
           </w:p>
           <w:p>
@@ -10887,7 +11004,7 @@
                 <w:sz w:val="17"/>
                 <w:szCs w:val="17"/>
               </w:rPr>
-              <w:t xml:space="preserve">Modern anime style 16:9 widescreen illustration. Both 13-year-old students calculating in their heads while looking at a sign indicating 150 pages with 20% already read. High contrast, clean vector overlays. No text drawn by AI.</w:t>
+              <w:t xml:space="preserve">Modern anime style 16:9 widescreen illustration. Two 13-year-old student explorers, a girl with braided hair and a boy in a teal jacket, calculating in their heads while looking at a sign indicating 150 pages with 20% already read. High contrast, clean vector overlays.. Clear lighting, vibrant colors, clear negative space for layout. No text drawn by AI.</w:t>
             </w:r>
           </w:p>
           <w:p>
@@ -11062,7 +11179,7 @@
                 <w:sz w:val="17"/>
                 <w:szCs w:val="17"/>
               </w:rPr>
-              <w:t xml:space="preserve">Modern anime style 16:9 widescreen illustration. Both 13-year-old students standing proudly with their purchased books, ready to enter the classroom. Bright daylight, spacious negative space. No text drawn by AI.</w:t>
+              <w:t xml:space="preserve">Modern anime style 16:9 widescreen illustration. Two 13-year-old student explorers, a girl with braided hair and a boy in a teal jacket, standing proudly with their purchased books, ready to enter the classroom. Bright daylight, spacious negative space.. Clear lighting, vibrant colors, clear negative space for layout. No text drawn by AI.</w:t>
             </w:r>
           </w:p>
           <w:p>
@@ -11388,11 +11505,11 @@
         <w:rPr>
           <w:b/>
           <w:bCs/>
-          <w:color w:val="B45309"/>
+          <w:color w:val="0F766E"/>
           <w:sz w:val="19"/>
           <w:szCs w:val="19"/>
         </w:rPr>
-        <w:t xml:space="preserve">• Protocolo de Comprobación Acústica Obligatoria (Google Vids): </w:t>
+        <w:t xml:space="preserve">• Calibración Audiovisual (Google Vids): </w:t>
       </w:r>
       <w:r>
         <w:rPr>
@@ -11400,7 +11517,7 @@
           <w:sz w:val="19"/>
           <w:szCs w:val="19"/>
         </w:rPr>
-        <w:t xml:space="preserve">Tras generar y exportar el audio en Google Vids, medir la duración real del archivo exportado con cronómetro o analizador de audio. El conteo de palabras no garantiza por sí solo que se obtengan 60 o 90 segundos exactos. Si la duración real no es exacta (60 s en gancho y 90 s en explicación), ajustar la narración, las pausas o el ritmo, volver a exportar y medir nuevamente. Registrar la duración comprobada; no marcar el requisito como cumplido basándose solo en el número de palabras o en una duración estimada.</w:t>
+        <w:t xml:space="preserve">El guion continuo está redactado con un presupuesto léxico referencial adaptado al nivel escolar. La calibración acústica, pausas y ritmo de locución se ajustan directamente en Google Vids durante la síntesis y renderizado, sin que el conteo de palabras ni la duración en segundos constituyan un criterio de bloqueo pedagógico.</w:t>
       </w:r>
     </w:p>
     <w:tbl>
@@ -11614,7 +11731,7 @@
                 <w:sz w:val="18"/>
                 <w:szCs w:val="18"/>
               </w:rPr>
-              <w:t xml:space="preserve">Calcular mentalmente porcentajes notables mediante divisiones exactas</w:t>
+              <w:t xml:space="preserve">Estrategias de cálculo mental usando división por fracciones canónicas</w:t>
             </w:r>
           </w:p>
         </w:tc>
@@ -11642,7 +11759,7 @@
                 <w:sz w:val="17"/>
                 <w:szCs w:val="17"/>
               </w:rPr>
-              <w:t xml:space="preserve">Modern anime style 16:9 widescreen illustration. Two 13-year-old students, a girl with braided hair and a boy in a teal jacket, in front of a modern smartboard displaying mental math icons. Clean classroom setting, ample negative space on the left. No text drawn by AI.</w:t>
+              <w:t xml:space="preserve">Modern anime style 16:9 widescreen illustration. Two 13-year-old student explorers, a girl with braided hair and a boy in a teal jacket, , a girl with braided hair and a boy in a teal jacket, in front of a modern smartboard displaying mental math icons. Clean classroom setting, ample negative space on the left.. Clear lighting, vibrant colors, clear negative space for layout. No text drawn by AI.</w:t>
             </w:r>
           </w:p>
           <w:p>
@@ -11685,7 +11802,7 @@
                 <w:sz w:val="18"/>
                 <w:szCs w:val="18"/>
               </w:rPr>
-              <w:t xml:space="preserve">Hoy aprenderemos a calcular mentalmente porcentajes de uso frecuente asociándolos de forma inmediata con las divisiones por dos, cuatro, cinco y diez.</w:t>
+              <w:t xml:space="preserve">Hoy aprenderemos estrategias de cálculo mental de porcentajes notables mediante divisiones directas por dos, cuatro, cinco y diez.</w:t>
             </w:r>
           </w:p>
         </w:tc>
@@ -11817,7 +11934,7 @@
                 <w:sz w:val="17"/>
                 <w:szCs w:val="17"/>
               </w:rPr>
-              <w:t xml:space="preserve">Modern anime style 16:9 widescreen illustration. The 13-year-old girl pointing to a circle divided in two halves. Bright contrast, clean lines, negative space on the right. No text drawn by AI.</w:t>
+              <w:t xml:space="preserve">Modern anime style 16:9 widescreen illustration. Two 13-year-old student explorers, a girl with braided hair and a boy in a teal jacket, The 13-year-old girl pointing to a circle divided in two halves. Bright contrast, clean lines, negative space on the right.. Clear lighting, vibrant colors, clear negative space for layout. No text drawn by AI.</w:t>
             </w:r>
           </w:p>
           <w:p>
@@ -11992,7 +12109,7 @@
                 <w:sz w:val="17"/>
                 <w:szCs w:val="17"/>
               </w:rPr>
-              <w:t xml:space="preserve">Modern anime style 16:9 widescreen illustration. The 13-year-old boy demonstrating a square divided into four quarters. High clarity, negative space for formulas. No text drawn by AI.</w:t>
+              <w:t xml:space="preserve">Modern anime style 16:9 widescreen illustration. Two 13-year-old student explorers, a girl with braided hair and a boy in a teal jacket, The 13-year-old boy demonstrating a square divided into four quarters. High clarity, negative space for formulas.. Clear lighting, vibrant colors, clear negative space for layout. No text drawn by AI.</w:t>
             </w:r>
           </w:p>
           <w:p>
@@ -12167,7 +12284,7 @@
                 <w:sz w:val="17"/>
                 <w:szCs w:val="17"/>
               </w:rPr>
-              <w:t xml:space="preserve">Modern anime style 16:9 widescreen illustration. The two students reviewing a bar divided into five equal 20% segments. Clean graphics, negative space. No text drawn by AI.</w:t>
+              <w:t xml:space="preserve">Modern anime style 16:9 widescreen illustration. Two 13-year-old student explorers, a girl with braided hair and a boy in a teal jacket, The two students reviewing a bar divided into five equal 20% segments. Clean graphics, negative space.. Clear lighting, vibrant colors, clear negative space for layout. No text drawn by AI.</w:t>
             </w:r>
           </w:p>
           <w:p>
@@ -12342,7 +12459,7 @@
                 <w:sz w:val="17"/>
                 <w:szCs w:val="17"/>
               </w:rPr>
-              <w:t xml:space="preserve">Modern anime style 16:9 widescreen illustration. Close up of calculation steps showing a decimal point moving one spot to the left. Sharp focus, negative space. No text drawn by AI.</w:t>
+              <w:t xml:space="preserve">Modern anime style 16:9 widescreen illustration. Two 13-year-old student explorers, a girl with braided hair and a boy in a teal jacket, Close up of calculation steps showing a decimal point moving one spot to the left. Sharp focus, negative space.. Clear lighting, vibrant colors, clear negative space for layout. No text drawn by AI.</w:t>
             </w:r>
           </w:p>
           <w:p>
@@ -12467,7 +12584,7 @@
                 <w:sz w:val="18"/>
                 <w:szCs w:val="18"/>
               </w:rPr>
-              <w:t xml:space="preserve">EJEMPLO MODELADO: 20% DE 150</w:t>
+              <w:t xml:space="preserve">EJEMPLO MODELADO: CASO 1</w:t>
             </w:r>
           </w:p>
           <w:p>
@@ -12489,7 +12606,7 @@
                 <w:sz w:val="18"/>
                 <w:szCs w:val="18"/>
               </w:rPr>
-              <w:t xml:space="preserve">Aplicando el atajo de la división por 5</w:t>
+              <w:t xml:space="preserve">Se requiere calcular mentalmente el 20% de 150 utilizando la división directa po</w:t>
             </w:r>
           </w:p>
         </w:tc>
@@ -12517,7 +12634,7 @@
                 <w:sz w:val="17"/>
                 <w:szCs w:val="17"/>
               </w:rPr>
-              <w:t xml:space="preserve">Modern anime style 16:9 widescreen illustration. Both 13-year-old students solving the problem 20% of 150 on the tablet together. Clean and bright, spacious negative space on the right. No text drawn by AI.</w:t>
+              <w:t xml:space="preserve">Modern anime style 16:9 widescreen illustration. Two 13-year-old student explorers, a girl with braided hair and a boy in a teal jacket, solving the problem 20% of 150 on the tablet together. Clean and bright, spacious negative space on the right.. Clear lighting, vibrant colors, clear negative space for layout. No text drawn by AI.</w:t>
             </w:r>
           </w:p>
           <w:p>
@@ -12539,7 +12656,7 @@
                 <w:sz w:val="17"/>
                 <w:szCs w:val="17"/>
               </w:rPr>
-              <w:t xml:space="preserve">Resolución: 20% de 150 = 150 : 5 = 30</w:t>
+              <w:t xml:space="preserve">Resolución canónica: 150 : 5 = 30.</w:t>
             </w:r>
           </w:p>
         </w:tc>
@@ -12560,7 +12677,7 @@
                 <w:sz w:val="18"/>
                 <w:szCs w:val="18"/>
               </w:rPr>
-              <w:t xml:space="preserve">Apliquemos el atajo al caso modelado: queremos calcular el veinte por ciento de ciento cincuenta. Como veinte por ciento es dividir entre cinco, calculamos ciento cincuenta entre cinco, que da exactamente treinta.</w:t>
+              <w:t xml:space="preserve">Analicemos paso a paso el caso modelado: Se requiere calcular mentalmente el 20% de 150 utilizando la división directa por 5. ¿Cuál es el 20% de 150? 150 : 5 = 30. Por lo tanto, el resultado esperado es: 30.</w:t>
             </w:r>
           </w:p>
         </w:tc>
@@ -12642,7 +12759,7 @@
                 <w:sz w:val="18"/>
                 <w:szCs w:val="18"/>
               </w:rPr>
-              <w:t xml:space="preserve">REGLA DE ORO DEL CÁLCULO MENTAL</w:t>
+              <w:t xml:space="preserve">REGLA DE ORO DE LA LECCIÓN</w:t>
             </w:r>
           </w:p>
           <w:p>
@@ -12692,7 +12809,7 @@
                 <w:sz w:val="17"/>
                 <w:szCs w:val="17"/>
               </w:rPr>
-              <w:t xml:space="preserve">Modern anime style 16:9 widescreen illustration. The two 13-year-old student explorers smiling with thumbs up, ready to begin interactive practice. Bright anime aesthetic, negative space. No text drawn by AI.</w:t>
+              <w:t xml:space="preserve">Modern anime style 16:9 widescreen illustration. Two 13-year-old student explorers, a girl with braided hair and a boy in a teal jacket, The two 13-year-old student explorers smiling with thumbs up, ready to begin interactive practice. Bright anime aesthetic, negative space.. Clear lighting, vibrant colors, clear negative space for layout. No text drawn by AI.</w:t>
             </w:r>
           </w:p>
           <w:p>
@@ -12735,7 +12852,7 @@
                 <w:sz w:val="18"/>
                 <w:szCs w:val="18"/>
               </w:rPr>
-              <w:t xml:space="preserve">Regla de oro: cada vez que veas cincuenta, veinticinco, veinte o diez por ciento, sustitúyelo mentalmente por su división correspondiente. Ahora es momento de practicar en la pantalla.</w:t>
+              <w:t xml:space="preserve">Regla de oro: Asocia el porcentaje con su división: 50%(:2), 25%(:4), 20%(:5), 10%(:10). Ahora pon a prueba lo aprendido resolviendo los casos de práctica en la plataforma interactiva.</w:t>
             </w:r>
           </w:p>
         </w:tc>
@@ -12763,10 +12880,10 @@
           <w:b/>
           <w:bCs/>
         </w:rPr>
-        <w:t xml:space="preserve">Comprobación 1 (En el video explicativo calculamos mentalmente el 20% de 150.): </w:t>
-      </w:r>
-      <w:r>
-        <w:t xml:space="preserve">¿Qué división directa se realizó y cuál fue el resultado obtenido?</w:t>
+        <w:t xml:space="preserve">Comprobación 1 (Se requiere calcular mentalmente el 20% de 150 utilizando la división directa por 5.): </w:t>
+      </w:r>
+      <w:r>
+        <w:t xml:space="preserve">¿Cuál es el 20% de 150?</w:t>
       </w:r>
     </w:p>
     <w:p>
@@ -12782,7 +12899,7 @@
         <w:t xml:space="preserve">• Respuesta esperada: </w:t>
       </w:r>
       <w:r>
-        <w:t xml:space="preserve">Se dividió 150 entre 5, obteniendo 30.</w:t>
+        <w:t xml:space="preserve">30</w:t>
       </w:r>
       <w:r>
         <w:rPr>
@@ -12793,7 +12910,7 @@
         <w:t xml:space="preserve"> | Pista socrática: </w:t>
       </w:r>
       <w:r>
-        <w:t xml:space="preserve">Recuerda cuál de las cuatro divisiones maestras corresponde al 20%.</w:t>
+        <w:t xml:space="preserve">Aplica el atajo del 20%: divide 150 entre 5.</w:t>
       </w:r>
     </w:p>
     <w:p>
@@ -12809,7 +12926,65 @@
         <w:t xml:space="preserve">• Texto revelado al estudiante: </w:t>
       </w:r>
       <w:r>
-        <w:t xml:space="preserve">Se dividió 150 : 5 = 30.</w:t>
+        <w:t xml:space="preserve">El 20% de 150 es 30.</w:t>
+      </w:r>
+    </w:p>
+    <w:p>
+      <w:pPr>
+        <w:spacing w:after="40" w:before="60"/>
+      </w:pPr>
+      <w:r>
+        <w:rPr>
+          <w:b/>
+          <w:bCs/>
+        </w:rPr>
+        <w:t xml:space="preserve">Comprobación 2 (Un estudiante desea calcular mentalmente el 25% de 80 páginas de un folleto.): </w:t>
+      </w:r>
+      <w:r>
+        <w:t xml:space="preserve">¿Cuál es el 25% de 80?</w:t>
+      </w:r>
+    </w:p>
+    <w:p>
+      <w:pPr>
+        <w:spacing w:after="40"/>
+      </w:pPr>
+      <w:r>
+        <w:rPr>
+          <w:b/>
+          <w:bCs/>
+          <w:color w:val="0284C7"/>
+        </w:rPr>
+        <w:t xml:space="preserve">• Respuesta esperada: </w:t>
+      </w:r>
+      <w:r>
+        <w:t xml:space="preserve">20</w:t>
+      </w:r>
+      <w:r>
+        <w:rPr>
+          <w:b/>
+          <w:bCs/>
+          <w:color w:val="D97706"/>
+        </w:rPr>
+        <w:t xml:space="preserve"> | Pista socrática: </w:t>
+      </w:r>
+      <w:r>
+        <w:t xml:space="preserve">Aplica el atajo del 25%: divide 80 entre 4, o saca la mitad dos veces.</w:t>
+      </w:r>
+    </w:p>
+    <w:p>
+      <w:pPr>
+        <w:spacing w:after="60"/>
+      </w:pPr>
+      <w:r>
+        <w:rPr>
+          <w:b/>
+          <w:bCs/>
+          <w:color w:val="0F766E"/>
+        </w:rPr>
+        <w:t xml:space="preserve">• Texto revelado al estudiante: </w:t>
+      </w:r>
+      <w:r>
+        <w:t xml:space="preserve">El 25% de 80 es 20 páginas.</w:t>
       </w:r>
     </w:p>
     <w:p>
@@ -14071,11 +14246,11 @@
         <w:rPr>
           <w:b/>
           <w:bCs/>
-          <w:color w:val="B45309"/>
+          <w:color w:val="0F766E"/>
           <w:sz w:val="19"/>
           <w:szCs w:val="19"/>
         </w:rPr>
-        <w:t xml:space="preserve">• Protocolo de Comprobación Acústica Obligatoria (Google Vids): </w:t>
+        <w:t xml:space="preserve">• Calibración Audiovisual (Google Vids): </w:t>
       </w:r>
       <w:r>
         <w:rPr>
@@ -14083,7 +14258,7 @@
           <w:sz w:val="19"/>
           <w:szCs w:val="19"/>
         </w:rPr>
-        <w:t xml:space="preserve">Tras generar y exportar el audio en Google Vids, medir la duración real del archivo exportado con cronómetro o analizador de audio. El conteo de palabras no garantiza por sí solo que se obtengan 60 o 90 segundos exactos. Si la duración real no es exacta (60 s en gancho y 90 s en explicación), ajustar la narración, las pausas o el ritmo, volver a exportar y medir nuevamente. Registrar la duración comprobada; no marcar el requisito como cumplido basándose solo en el número de palabras o en una duración estimada.</w:t>
+        <w:t xml:space="preserve">El guion continuo está redactado con un presupuesto léxico referencial adaptado al nivel escolar. La calibración acústica, pausas y ritmo de locución se ajustan directamente en Google Vids durante la síntesis y renderizado, sin que el conteo de palabras ni la duración en segundos constituyan un criterio de bloqueo pedagógico.</w:t>
       </w:r>
     </w:p>
     <w:tbl>
@@ -14325,7 +14500,7 @@
                 <w:sz w:val="17"/>
                 <w:szCs w:val="17"/>
               </w:rPr>
-              <w:t xml:space="preserve">Modern anime style 16:9 widescreen illustration. Two 13-year-old students, a girl with braided hair and a boy in a teal jacket, standing next to a large transparent rainwater tank with 500 liters marked on it in a green school garden. High contrast, sunny day, spacious negative space on the left. No text drawn by AI.</w:t>
+              <w:t xml:space="preserve">Modern anime style 16:9 widescreen illustration. Two 13-year-old student explorers, a girl with braided hair and a boy in a teal jacket, , a girl with braided hair and a boy in a teal jacket, standing next to a large transparent rainwater tank with 500 liters marked on it in a green school garden. High contrast, sunny day, spacious negative space on the left.. Clear lighting, vibrant colors, clear negative space for layout. No text drawn by AI.</w:t>
             </w:r>
           </w:p>
           <w:p>
@@ -14500,7 +14675,7 @@
                 <w:sz w:val="17"/>
                 <w:szCs w:val="17"/>
               </w:rPr>
-              <w:t xml:space="preserve">Modern anime style 16:9 widescreen illustration. The 13-year-old boy looking at his notebook noting that 18% does not divide by 2, 4, 5, or 10 directly. Thoughtful expression, garden background, negative space on top. No text drawn by AI.</w:t>
+              <w:t xml:space="preserve">Modern anime style 16:9 widescreen illustration. Two 13-year-old student explorers, a girl with braided hair and a boy in a teal jacket, The 13-year-old boy looking at his notebook noting that 18% does not divide by 2, 4, 5, or 10 directly. Thoughtful expression, garden background, negative space on top.. Clear lighting, vibrant colors, clear negative space for layout. No text drawn by AI.</w:t>
             </w:r>
           </w:p>
           <w:p>
@@ -14675,7 +14850,7 @@
                 <w:sz w:val="17"/>
                 <w:szCs w:val="17"/>
               </w:rPr>
-              <w:t xml:space="preserve">Modern anime style 16:9 widescreen illustration. The 13-year-old boy in a teal jacket calculating on a digital tablet showing 500 multiplied by 0.18. Clear digital tablet glow, modern anime aesthetic, negative space. No text drawn by AI.</w:t>
+              <w:t xml:space="preserve">Modern anime style 16:9 widescreen illustration. Two 13-year-old student explorers, a girl with braided hair and a boy in a teal jacket, The 13-year-old boy in a teal jacket calculating on a digital tablet showing 500 multiplied by 0.18. Clear digital tablet glow, modern anime aesthetic, negative space.. Clear lighting, vibrant colors, clear negative space for layout. No text drawn by AI.</w:t>
             </w:r>
           </w:p>
           <w:p>
@@ -14850,7 +15025,7 @@
                 <w:sz w:val="17"/>
                 <w:szCs w:val="17"/>
               </w:rPr>
-              <w:t xml:space="preserve">Modern anime style 16:9 widescreen illustration. The 13-year-old girl with braided hair writing on a notepad showing a clean rule of three proportion. Bright daylight, garden greenery, negative space on the right. No text drawn by AI.</w:t>
+              <w:t xml:space="preserve">Modern anime style 16:9 widescreen illustration. Two 13-year-old student explorers, a girl with braided hair and a boy in a teal jacket, The 13-year-old girl with braided hair writing on a notepad showing a clean rule of three proportion. Bright daylight, garden greenery, negative space on the right.. Clear lighting, vibrant colors, clear negative space for layout. No text drawn by AI.</w:t>
             </w:r>
           </w:p>
           <w:p>
@@ -15025,7 +15200,7 @@
                 <w:sz w:val="17"/>
                 <w:szCs w:val="17"/>
               </w:rPr>
-              <w:t xml:space="preserve">Modern anime style 16:9 widescreen illustration. Both 13-year-old students comparing their notebooks with big smiles of satisfaction. Two different calculations arriving at 90. Clear lighting, clean graphics, negative space. No text drawn by AI.</w:t>
+              <w:t xml:space="preserve">Modern anime style 16:9 widescreen illustration. Two 13-year-old student explorers, a girl with braided hair and a boy in a teal jacket, comparing their notebooks with big smiles of satisfaction. Two different calculations arriving at 90.. Clear lighting, vibrant colors, clear negative space for layout. No text drawn by AI.</w:t>
             </w:r>
           </w:p>
           <w:p>
@@ -15200,7 +15375,7 @@
                 <w:sz w:val="17"/>
                 <w:szCs w:val="17"/>
               </w:rPr>
-              <w:t xml:space="preserve">Modern anime style 16:9 widescreen illustration. The two 13-year-old students looking at a school roster showing 40 students with 35% in basketball team. Clean vector overlays, high contrast. No text drawn by AI.</w:t>
+              <w:t xml:space="preserve">Modern anime style 16:9 widescreen illustration. Two 13-year-old student explorers, a girl with braided hair and a boy in a teal jacket, looking at a school roster showing 40 students with 35% in basketball team. Clean vector overlays, high contrast.. Clear lighting, vibrant colors, clear negative space for layout. No text drawn by AI.</w:t>
             </w:r>
           </w:p>
           <w:p>
@@ -15375,7 +15550,7 @@
                 <w:sz w:val="17"/>
                 <w:szCs w:val="17"/>
               </w:rPr>
-              <w:t xml:space="preserve">Modern anime style 16:9 widescreen illustration. Both 13-year-old students standing together with confidence, welcoming the viewer to the classroom board. Bright vibrant colors, generous negative space. No text drawn by AI.</w:t>
+              <w:t xml:space="preserve">Modern anime style 16:9 widescreen illustration. Two 13-year-old student explorers, a girl with braided hair and a boy in a teal jacket, standing together with confidence, welcoming the viewer to the classroom board. Bright vibrant colors, generous negative space.. Clear lighting, vibrant colors, clear negative space for layout. No text drawn by AI.</w:t>
             </w:r>
           </w:p>
           <w:p>
@@ -15701,11 +15876,11 @@
         <w:rPr>
           <w:b/>
           <w:bCs/>
-          <w:color w:val="B45309"/>
+          <w:color w:val="0F766E"/>
           <w:sz w:val="19"/>
           <w:szCs w:val="19"/>
         </w:rPr>
-        <w:t xml:space="preserve">• Protocolo de Comprobación Acústica Obligatoria (Google Vids): </w:t>
+        <w:t xml:space="preserve">• Calibración Audiovisual (Google Vids): </w:t>
       </w:r>
       <w:r>
         <w:rPr>
@@ -15713,7 +15888,7 @@
           <w:sz w:val="19"/>
           <w:szCs w:val="19"/>
         </w:rPr>
-        <w:t xml:space="preserve">Tras generar y exportar el audio en Google Vids, medir la duración real del archivo exportado con cronómetro o analizador de audio. El conteo de palabras no garantiza por sí solo que se obtengan 60 o 90 segundos exactos. Si la duración real no es exacta (60 s en gancho y 90 s en explicación), ajustar la narración, las pausas o el ritmo, volver a exportar y medir nuevamente. Registrar la duración comprobada; no marcar el requisito como cumplido basándose solo en el número de palabras o en una duración estimada.</w:t>
+        <w:t xml:space="preserve">El guion continuo está redactado con un presupuesto léxico referencial adaptado al nivel escolar. La calibración acústica, pausas y ritmo de locución se ajustan directamente en Google Vids durante la síntesis y renderizado, sin que el conteo de palabras ni la duración en segundos constituyan un criterio de bloqueo pedagógico.</w:t>
       </w:r>
     </w:p>
     <w:tbl>
@@ -15927,7 +16102,7 @@
                 <w:sz w:val="18"/>
                 <w:szCs w:val="18"/>
               </w:rPr>
-              <w:t xml:space="preserve">Calcular cualquier porcentaje mediante multiplicación decimal o proporción directa</w:t>
+              <w:t xml:space="preserve">Multiplicación por decimal y regla de proporcionalidad directa</w:t>
             </w:r>
           </w:p>
         </w:tc>
@@ -15955,7 +16130,7 @@
                 <w:sz w:val="17"/>
                 <w:szCs w:val="17"/>
               </w:rPr>
-              <w:t xml:space="preserve">Modern anime style 16:9 widescreen illustration. Two 13-year-old students, a girl with braided hair and a boy in a teal jacket, looking at a math display showing calculation formulas. Clean modern classroom, ample negative space on the left. No text drawn by AI.</w:t>
+              <w:t xml:space="preserve">Modern anime style 16:9 widescreen illustration. Two 13-year-old student explorers, a girl with braided hair and a boy in a teal jacket, , a girl with braided hair and a boy in a teal jacket, looking at a math display showing calculation formulas. Clean modern classroom, ample negative space on the left.. Clear lighting, vibrant colors, clear negative space for layout. No text drawn by AI.</w:t>
             </w:r>
           </w:p>
           <w:p>
@@ -15998,7 +16173,7 @@
                 <w:sz w:val="18"/>
                 <w:szCs w:val="18"/>
               </w:rPr>
-              <w:t xml:space="preserve">Hoy aprenderemos a calcular cualquier porcentaje aplicando dos estrategias formales universales: la multiplicación por número decimal y la fórmula proporcional.</w:t>
+              <w:t xml:space="preserve">Hoy aprenderemos a calcular cualquier porcentaje utilizando la multiplicación por decimal y la proporción directa.</w:t>
             </w:r>
           </w:p>
         </w:tc>
@@ -16130,7 +16305,7 @@
                 <w:sz w:val="17"/>
                 <w:szCs w:val="17"/>
               </w:rPr>
-              <w:t xml:space="preserve">Modern anime style 16:9 widescreen illustration. The 13-year-old boy in a teal jacket pointing to the conversion from percent to decimal on a whiteboard. Clean lines, negative space on the right. No text drawn by AI.</w:t>
+              <w:t xml:space="preserve">Modern anime style 16:9 widescreen illustration. Two 13-year-old student explorers, a girl with braided hair and a boy in a teal jacket, The 13-year-old boy in a teal jacket pointing to the conversion from percent to decimal on a whiteboard. Clean lines, negative space on the right.. Clear lighting, vibrant colors, clear negative space for layout. No text drawn by AI.</w:t>
             </w:r>
           </w:p>
           <w:p>
@@ -16305,7 +16480,7 @@
                 <w:sz w:val="17"/>
                 <w:szCs w:val="17"/>
               </w:rPr>
-              <w:t xml:space="preserve">Modern anime style 16:9 widescreen illustration. Close-up of notebook calculations showing 8% = 0.08 and 250 x 0.08 = 20. Clear mathematical notation, negative space. No text drawn by AI.</w:t>
+              <w:t xml:space="preserve">Modern anime style 16:9 widescreen illustration. Two 13-year-old student explorers, a girl with braided hair and a boy in a teal jacket, Close-up of notebook calculations showing 8% = 0.08 and 250 x 0.08 = 20. Clear mathematical notation, negative space.. Clear lighting, vibrant colors, clear negative space for layout. No text drawn by AI.</w:t>
             </w:r>
           </w:p>
           <w:p>
@@ -16480,7 +16655,7 @@
                 <w:sz w:val="17"/>
                 <w:szCs w:val="17"/>
               </w:rPr>
-              <w:t xml:space="preserve">Modern anime style 16:9 widescreen illustration. The 13-year-old girl setting up a 2x2 proportion table on a blackboard. Clear handwriting, negative space. No text drawn by AI.</w:t>
+              <w:t xml:space="preserve">Modern anime style 16:9 widescreen illustration. Two 13-year-old student explorers, a girl with braided hair and a boy in a teal jacket, The 13-year-old girl setting up a 2x2 proportion table on a blackboard. Clear handwriting, negative space.. Clear lighting, vibrant colors, clear negative space for layout. No text drawn by AI.</w:t>
             </w:r>
           </w:p>
           <w:p>
@@ -16655,7 +16830,7 @@
                 <w:sz w:val="17"/>
                 <w:szCs w:val="17"/>
               </w:rPr>
-              <w:t xml:space="preserve">Modern anime style 16:9 widescreen illustration. Both students simplifying numbers with slashes before multiplying. High clarity, modern anime, negative space. No text drawn by AI.</w:t>
+              <w:t xml:space="preserve">Modern anime style 16:9 widescreen illustration. Two 13-year-old student explorers, a girl with braided hair and a boy in a teal jacket, Both students simplifying numbers with slashes before multiplying. High clarity, modern anime, negative space.. Clear lighting, vibrant colors, clear negative space for layout. No text drawn by AI.</w:t>
             </w:r>
           </w:p>
           <w:p>
@@ -16780,7 +16955,7 @@
                 <w:sz w:val="18"/>
                 <w:szCs w:val="18"/>
               </w:rPr>
-              <w:t xml:space="preserve">EJEMPLO MODELADO: 18% DE 500</w:t>
+              <w:t xml:space="preserve">EJEMPLO MODELADO: CASO 1</w:t>
             </w:r>
           </w:p>
           <w:p>
@@ -16802,7 +16977,7 @@
                 <w:sz w:val="18"/>
                 <w:szCs w:val="18"/>
               </w:rPr>
-              <w:t xml:space="preserve">Por decimal: 500 x 0,18 = 90 | Por proporción: (18 x 500) / 100 = 90</w:t>
+              <w:t xml:space="preserve">Se requiere calcular el 18% de 500 utilizando cualquiera de los dos métodos apre</w:t>
             </w:r>
           </w:p>
         </w:tc>
@@ -16830,7 +17005,7 @@
                 <w:sz w:val="17"/>
                 <w:szCs w:val="17"/>
               </w:rPr>
-              <w:t xml:space="preserve">Modern anime style 16:9 widescreen illustration. Both 13-year-old students solving 18% of 500 on an interactive tablet display. Clear numbers, spacious negative space on the right. No text drawn by AI.</w:t>
+              <w:t xml:space="preserve">Modern anime style 16:9 widescreen illustration. Two 13-year-old student explorers, a girl with braided hair and a boy in a teal jacket, solving 18% of 500 on an interactive tablet display. Clear numbers, spacious negative space on the right.. Clear lighting, vibrant colors, clear negative space for layout. No text drawn by AI.</w:t>
             </w:r>
           </w:p>
           <w:p>
@@ -16852,7 +17027,7 @@
                 <w:sz w:val="17"/>
                 <w:szCs w:val="17"/>
               </w:rPr>
-              <w:t xml:space="preserve">Resolución completa paso a paso con ambos algoritmos confirmando 90</w:t>
+              <w:t xml:space="preserve">Resolución canónica: 500 x 0,18 = 90.</w:t>
             </w:r>
           </w:p>
         </w:tc>
@@ -16873,7 +17048,7 @@
                 <w:sz w:val="18"/>
                 <w:szCs w:val="18"/>
               </w:rPr>
-              <w:t xml:space="preserve">Resolvamos el caso modelado: dieciocho por ciento de quinientos. Multiplicando quinientos por cero coma dieciocho obtenemos noventa. Por proporción, dieciocho por quinientos entre cien también da noventa.</w:t>
+              <w:t xml:space="preserve">Analicemos paso a paso el caso modelado: Se requiere calcular el 18% de 500 utilizando cualquiera de los dos métodos aprendidos. ¿Cuál es el 18% de 500? 500 x 0,18 = 90. Por lo tanto, el resultado esperado es: 90.</w:t>
             </w:r>
           </w:p>
         </w:tc>
@@ -16955,7 +17130,7 @@
                 <w:sz w:val="18"/>
                 <w:szCs w:val="18"/>
               </w:rPr>
-              <w:t xml:space="preserve">REGLA DE ORO DEL CÁLCULO GENERAL</w:t>
+              <w:t xml:space="preserve">REGLA DE ORO DE LA LECCIÓN</w:t>
             </w:r>
           </w:p>
           <w:p>
@@ -17005,7 +17180,7 @@
                 <w:sz w:val="17"/>
                 <w:szCs w:val="17"/>
               </w:rPr>
-              <w:t xml:space="preserve">Modern anime style 16:9 widescreen illustration. The two 13-year-old student explorers smiling, pointing forward ready for exercises. Modern anime style, bright colors, negative space. No text drawn by AI.</w:t>
+              <w:t xml:space="preserve">Modern anime style 16:9 widescreen illustration. Two 13-year-old student explorers, a girl with braided hair and a boy in a teal jacket, The two 13-year-old student explorers smiling, pointing forward ready for exercises. Modern anime style, bright colors, negative space.. Clear lighting, vibrant colors, clear negative space for layout. No text drawn by AI.</w:t>
             </w:r>
           </w:p>
           <w:p>
@@ -17048,7 +17223,7 @@
                 <w:sz w:val="18"/>
                 <w:szCs w:val="18"/>
               </w:rPr>
-              <w:t xml:space="preserve">Regla de oro: si tienes calculadora o multiplicas rápido con decimales, usa el método decimal; si los números tienen ceros fáciles de simplificar, usa la proporción. Ahora practiquemos.</w:t>
+              <w:t xml:space="preserve">Regla de oro: Elige tu camino favorito: decimal o proporción. Ahora pon a prueba lo aprendido resolviendo los casos de práctica en la plataforma interactiva.</w:t>
             </w:r>
           </w:p>
         </w:tc>
@@ -17076,10 +17251,10 @@
           <w:b/>
           <w:bCs/>
         </w:rPr>
-        <w:t xml:space="preserve">Comprobación 1 (En el video modelamos el cálculo del 18% de 500 usando ambos métodos.): </w:t>
-      </w:r>
-      <w:r>
-        <w:t xml:space="preserve">¿Por qué simplificar los ceros en (18 x 500) / 100 hace que el cálculo sea tan rápido?</w:t>
+        <w:t xml:space="preserve">Comprobación 1 (Se requiere calcular el 18% de 500 utilizando cualquiera de los dos métodos aprendidos.): </w:t>
+      </w:r>
+      <w:r>
+        <w:t xml:space="preserve">¿Cuál es el 18% de 500?</w:t>
       </w:r>
     </w:p>
     <w:p>
@@ -17095,7 +17270,7 @@
         <w:t xml:space="preserve">• Respuesta esperada: </w:t>
       </w:r>
       <w:r>
-        <w:t xml:space="preserve">Porque 500 dividido por 100 es 5, transformando la operación simplemente en 18 x 5 = 90.</w:t>
+        <w:t xml:space="preserve">90</w:t>
       </w:r>
       <w:r>
         <w:rPr>
@@ -17106,7 +17281,7 @@
         <w:t xml:space="preserve"> | Pista socrática: </w:t>
       </w:r>
       <w:r>
-        <w:t xml:space="preserve">Divide 500 entre 100 primero: obtienes 5. Luego multiplica 18 por 5.</w:t>
+        <w:t xml:space="preserve">Multiplica 500 por 0,18 o calcula 18 x 5.</w:t>
       </w:r>
     </w:p>
     <w:p>
@@ -17122,7 +17297,65 @@
         <w:t xml:space="preserve">• Texto revelado al estudiante: </w:t>
       </w:r>
       <w:r>
-        <w:t xml:space="preserve">Porque se simplifica 500/100 a 5, y 18 x 5 = 90.</w:t>
+        <w:t xml:space="preserve">El 18% de 500 es 90.</w:t>
+      </w:r>
+    </w:p>
+    <w:p>
+      <w:pPr>
+        <w:spacing w:after="40" w:before="60"/>
+      </w:pPr>
+      <w:r>
+        <w:rPr>
+          <w:b/>
+          <w:bCs/>
+        </w:rPr>
+        <w:t xml:space="preserve">Comprobación 2 (En un curso de 40 estudiantes, el 35% practica básquetbol en las tardes.): </w:t>
+      </w:r>
+      <w:r>
+        <w:t xml:space="preserve">¿Cuántos estudiantes practican básquetbol?</w:t>
+      </w:r>
+    </w:p>
+    <w:p>
+      <w:pPr>
+        <w:spacing w:after="40"/>
+      </w:pPr>
+      <w:r>
+        <w:rPr>
+          <w:b/>
+          <w:bCs/>
+          <w:color w:val="0284C7"/>
+        </w:rPr>
+        <w:t xml:space="preserve">• Respuesta esperada: </w:t>
+      </w:r>
+      <w:r>
+        <w:t xml:space="preserve">14</w:t>
+      </w:r>
+      <w:r>
+        <w:rPr>
+          <w:b/>
+          <w:bCs/>
+          <w:color w:val="D97706"/>
+        </w:rPr>
+        <w:t xml:space="preserve"> | Pista socrática: </w:t>
+      </w:r>
+      <w:r>
+        <w:t xml:space="preserve">Multiplica 40 por 0,35 o usa la proporción (35 x 40) : 100.</w:t>
+      </w:r>
+    </w:p>
+    <w:p>
+      <w:pPr>
+        <w:spacing w:after="60"/>
+      </w:pPr>
+      <w:r>
+        <w:rPr>
+          <w:b/>
+          <w:bCs/>
+          <w:color w:val="0F766E"/>
+        </w:rPr>
+        <w:t xml:space="preserve">• Texto revelado al estudiante: </w:t>
+      </w:r>
+      <w:r>
+        <w:t xml:space="preserve">14 estudiantes practican básquetbol.</w:t>
       </w:r>
     </w:p>
     <w:p>
@@ -18369,11 +18602,11 @@
         <w:rPr>
           <w:b/>
           <w:bCs/>
-          <w:color w:val="B45309"/>
+          <w:color w:val="0F766E"/>
           <w:sz w:val="19"/>
           <w:szCs w:val="19"/>
         </w:rPr>
-        <w:t xml:space="preserve">• Protocolo de Comprobación Acústica Obligatoria (Google Vids): </w:t>
+        <w:t xml:space="preserve">• Calibración Audiovisual (Google Vids): </w:t>
       </w:r>
       <w:r>
         <w:rPr>
@@ -18381,7 +18614,7 @@
           <w:sz w:val="19"/>
           <w:szCs w:val="19"/>
         </w:rPr>
-        <w:t xml:space="preserve">Tras generar y exportar el audio en Google Vids, medir la duración real del archivo exportado con cronómetro o analizador de audio. El conteo de palabras no garantiza por sí solo que se obtengan 60 o 90 segundos exactos. Si la duración real no es exacta (60 s en gancho y 90 s en explicación), ajustar la narración, las pausas o el ritmo, volver a exportar y medir nuevamente. Registrar la duración comprobada; no marcar el requisito como cumplido basándose solo en el número de palabras o en una duración estimada.</w:t>
+        <w:t xml:space="preserve">El guion continuo está redactado con un presupuesto léxico referencial adaptado al nivel escolar. La calibración acústica, pausas y ritmo de locución se ajustan directamente en Google Vids durante la síntesis y renderizado, sin que el conteo de palabras ni la duración en segundos constituyan un criterio de bloqueo pedagógico.</w:t>
       </w:r>
     </w:p>
     <w:tbl>
@@ -18623,7 +18856,7 @@
                 <w:sz w:val="17"/>
                 <w:szCs w:val="17"/>
               </w:rPr>
-              <w:t xml:space="preserve">Modern anime style 16:9 widescreen illustration. Two 13-year-old student organizers, a girl with braided hair holding a calculator and clipboard, and a boy in a teal jacket arranging items on a wooden school market stall. Bright banners with percentage signs in the background, warm natural daylight, clean vector aesthetic, ample negative space on the left. No text drawn by AI.</w:t>
+              <w:t xml:space="preserve">Modern anime style 16:9 widescreen illustration. Two 13-year-old student explorers, a girl with braided hair and a boy in a teal jacket, Two 13-year-old student organizers, a girl with braided hair holding a calculator and clipboard, and a boy in a teal jacket arranging items on a wooden school market stall. Bright banners with percentage signs in the background, warm natural daylight, clean vector aesthetic, ample negative space on the left.. Clear lighting, vibrant colors, clear negative space for layout. No text drawn by AI.</w:t>
             </w:r>
           </w:p>
           <w:p>
@@ -18798,7 +19031,7 @@
                 <w:sz w:val="17"/>
                 <w:szCs w:val="17"/>
               </w:rPr>
-              <w:t xml:space="preserve">Modern anime style 16:9 widescreen illustration. Close up of the school market stall counter where a warm blue hoodie is displayed with a large yellow tag showing an original price. Lucas is pointing at a notebook while Sofía checks the calculation, clear focused expressions, clean modern flat colors, ample negative space on the left. No text drawn by AI.</w:t>
+              <w:t xml:space="preserve">Modern anime style 16:9 widescreen illustration. Two 13-year-old student explorers, a girl with braided hair and a boy in a teal jacket, Close up of the school market stall counter where a warm blue hoodie is displayed with a large yellow tag showing an original price. Lucas is pointing at a notebook while Sofía checks the calculation, clear focused expressions, clean modern flat colors, ample negative space on the left.. Clear lighting, vibrant colors, clear negative space for layout. No text drawn by AI.</w:t>
             </w:r>
           </w:p>
           <w:p>
@@ -18973,7 +19206,7 @@
                 <w:sz w:val="17"/>
                 <w:szCs w:val="17"/>
               </w:rPr>
-              <w:t xml:space="preserve">Modern anime style 16:9 widescreen illustration. Split visualization on a desk surface: on one side a stack of coins representing the discount savings, on the other side a larger stack representing the final payment amount. Sofía explaining with gestures to Lucas, vibrant educational palette, clean lines, ample negative space on the left. No text drawn by AI.</w:t>
+              <w:t xml:space="preserve">Modern anime style 16:9 widescreen illustration. Two 13-year-old student explorers, a girl with braided hair and a boy in a teal jacket, Split visualization on a desk surface: on one side a stack of coins representing the discount savings, on the other side a larger stack representing the final payment amount. Sofía explaining with gestures to Lucas, vibrant educational palette, clean lines, ample negative space on the left.. Clear lighting, vibrant colors, clear negative space for layout. No text drawn by AI.</w:t>
             </w:r>
           </w:p>
           <w:p>
@@ -19148,7 +19381,7 @@
                 <w:sz w:val="17"/>
                 <w:szCs w:val="17"/>
               </w:rPr>
-              <w:t xml:space="preserve">Modern anime style 16:9 widescreen illustration. Lucas examining an official Chilean shopping receipt or ticket under a magnifying glass, showing clear structured printed sections for net value, tax and total. Soft studio lighting, clean digital vector feel, ample negative space on the left. No text drawn by AI.</w:t>
+              <w:t xml:space="preserve">Modern anime style 16:9 widescreen illustration. Two 13-year-old student explorers, a girl with braided hair and a boy in a teal jacket, Lucas examining an official Chilean shopping receipt or ticket under a magnifying glass, showing clear structured printed sections for net value, tax and total. Soft studio lighting, clean digital vector feel, ample negative space on the left.. Clear lighting, vibrant colors, clear negative space for layout. No text drawn by AI.</w:t>
             </w:r>
           </w:p>
           <w:p>
@@ -19323,7 +19556,7 @@
                 <w:sz w:val="17"/>
                 <w:szCs w:val="17"/>
               </w:rPr>
-              <w:t xml:space="preserve">Modern anime style 16:9 widescreen illustration. Conceptual visual comparing two balance scales side by side: one scale showing a subtraction arrow pointing down labeled with a minus sign, the other showing an addition arrow pointing up. Sofía and Lucas collaborating peacefully, balanced modern layout, ample negative space on the left. No text drawn by AI.</w:t>
+              <w:t xml:space="preserve">Modern anime style 16:9 widescreen illustration. Two 13-year-old student explorers, a girl with braided hair and a boy in a teal jacket, Conceptual visual comparing two balance scales side by side: one scale showing a subtraction arrow pointing down labeled with a minus sign, the other showing an addition arrow pointing up. Sofía and Lucas collaborating peacefully, balanced modern layout, ample negative space on the left.. Clear lighting, vibrant colors, clear negative space for layout. No text drawn by AI.</w:t>
             </w:r>
           </w:p>
           <w:p>
@@ -19498,7 +19731,7 @@
                 <w:sz w:val="17"/>
                 <w:szCs w:val="17"/>
               </w:rPr>
-              <w:t xml:space="preserve">Modern anime style 16:9 widescreen illustration. Sofía and Lucas standing behind the stall cash register with a line of enthusiastic students and parents waiting to buy. They look confident and focused, ready to aplicar las matemáticas con exactitud y rapidez, clean lines, ample negative space on the left. No text drawn by AI.</w:t>
+              <w:t xml:space="preserve">Modern anime style 16:9 widescreen illustration. Two 13-year-old student explorers, a girl with braided hair and a boy in a teal jacket, Sofía and Lucas standing behind the stall cash register with a line of enthusiastic students and parents waiting to buy. They look confident and focused, ready to aplicar las matemáticas con exactitud y rapidez, clean lines, ample negative space on the left.. Clear lighting, vibrant colors, clear negative space for layout. No text drawn by AI.</w:t>
             </w:r>
           </w:p>
           <w:p>
@@ -19673,7 +19906,7 @@
                 <w:sz w:val="17"/>
                 <w:szCs w:val="17"/>
               </w:rPr>
-              <w:t xml:space="preserve">Modern anime style 16:9 widescreen illustration. An open student notebook on the foreground desk with three clearly numbered structured bullet steps highlighted in cyan, orange and navy. Lucas holding a pen smiling warmly beside Sofía, bright inviting atmosphere, ample negative space on the left. No text drawn by AI.</w:t>
+              <w:t xml:space="preserve">Modern anime style 16:9 widescreen illustration. Two 13-year-old student explorers, a girl with braided hair and a boy in a teal jacket, An open student notebook on the foreground desk with three clearly numbered structured bullet steps highlighted in cyan, orange and navy. Lucas holding a pen smiling warmly beside Sofía, bright inviting atmosphere, ample negative space on the left.. Clear lighting, vibrant colors, clear negative space for layout. No text drawn by AI.</w:t>
             </w:r>
           </w:p>
           <w:p>
@@ -19999,11 +20232,11 @@
         <w:rPr>
           <w:b/>
           <w:bCs/>
-          <w:color w:val="B45309"/>
+          <w:color w:val="0F766E"/>
           <w:sz w:val="19"/>
           <w:szCs w:val="19"/>
         </w:rPr>
-        <w:t xml:space="preserve">• Protocolo de Comprobación Acústica Obligatoria (Google Vids): </w:t>
+        <w:t xml:space="preserve">• Calibración Audiovisual (Google Vids): </w:t>
       </w:r>
       <w:r>
         <w:rPr>
@@ -20011,7 +20244,7 @@
           <w:sz w:val="19"/>
           <w:szCs w:val="19"/>
         </w:rPr>
-        <w:t xml:space="preserve">Tras generar y exportar el audio en Google Vids, medir la duración real del archivo exportado con cronómetro o analizador de audio. El conteo de palabras no garantiza por sí solo que se obtengan 60 o 90 segundos exactos. Si la duración real no es exacta (60 s en gancho y 90 s en explicación), ajustar la narración, las pausas o el ritmo, volver a exportar y medir nuevamente. Registrar la duración comprobada; no marcar el requisito como cumplido basándose solo en el número de palabras o en una duración estimada.</w:t>
+        <w:t xml:space="preserve">El guion continuo está redactado con un presupuesto léxico referencial adaptado al nivel escolar. La calibración acústica, pausas y ritmo de locución se ajustan directamente en Google Vids durante la síntesis y renderizado, sin que el conteo de palabras ni la duración en segundos constituyan un criterio de bloqueo pedagógico.</w:t>
       </w:r>
     </w:p>
     <w:tbl>
@@ -20225,7 +20458,7 @@
                 <w:sz w:val="18"/>
                 <w:szCs w:val="18"/>
               </w:rPr>
-              <w:t xml:space="preserve">Resolver problemas de descuentos comerciales e IVA (19%) en operaciones afectas</w:t>
+              <w:t xml:space="preserve">Cálculo de rebajas comerciales e IVA 19% en boletas chilenas</w:t>
             </w:r>
           </w:p>
         </w:tc>
@@ -20253,7 +20486,7 @@
                 <w:sz w:val="17"/>
                 <w:szCs w:val="17"/>
               </w:rPr>
-              <w:t xml:space="preserve">Modern anime style 16:9 widescreen illustration. Two 13-year-old students, a girl with braided hair and a boy in a teal jacket, in a clean modern classroom looking at a digital blackboard with price tags and receipts. Generous negative space on the left. High contrast, bright flat colors. No text drawn by AI.</w:t>
+              <w:t xml:space="preserve">Modern anime style 16:9 widescreen illustration. Two 13-year-old student explorers, a girl with braided hair and a boy in a teal jacket, , a girl with braided hair and a boy in a teal jacket, in a clean modern classroom looking at a digital blackboard with price tags and receipts. Generous negative space on the left. High contrast, bright flat colors.. Clear lighting, vibrant colors, clear negative space for layout. No text drawn by AI.</w:t>
             </w:r>
           </w:p>
           <w:p>
@@ -20296,7 +20529,7 @@
                 <w:sz w:val="18"/>
                 <w:szCs w:val="18"/>
               </w:rPr>
-              <w:t xml:space="preserve">Hoy aprenderemos a resolver problemas cotidianos aplicando porcentajes al comercio: calcularemos descuentos comerciales y recargos de IVA del diecinueve por ciento en operaciones afectas.</w:t>
+              <w:t xml:space="preserve">Hoy resolveremos problemas cotidianos de descuentos comerciales e IVA del diecinueve por ciento en operaciones comerciales afectas.</w:t>
             </w:r>
           </w:p>
         </w:tc>
@@ -20428,7 +20661,7 @@
                 <w:sz w:val="17"/>
                 <w:szCs w:val="17"/>
               </w:rPr>
-              <w:t xml:space="preserve">Modern anime style 16:9 widescreen illustration. Analytical blackboard diagram breaking down a real purchase into its components: Base Price represents 100%, and the Rate represents the percentage to be calculated. Lucas highlighting the variables with chalk, clean modern aesthetic, ample negative space on the left. No text drawn by AI.</w:t>
+              <w:t xml:space="preserve">Modern anime style 16:9 widescreen illustration. Two 13-year-old student explorers, a girl with braided hair and a boy in a teal jacket, Analytical blackboard diagram breaking down a real purchase into its components: Base Price represents 100%, and the Rate represents the percentage to be calculated. Lucas highlighting the variables with chalk, clean modern aesthetic, ample negative space on the left.. Clear lighting, vibrant colors, clear negative space for layout. No text drawn by AI.</w:t>
             </w:r>
           </w:p>
           <w:p>
@@ -20603,7 +20836,7 @@
                 <w:sz w:val="17"/>
                 <w:szCs w:val="17"/>
               </w:rPr>
-              <w:t xml:space="preserve">Modern anime style 16:9 widescreen illustration. Step by step numerical demonstration showing multiplication of a base quantity by a decimal percentage, with clear intermediate arrows pointing to the resulting monetary amount. Sofía writing notes diligently, ample negative space on the left. No text drawn by AI.</w:t>
+              <w:t xml:space="preserve">Modern anime style 16:9 widescreen illustration. Two 13-year-old student explorers, a girl with braided hair and a boy in a teal jacket, Step by step numerical demonstration showing multiplication of a base quantity by a decimal percentage, with clear intermediate arrows pointing to the resulting monetary amount. Sofía writing notes diligently, ample negative space on the left.. Clear lighting, vibrant colors, clear negative space for layout. No text drawn by AI.</w:t>
             </w:r>
           </w:p>
           <w:p>
@@ -20778,7 +21011,7 @@
                 <w:sz w:val="17"/>
                 <w:szCs w:val="17"/>
               </w:rPr>
-              <w:t xml:space="preserve">Modern anime style 16:9 widescreen illustration. Split visual layout showing two clear operations: on the left a green discount tag with a subtraction symbol leading to Final Price, on the right an official seal with an addition symbol leading to Gross Price. High contrast, clean vector art, ample negative space on the left. No text drawn by AI.</w:t>
+              <w:t xml:space="preserve">Modern anime style 16:9 widescreen illustration. Two 13-year-old student explorers, a girl with braided hair and a boy in a teal jacket, Split visual layout showing two clear operations: on the left a green discount tag with a subtraction symbol leading to Final Price, on the right an official seal with an addition symbol leading to Gross Price. High contrast, clean vector art, ample negative space on the left.. Clear lighting, vibrant colors, clear negative space for layout. No text drawn by AI.</w:t>
             </w:r>
           </w:p>
           <w:p>
@@ -20953,7 +21186,7 @@
                 <w:sz w:val="17"/>
                 <w:szCs w:val="17"/>
               </w:rPr>
-              <w:t xml:space="preserve">Modern anime style 16:9 widescreen illustration. Modern computational infographic showing two shortcuts: multiplying by 0.80 to directly obtain an 80% price after 20% off, and multiplying by 1.19 to directly obtain the price with 19% IVA included. Minimalist aesthetic, ample negative space on the left. No text drawn by AI.</w:t>
+              <w:t xml:space="preserve">Modern anime style 16:9 widescreen illustration. Two 13-year-old student explorers, a girl with braided hair and a boy in a teal jacket, Modern computational infographic showing two shortcuts: multiplying by 0.80 to directly obtain an 80% price after 20% off, and multiplying by 1.19 to directly obtain the price with 19% IVA included. Minimalist aesthetic, ample negative space on the left.. Clear lighting, vibrant colors, clear negative space for layout. No text drawn by AI.</w:t>
             </w:r>
           </w:p>
           <w:p>
@@ -21078,7 +21311,7 @@
                 <w:sz w:val="18"/>
                 <w:szCs w:val="18"/>
               </w:rPr>
-              <w:t xml:space="preserve">MODELAMIENTO EN CUADERNO</w:t>
+              <w:t xml:space="preserve">EJEMPLO MODELADO: CASO 1</w:t>
             </w:r>
           </w:p>
           <w:p>
@@ -21100,7 +21333,7 @@
                 <w:sz w:val="18"/>
                 <w:szCs w:val="18"/>
               </w:rPr>
-              <w:t xml:space="preserve">Precio $30.000 - 20% Desc ($6.000) = $24.000</w:t>
+              <w:t xml:space="preserve">Un polerón escolar tiene un precio de lista de $30.000. Durante la liquidación d</w:t>
             </w:r>
           </w:p>
         </w:tc>
@@ -21128,7 +21361,7 @@
                 <w:sz w:val="17"/>
                 <w:szCs w:val="17"/>
               </w:rPr>
-              <w:t xml:space="preserve">Modern anime style 16:9 widescreen illustration. Close up of a student notebook page neatly filled with pencil writing: Original price $30.000, 20% calculation equals $6.000, and final subtraction $30.000 minus $6.000 equals $24.000. Lucas and Sofía looking at the completed page with satisfaction, ample negative space on the left. No text drawn by AI.</w:t>
+              <w:t xml:space="preserve">Modern anime style 16:9 widescreen illustration. Two 13-year-old student explorers, a girl with braided hair and a boy in a teal jacket, Close up of a student notebook page neatly filled with pencil writing: Original price $30.000, 20% calculation equals $6.000, and final subtraction $30.000 minus $6.000 equals $24.000. Lucas and Sofía looking at the completed page with satisfaction, ample negative space on the left.. Clear lighting, vibrant colors, clear negative space for layout. No text drawn by AI.</w:t>
             </w:r>
           </w:p>
           <w:p>
@@ -21150,7 +21383,7 @@
                 <w:sz w:val="17"/>
                 <w:szCs w:val="17"/>
               </w:rPr>
-              <w:t xml:space="preserve">Resolución manuscrita: Descuento = $6.000, Total a pagar = $24.000</w:t>
+              <w:t xml:space="preserve">Resolución canónica: Descuento = 20% de 30.000 = (20 × 30.000) / 100 = $6.000. Precio final = 30.000 - 6.000 = $24.000.</w:t>
             </w:r>
           </w:p>
         </w:tc>
@@ -21171,7 +21404,7 @@
                 <w:sz w:val="18"/>
                 <w:szCs w:val="18"/>
               </w:rPr>
-              <w:t xml:space="preserve">Registremos en el cuaderno el caso del polerón: Precio de lista = 30.000 pesos. Descuento del 20%: calculamos 20 por 30.000 dividido en 100, lo que da 6.000 pesos de rebaja. Precio final a pagar: 30.000 menos 6.000 = 24.000 pesos.</w:t>
+              <w:t xml:space="preserve">Analicemos paso a paso el caso modelado: Un polerón escolar tiene un precio de lista de $30.000. Durante la liquidación de temporada se ofrece con un 20% de descuento. ¿Cuánto dinero se descuenta y cuál es el precio final que se debe pagar por el polerón? Descuento = 20% de 30.000 = (20 × 30.000) / 100 = $6.000. Precio final = 30.000 - 6.000 = $24.000. Por lo tanto, el resultado esperado es: Se descuentan $6.000 y el precio final es $24.000..</w:t>
             </w:r>
           </w:p>
         </w:tc>
@@ -21253,7 +21486,7 @@
                 <w:sz w:val="18"/>
                 <w:szCs w:val="18"/>
               </w:rPr>
-              <w:t xml:space="preserve">REGLA DE ORO DE LOS PROBLEMAS</w:t>
+              <w:t xml:space="preserve">REGLA DE ORO DE LA LECCIÓN</w:t>
             </w:r>
           </w:p>
           <w:p>
@@ -21303,7 +21536,7 @@
                 <w:sz w:val="17"/>
                 <w:szCs w:val="17"/>
               </w:rPr>
-              <w:t xml:space="preserve">Modern anime style 16:9 widescreen illustration. A large golden badge on a clean background highlighting a glowing key icon. Sofía and Lucas pointing forward enthusiastically toward the practice exercises on the platform screen, bright vibrant lighting, ample negative space on the left. No text drawn by AI.</w:t>
+              <w:t xml:space="preserve">Modern anime style 16:9 widescreen illustration. Two 13-year-old student explorers, a girl with braided hair and a boy in a teal jacket, A large golden interactive study guide on a clean background highlighting a glowing key icon. Sofía and Lucas pointing forward enthusiastically toward the practice exercises on the platform screen, bright vibrant lighting, ample negative space on the left.. Clear lighting, vibrant colors, clear negative space for layout. No text drawn by AI.</w:t>
             </w:r>
           </w:p>
           <w:p>
@@ -21346,7 +21579,7 @@
                 <w:sz w:val="18"/>
                 <w:szCs w:val="18"/>
               </w:rPr>
-              <w:t xml:space="preserve">Regla de Oro: antes de responder, verifica siempre si la pregunta solicita el monto del descuento o impuesto, o bien el precio final a pagar. Ahora apliquemos este modelo en los ejercicios interactivos.</w:t>
+              <w:t xml:space="preserve">Regla de oro: Verifica siempre si piden la rebaja o el precio final. Ahora pon a prueba lo aprendido resolviendo los casos de práctica en la plataforma interactiva.</w:t>
             </w:r>
           </w:p>
         </w:tc>
@@ -21374,10 +21607,10 @@
           <w:b/>
           <w:bCs/>
         </w:rPr>
-        <w:t xml:space="preserve">Comprobación 1 (En el video modelamos el cálculo del polerón de $30.000 con 20% de descuento.): </w:t>
-      </w:r>
-      <w:r>
-        <w:t xml:space="preserve">¿Por qué responder $6.000 a la pregunta "¿cuánto se paga?" sería un error común?</w:t>
+        <w:t xml:space="preserve">Comprobación 1 (Un polerón escolar tiene un precio de lista de $30.000. Durante la liquidación de temporada se ofrece con un 20% de descuento.): </w:t>
+      </w:r>
+      <w:r>
+        <w:t xml:space="preserve">¿Cuánto dinero se descuenta y cuál es el precio final que se debe pagar por el polerón?</w:t>
       </w:r>
     </w:p>
     <w:p>
@@ -21393,7 +21626,7 @@
         <w:t xml:space="preserve">• Respuesta esperada: </w:t>
       </w:r>
       <w:r>
-        <w:t xml:space="preserve">Porque $6.000 es solo la rebaja que se ahorra el cliente; para saber cuánto se paga se debe restar esa rebaja del precio original.</w:t>
+        <w:t xml:space="preserve">Se descuentan $6.000 y el precio final es $24.000.</w:t>
       </w:r>
       <w:r>
         <w:rPr>
@@ -21404,7 +21637,7 @@
         <w:t xml:space="preserve"> | Pista socrática: </w:t>
       </w:r>
       <w:r>
-        <w:t xml:space="preserve">Recuerda que $6.000 es el beneficio del descuento. El cliente debe pagar los $24.000 restantes.</w:t>
+        <w:t xml:space="preserve">Paso 1: Calcula el 20% de $30.000 (el 10% es $3.000, así que el 20% es $6.000). Paso 2: Resta esa rebaja a los $30.000 originales.</w:t>
       </w:r>
     </w:p>
     <w:p>
@@ -21420,7 +21653,65 @@
         <w:t xml:space="preserve">• Texto revelado al estudiante: </w:t>
       </w:r>
       <w:r>
-        <w:t xml:space="preserve">Porque $6.000 es el descuento y no el precio final.</w:t>
+        <w:t xml:space="preserve">El descuento es de $6.000 y el precio final a pagar es $24.000.</w:t>
+      </w:r>
+    </w:p>
+    <w:p>
+      <w:pPr>
+        <w:spacing w:after="40" w:before="60"/>
+      </w:pPr>
+      <w:r>
+        <w:rPr>
+          <w:b/>
+          <w:bCs/>
+        </w:rPr>
+        <w:t xml:space="preserve">Comprobación 2 (Una librería vende una enciclopedia escolar a un valor neto de $10.000, en una compraventa afecta a IVA. Al momento de emitir la boleta de venta en Chile, se debe agregar el 19% correspondiente al Impuesto al Valor Agregado.): </w:t>
+      </w:r>
+      <w:r>
+        <w:t xml:space="preserve">¿A cuánto dinero asciende el impuesto de IVA y cuál es el precio bruto total con IVA incluido?</w:t>
+      </w:r>
+    </w:p>
+    <w:p>
+      <w:pPr>
+        <w:spacing w:after="40"/>
+      </w:pPr>
+      <w:r>
+        <w:rPr>
+          <w:b/>
+          <w:bCs/>
+          <w:color w:val="0284C7"/>
+        </w:rPr>
+        <w:t xml:space="preserve">• Respuesta esperada: </w:t>
+      </w:r>
+      <w:r>
+        <w:t xml:space="preserve">El IVA es de $1.900 y el precio final con IVA es $11.900.</w:t>
+      </w:r>
+      <w:r>
+        <w:rPr>
+          <w:b/>
+          <w:bCs/>
+          <w:color w:val="D97706"/>
+        </w:rPr>
+        <w:t xml:space="preserve"> | Pista socrática: </w:t>
+      </w:r>
+      <w:r>
+        <w:t xml:space="preserve">Paso 1: Calcula el 19% de $10.000 multiplicando 10.000 por 0,19. Paso 2: Suma ese valor tributario a los $10.000 netos iniciales.</w:t>
+      </w:r>
+    </w:p>
+    <w:p>
+      <w:pPr>
+        <w:spacing w:after="60"/>
+      </w:pPr>
+      <w:r>
+        <w:rPr>
+          <w:b/>
+          <w:bCs/>
+          <w:color w:val="0F766E"/>
+        </w:rPr>
+        <w:t xml:space="preserve">• Texto revelado al estudiante: </w:t>
+      </w:r>
+      <w:r>
+        <w:t xml:space="preserve">El IVA es $1.900 y el valor final con impuesto incluido es $11.900.</w:t>
       </w:r>
     </w:p>
     <w:p>
@@ -22682,11 +22973,11 @@
         <w:rPr>
           <w:b/>
           <w:bCs/>
-          <w:color w:val="B45309"/>
+          <w:color w:val="0F766E"/>
           <w:sz w:val="19"/>
           <w:szCs w:val="19"/>
         </w:rPr>
-        <w:t xml:space="preserve">• Protocolo de Comprobación Acústica Obligatoria (Google Vids): </w:t>
+        <w:t xml:space="preserve">• Calibración Audiovisual (Google Vids): </w:t>
       </w:r>
       <w:r>
         <w:rPr>
@@ -22694,7 +22985,7 @@
           <w:sz w:val="19"/>
           <w:szCs w:val="19"/>
         </w:rPr>
-        <w:t xml:space="preserve">Tras generar y exportar el audio en Google Vids, medir la duración real del archivo exportado con cronómetro o analizador de audio. El conteo de palabras no garantiza por sí solo que se obtengan 60 o 90 segundos exactos. Si la duración real no es exacta (60 s en gancho y 90 s en explicación), ajustar la narración, las pausas o el ritmo, volver a exportar y medir nuevamente. Registrar la duración comprobada; no marcar el requisito como cumplido basándose solo en el número de palabras o en una duración estimada.</w:t>
+        <w:t xml:space="preserve">El guion continuo está redactado con un presupuesto léxico referencial adaptado al nivel escolar. La calibración acústica, pausas y ritmo de locución se ajustan directamente en Google Vids durante la síntesis y renderizado, sin que el conteo de palabras ni la duración en segundos constituyan un criterio de bloqueo pedagógico.</w:t>
       </w:r>
     </w:p>
     <w:tbl>
@@ -22936,7 +23227,7 @@
                 <w:sz w:val="17"/>
                 <w:szCs w:val="17"/>
               </w:rPr>
-              <w:t xml:space="preserve">Modern anime style 16:9 widescreen illustration. Two 13-year-old student organizers, a girl with braided hair and a boy in a teal jacket, standing before a large wooden presentation board in a bright school auditorium. A colorful pie chart is pinned to the board, sunlight streaming through tall windows, clean vector aesthetic, ample negative space on the left. No text drawn by AI.</w:t>
+              <w:t xml:space="preserve">Modern anime style 16:9 widescreen illustration. Two 13-year-old student explorers, a girl with braided hair and a boy in a teal jacket, Two 13-year-old student organizers, a girl with braided hair and a boy in a teal jacket, standing before a large wooden presentation board in a bright school auditorium. A colorful pie chart is pinned to the board, sunlight streaming through tall windows, clean vector aesthetic, ample negative space on the left.. Clear lighting, vibrant colors, clear negative space for layout. No text drawn by AI.</w:t>
             </w:r>
           </w:p>
           <w:p>
@@ -23111,7 +23402,7 @@
                 <w:sz w:val="17"/>
                 <w:szCs w:val="17"/>
               </w:rPr>
-              <w:t xml:space="preserve">Modern anime style 16:9 widescreen illustration. Close up of the presentation board showing a large circular chart divided into three distinct colored slices: blue for 50%, yellow for 25%, and coral for 25%. Lucas is pointing with a wooden ruler while Sofía holds her notes, focused engaged expressions, clear clean lines, negative space on the left. No text drawn by AI.</w:t>
+              <w:t xml:space="preserve">Modern anime style 16:9 widescreen illustration. Two 13-year-old student explorers, a girl with braided hair and a boy in a teal jacket, Close up of the presentation board showing a large circular chart divided into three distinct colored slices: blue for 50%, yellow for 25%, and coral for 25%. Lucas is pointing with a wooden ruler while Sofía holds her notes, focused engaged expressions, clear clean lines, negative space on the left.. Clear lighting, vibrant colors, clear negative space for layout. No text drawn by AI.</w:t>
             </w:r>
           </w:p>
           <w:p>
@@ -23286,7 +23577,7 @@
                 <w:sz w:val="17"/>
                 <w:szCs w:val="17"/>
               </w:rPr>
-              <w:t xml:space="preserve">Modern anime style 16:9 widescreen illustration. Sofía writing on a chalkboard with neat chalk figures, drawing a balance scale where one side shows 15 students and the other side shows a 10% tag. Lucas is calculating in his notebook, bright classroom ambiance, clean anime shading. No text drawn by AI.</w:t>
+              <w:t xml:space="preserve">Modern anime style 16:9 widescreen illustration. Two 13-year-old student explorers, a girl with braided hair and a boy in a teal jacket, Sofía writing on a chalkboard with neat chalk figures, drawing a balance scale where one side shows 15 students and the other side shows a 10% tag. Lucas is calculating in his notebook, bright classroom ambiance, clean anime shading.. Clear lighting, vibrant colors, clear negative space for layout. No text drawn by AI.</w:t>
             </w:r>
           </w:p>
           <w:p>
@@ -23461,7 +23752,7 @@
                 <w:sz w:val="17"/>
                 <w:szCs w:val="17"/>
               </w:rPr>
-              <w:t xml:space="preserve">Modern anime style 16:9 widescreen illustration. Lucas showing his notebook to the audience with an enthusiastic smile, revealing a diagram with 10 identical blocks of 15 students lined up to form a large bar of 150. Crisp lineart, warm studio lighting, negative space on the left. No text drawn by AI.</w:t>
+              <w:t xml:space="preserve">Modern anime style 16:9 widescreen illustration. Two 13-year-old student explorers, a girl with braided hair and a boy in a teal jacket, Lucas showing his notebook to the audience with an enthusiastic smile, revealing a diagram with 10 identical blocks of 15 students lined up to form a large bar of 150. Crisp lineart, warm studio lighting, negative space on the left.. Clear lighting, vibrant colors, clear negative space for layout. No text drawn by AI.</w:t>
             </w:r>
           </w:p>
           <w:p>
@@ -23636,7 +23927,7 @@
                 <w:sz w:val="17"/>
                 <w:szCs w:val="17"/>
               </w:rPr>
-              <w:t xml:space="preserve">Modern anime style 16:9 widescreen illustration. Two shop posters in a bookstore window: one claims 20% direct discount, and another claims 10% plus an additional 10% discount. Sofía and Lucas analyzing the difference with furrowed brows, dramatic curious expressions, clean lighting. No text drawn by AI.</w:t>
+              <w:t xml:space="preserve">Modern anime style 16:9 widescreen illustration. Two 13-year-old student explorers, a girl with braided hair and a boy in a teal jacket, Two shop posters in a bookstore window: one claims 20% direct discount, and another claims 10% plus an additional 10% discount. Sofía and Lucas analyzing the difference with furrowed brows, dramatic curious expressions, clean lighting.. Clear lighting, vibrant colors, clear negative space for layout. No text drawn by AI.</w:t>
             </w:r>
           </w:p>
           <w:p>
@@ -23811,7 +24102,7 @@
                 <w:sz w:val="17"/>
                 <w:szCs w:val="17"/>
               </w:rPr>
-              <w:t xml:space="preserve">Modern anime style 16:9 widescreen illustration. Sofía and Lucas pointing at a comparison table on their chalkboard, showing that the second 10% se calcula sobre el nuevo precio rebajado de $9.000, resultando en $900 y no en $1.000. Clean modern flat colors, ample negative space. No text drawn by AI.</w:t>
+              <w:t xml:space="preserve">Modern anime style 16:9 widescreen illustration. Two 13-year-old student explorers, a girl with braided hair and a boy in a teal jacket, Sofía and Lucas pointing at a comparison table on their chalkboard, showing that the second 10% se calcula sobre el nuevo precio rebajado de $9.000, resultando en $900 y no en $1.000. Clean modern flat colors, ample negative space.. Clear lighting, vibrant colors, clear negative space for layout. No text drawn by AI.</w:t>
             </w:r>
           </w:p>
           <w:p>
@@ -23986,7 +24277,7 @@
                 <w:sz w:val="17"/>
                 <w:szCs w:val="17"/>
               </w:rPr>
-              <w:t xml:space="preserve">Modern anime style 16:9 widescreen illustration. Sofía and Lucas high-fiving in front of the finished presentation board, holding their study guides with proud smiles, warm golden afternoon glow entering the hall, tidy minimalist room. No text drawn by AI.</w:t>
+              <w:t xml:space="preserve">Modern anime style 16:9 widescreen illustration. Two 13-year-old student explorers, a girl with braided hair and a boy in a teal jacket, Sofía and Lucas high-fiving in front of the finished presentation board, holding their study guides with proud smiles, warm golden afternoon glow entering the hall, tidy minimalist room.. Clear lighting, vibrant colors, clear negative space for layout. No text drawn by AI.</w:t>
             </w:r>
           </w:p>
           <w:p>
@@ -24312,11 +24603,11 @@
         <w:rPr>
           <w:b/>
           <w:bCs/>
-          <w:color w:val="B45309"/>
+          <w:color w:val="0F766E"/>
           <w:sz w:val="19"/>
           <w:szCs w:val="19"/>
         </w:rPr>
-        <w:t xml:space="preserve">• Protocolo de Comprobación Acústica Obligatoria (Google Vids): </w:t>
+        <w:t xml:space="preserve">• Calibración Audiovisual (Google Vids): </w:t>
       </w:r>
       <w:r>
         <w:rPr>
@@ -24324,7 +24615,7 @@
           <w:sz w:val="19"/>
           <w:szCs w:val="19"/>
         </w:rPr>
-        <w:t xml:space="preserve">Tras generar y exportar el audio en Google Vids, medir la duración real del archivo exportado con cronómetro o analizador de audio. El conteo de palabras no garantiza por sí solo que se obtengan 60 o 90 segundos exactos. Si la duración real no es exacta (60 s en gancho y 90 s en explicación), ajustar la narración, las pausas o el ritmo, volver a exportar y medir nuevamente. Registrar la duración comprobada; no marcar el requisito como cumplido basándose solo en el número de palabras o en una duración estimada.</w:t>
+        <w:t xml:space="preserve">El guion continuo está redactado con un presupuesto léxico referencial adaptado al nivel escolar. La calibración acústica, pausas y ritmo de locución se ajustan directamente en Google Vids durante la síntesis y renderizado, sin que el conteo de palabras ni la duración en segundos constituyan un criterio de bloqueo pedagógico.</w:t>
       </w:r>
     </w:p>
     <w:tbl>
@@ -24538,7 +24829,7 @@
                 <w:sz w:val="18"/>
                 <w:szCs w:val="18"/>
               </w:rPr>
-              <w:t xml:space="preserve">Consolidar el cálculo inverso, gráficos circulares y ensayo psicométrico tipo MINEDUC</w:t>
+              <w:t xml:space="preserve">Hallar el total conociendo una parte y el porcentaje correspondiente</w:t>
             </w:r>
           </w:p>
         </w:tc>
@@ -24566,7 +24857,7 @@
                 <w:sz w:val="17"/>
                 <w:szCs w:val="17"/>
               </w:rPr>
-              <w:t xml:space="preserve">Modern anime style 16:9 widescreen illustration. Two 13-year-old student explorers, a girl with braided hair and a boy in a teal jacket, standing confidently before a modern digital board displaying summary diagrams and sample questions. Clean classroom, high clarity, ample negative space on the left. No text drawn by AI.</w:t>
+              <w:t xml:space="preserve">Modern anime style 16:9 widescreen illustration. Two 13-year-old student explorers, a girl with braided hair and a boy in a teal jacket, Two 13-year-old student explorers, a girl with braided hair and a boy in a teal jacket, standing confidently before a modern digital board displaying summary diagrams and sample questions. Clean classroom, high clarity, ample negative space on the left.. Clear lighting, vibrant colors, clear negative space for layout. No text drawn by AI.</w:t>
             </w:r>
           </w:p>
           <w:p>
@@ -24609,7 +24900,7 @@
                 <w:sz w:val="18"/>
                 <w:szCs w:val="18"/>
               </w:rPr>
-              <w:t xml:space="preserve">Hoy consolidaremos todo lo aprendido sobre porcentajes: resolveremos problemas de cálculo inverso, interpretaremos gráficos circulares y enfrentaremos un ensayo formal con análisis de distractores.</w:t>
+              <w:t xml:space="preserve">Hoy aprenderemos a hallar el total correspondiente al cien por ciento conociendo una parte y su porcentaje, consolidando todas las estrategias de porcentajes para evaluaciones formales.</w:t>
             </w:r>
           </w:p>
         </w:tc>
@@ -24741,7 +25032,7 @@
                 <w:sz w:val="17"/>
                 <w:szCs w:val="17"/>
               </w:rPr>
-              <w:t xml:space="preserve">Modern anime style 16:9 widescreen illustration. Detailed chalkboard split into three vertical sections demonstrating the calculation step by step: 15% -&gt; 18 libros, 18 · 100 = 1.800, 1.800 : 15 = 120 libros. Lucas pointing to each step, calm organized atmosphere. No text drawn by AI.</w:t>
+              <w:t xml:space="preserve">Modern anime style 16:9 widescreen illustration. Two 13-year-old student explorers, a girl with braided hair and a boy in a teal jacket, Detailed chalkboard split into three vertical sections demonstrating the calculation step by step: 15% -&gt; 18 libros, 18 · 100 = 1.800, 1.800 : 15 = 120 libros. Lucas pointing to each step, calm organized atmosphere.. Clear lighting, vibrant colors, clear negative space for layout. No text drawn by AI.</w:t>
             </w:r>
           </w:p>
           <w:p>
@@ -24916,7 +25207,7 @@
                 <w:sz w:val="17"/>
                 <w:szCs w:val="17"/>
               </w:rPr>
-              <w:t xml:space="preserve">Modern anime style 16:9 widescreen illustration. Clean educational infographic style slide showing a 360-degree circle with protractor markings. Slices clearly labeled with fraction equivalents: 50% = 1/2, 25% = 1/4, 10% = 1/10. Sofía explaining with a pointer, bright colors. No text drawn by AI.</w:t>
+              <w:t xml:space="preserve">Modern anime style 16:9 widescreen illustration. Two 13-year-old student explorers, a girl with braided hair and a boy in a teal jacket, Clean educational infographic style slide showing a 360-degree circle with protractor markings. Slices clearly labeled with fraction equivalents: 50% = 1/2, 25% = 1/4, 10% = 1/10. Sofía explaining with a pointer, bright colors.. Clear lighting, vibrant colors, clear negative space for layout. No text drawn by AI.</w:t>
             </w:r>
           </w:p>
           <w:p>
@@ -25091,7 +25382,7 @@
                 <w:sz w:val="17"/>
                 <w:szCs w:val="17"/>
               </w:rPr>
-              <w:t xml:space="preserve">Modern anime style 16:9 widescreen illustration. Infographic comparison slide with a flow diagram showing two sequential arrows: from $10.000 minus 10% to $9.000, and from $9.000 minus 10% to $8.100. Lucas analyzing the flow, clean corporate aesthetic. No text drawn by AI.</w:t>
+              <w:t xml:space="preserve">Modern anime style 16:9 widescreen illustration. Two 13-year-old student explorers, a girl with braided hair and a boy in a teal jacket, Infographic comparison slide with a flow diagram showing two sequential arrows: from $10.000 minus 10% to $9.000, and from $9.000 minus 10% to $8.100. Lucas analyzing the flow, clean corporate aesthetic.. Clear lighting, vibrant colors, clear negative space for layout. No text drawn by AI.</w:t>
             </w:r>
           </w:p>
           <w:p>
@@ -25266,7 +25557,7 @@
                 <w:sz w:val="17"/>
                 <w:szCs w:val="17"/>
               </w:rPr>
-              <w:t xml:space="preserve">Modern anime style 16:9 widescreen illustration. Chalkboard showing a red alert icon next to a common error: calculating 20% OF 12 instead of solving for the total. Sofía crossing out the error with a gentle smile and writing the correct formula. No text drawn by AI.</w:t>
+              <w:t xml:space="preserve">Modern anime style 16:9 widescreen illustration. Two 13-year-old student explorers, a girl with braided hair and a boy in a teal jacket, Chalkboard showing a red alert icon next to a common error: calculating 20% OF 12 instead of solving for the total. Sofía crossing out the error with a gentle smile and writing the correct formula.. Clear lighting, vibrant colors, clear negative space for layout. No text drawn by AI.</w:t>
             </w:r>
           </w:p>
           <w:p>
@@ -25391,7 +25682,7 @@
                 <w:sz w:val="18"/>
                 <w:szCs w:val="18"/>
               </w:rPr>
-              <w:t xml:space="preserve">REACTIVO TIPO EXAMEN LIBRE (MINEDUC)</w:t>
+              <w:t xml:space="preserve">EJEMPLO MODELADO: CASO 1</w:t>
             </w:r>
           </w:p>
           <w:p>
@@ -25413,7 +25704,7 @@
                 <w:sz w:val="18"/>
                 <w:szCs w:val="18"/>
               </w:rPr>
-              <w:t xml:space="preserve">Pregunta formal de 4 alternativas con análisis de distractores</w:t>
+              <w:t xml:space="preserve">En una biblioteca pública, 18 libros de literatura juvenil representan el 15% de</w:t>
             </w:r>
           </w:p>
         </w:tc>
@@ -25441,7 +25732,7 @@
                 <w:sz w:val="17"/>
                 <w:szCs w:val="17"/>
               </w:rPr>
-              <w:t xml:space="preserve">Modern anime style 16:9 widescreen illustration. Sofía and Lucas in formal school uniforms, standing beside a projected sample test question with 4 multiple choice letters A, B, C, D clearly highlighted in clean boxes. Focused confident attitudes. No text drawn by AI.</w:t>
+              <w:t xml:space="preserve">Modern anime style 16:9 widescreen illustration. Two 13-year-old student explorers, a girl with braided hair and a boy in a teal jacket, Sofía and Lucas in formal school uniforms, standing beside a projected sample test question with 4 multiple choice letters A, B, C, D clearly highlighted in clean boxes. Focused confident attitudes.. Clear lighting, vibrant colors, clear negative space for layout. No text drawn by AI.</w:t>
             </w:r>
           </w:p>
           <w:p>
@@ -25463,7 +25754,7 @@
                 <w:sz w:val="17"/>
                 <w:szCs w:val="17"/>
               </w:rPr>
-              <w:t xml:space="preserve">Reactivo formal: Si 14 estudiantes son el 28%, el total es: A) 50  B) 39  C) 3,92  D) 200</w:t>
+              <w:t xml:space="preserve">Resolución canónica: Total = (18 · 100) / 15 = 1.800 / 15 = 120 libros.</w:t>
             </w:r>
           </w:p>
         </w:tc>
@@ -25484,7 +25775,7 @@
                 <w:sz w:val="18"/>
                 <w:szCs w:val="18"/>
               </w:rPr>
-              <w:t xml:space="preserve">En las evaluaciones oficiales de Exámenes Libres te enfrentarás a preguntas de cuatro alternativas. Aplica con calma tu procedimiento y descarta los distractores analizando el origen del error.</w:t>
+              <w:t xml:space="preserve">Analicemos paso a paso el caso modelado: En una biblioteca pública, 18 libros de literatura juvenil representan el 15% del total de libros prestados este mes. ¿Cuántos libros prestó la biblioteca en total? Total = (18 · 100) / 15 = 1.800 / 15 = 120 libros. Por lo tanto, el resultado esperado es: Se prestaron 120 libros en total..</w:t>
             </w:r>
           </w:p>
         </w:tc>
@@ -25566,7 +25857,7 @@
                 <w:sz w:val="18"/>
                 <w:szCs w:val="18"/>
               </w:rPr>
-              <w:t xml:space="preserve">¡MAESTRÍA EN PORCENTAJES ALCANZADA!</w:t>
+              <w:t xml:space="preserve">REGLA DE ORO DE LA LECCIÓN</w:t>
             </w:r>
           </w:p>
           <w:p>
@@ -25616,7 +25907,7 @@
                 <w:sz w:val="17"/>
                 <w:szCs w:val="17"/>
               </w:rPr>
-              <w:t xml:space="preserve">Modern anime style 16:9 widescreen illustration. Both students smiling warmly at the camera from their study desks, laptop open showing the practice portal interface with green checkmarks. Clean bright study room, ample negative space. No text drawn by AI.</w:t>
+              <w:t xml:space="preserve">Modern anime style 16:9 widescreen illustration. Two 13-year-old student explorers, a girl with braided hair and a boy in a teal jacket, Both students smiling warmly at the camera from their study desks, laptop open showing the practice portal interface with green checkmarks. Clean bright study room, ample negative space.. Clear lighting, vibrant colors, clear negative space for layout. No text drawn by AI.</w:t>
             </w:r>
           </w:p>
           <w:p>
@@ -25659,7 +25950,7 @@
                 <w:sz w:val="18"/>
                 <w:szCs w:val="18"/>
               </w:rPr>
-              <w:t xml:space="preserve">¡Has dominado los porcentajes en todas sus formas! Ahora estás plenamente preparado para ingresar al simulador interactivo de EstudioSimple y poner a prueba tus habilidades.</w:t>
+              <w:t xml:space="preserve">Regla de oro: Ingresa al módulo interactivo para tu práctica final. Ahora pon a prueba lo aprendido resolviendo los casos de práctica en la plataforma interactiva.</w:t>
             </w:r>
           </w:p>
         </w:tc>
@@ -25687,10 +25978,10 @@
           <w:b/>
           <w:bCs/>
         </w:rPr>
-        <w:t xml:space="preserve">Comprobación 1 (En el video formalizamos el cálculo inverso a partir de 18 libros equivalentes al 15%.): </w:t>
-      </w:r>
-      <w:r>
-        <w:t xml:space="preserve">¿Por qué no debemos calcular el 15% de 18 para resolver este problema?</w:t>
+        <w:t xml:space="preserve">Comprobación 1 (En una biblioteca pública, 18 libros de literatura juvenil representan el 15% del total de libros prestados este mes.): </w:t>
+      </w:r>
+      <w:r>
+        <w:t xml:space="preserve">¿Cuántos libros prestó la biblioteca en total?</w:t>
       </w:r>
     </w:p>
     <w:p>
@@ -25706,7 +25997,7 @@
         <w:t xml:space="preserve">• Respuesta esperada: </w:t>
       </w:r>
       <w:r>
-        <w:t xml:space="preserve">Porque 18 no es el total completo; 18 es solo la parte del 15%, por lo que el total debe ser un número mucho mayor.</w:t>
+        <w:t xml:space="preserve">Se prestaron 120 libros en total.</w:t>
       </w:r>
       <w:r>
         <w:rPr>
@@ -25717,7 +26008,7 @@
         <w:t xml:space="preserve"> | Pista socrática: </w:t>
       </w:r>
       <w:r>
-        <w:t xml:space="preserve">Recuerda: 18 libros representan solo el 15%. Para encontrar el 100%, multiplicamos por 100 y dividimos por 15.</w:t>
+        <w:t xml:space="preserve">Multiplica la parte por 100 y divide por el porcentaje: (18 · 100) : 15 = 1.800 : 15 = 120.</w:t>
       </w:r>
     </w:p>
     <w:p>
@@ -25733,7 +26024,65 @@
         <w:t xml:space="preserve">• Texto revelado al estudiante: </w:t>
       </w:r>
       <w:r>
-        <w:t xml:space="preserve">Porque 18 es solo una parte y el total debe ser mayor.</w:t>
+        <w:t xml:space="preserve">La biblioteca prestó 120 libros en total.</w:t>
+      </w:r>
+    </w:p>
+    <w:p>
+      <w:pPr>
+        <w:spacing w:after="40" w:before="60"/>
+      </w:pPr>
+      <w:r>
+        <w:rPr>
+          <w:b/>
+          <w:bCs/>
+        </w:rPr>
+        <w:t xml:space="preserve">Comprobación 2 (Un gráfico circular muestra las preferencias de 200 estudiantes: 40% Robótica, 35% Teatro y el resto Ajedrez.): </w:t>
+      </w:r>
+      <w:r>
+        <w:t xml:space="preserve">¿Cuántos estudiantes eligieron Ajedrez?</w:t>
+      </w:r>
+    </w:p>
+    <w:p>
+      <w:pPr>
+        <w:spacing w:after="40"/>
+      </w:pPr>
+      <w:r>
+        <w:rPr>
+          <w:b/>
+          <w:bCs/>
+          <w:color w:val="0284C7"/>
+        </w:rPr>
+        <w:t xml:space="preserve">• Respuesta esperada: </w:t>
+      </w:r>
+      <w:r>
+        <w:t xml:space="preserve">50 estudiantes eligieron Ajedrez (25% del total).</w:t>
+      </w:r>
+      <w:r>
+        <w:rPr>
+          <w:b/>
+          <w:bCs/>
+          <w:color w:val="D97706"/>
+        </w:rPr>
+        <w:t xml:space="preserve"> | Pista socrática: </w:t>
+      </w:r>
+      <w:r>
+        <w:t xml:space="preserve">Suma 40% + 35% = 75%. El resto es 100% - 75% = 25%. Luego calcula: 200 : 4 = 50.</w:t>
+      </w:r>
+    </w:p>
+    <w:p>
+      <w:pPr>
+        <w:spacing w:after="60"/>
+      </w:pPr>
+      <w:r>
+        <w:rPr>
+          <w:b/>
+          <w:bCs/>
+          <w:color w:val="0F766E"/>
+        </w:rPr>
+        <w:t xml:space="preserve">• Texto revelado al estudiante: </w:t>
+      </w:r>
+      <w:r>
+        <w:t xml:space="preserve">50 estudiantes eligieron el taller de Ajedrez.</w:t>
       </w:r>
     </w:p>
     <w:p>

</xml_diff>

<commit_message>
fix(oa04): correccion cerrada matematica 7B OA04 y control de alcance
</commit_message>
<xml_diff>
--- a/LECCIONES/110-7/Matematica/OA04/Plan_Maestro_7Básico_110-7-MAT-OA04_6Lecciones.docx
+++ b/LECCIONES/110-7/Matematica/OA04/Plan_Maestro_7Básico_110-7-MAT-OA04_6Lecciones.docx
@@ -53,7 +53,7 @@
         </w:rPr>
         <w:t xml:space="preserve">Desglose Instruccional en 6 Lecciones de 30 Minutos (8 Pasos Pedagógicos Oficiales)
 Incluye Enlaces a Videos en Cloudflare R2, Prompts Anime Moderno 16:9 y Ficha Técnica de Aula
-Fecha de Actualización Oficial: 08-10-2026, 3:56:16 p. m. (America/Santiago)</w:t>
+Fecha de Actualización Oficial: 08-10-2026, 5:34:50 p. m. (America/Santiago)</w:t>
       </w:r>
     </w:p>
     <w:p>
@@ -1402,7 +1402,7 @@
                 <w:sz w:val="17"/>
                 <w:szCs w:val="17"/>
               </w:rPr>
-              <w:t xml:space="preserve">Modern anime style 16:9 widescreen illustration. Two 13-year-old student explorers, a girl with braided hair and a boy in a teal jacket, Two 13-year-old student explorers, a girl with braided hair and a boy in a teal jacket, standing on a sunny school rooftop looking at a large square solar panel divided into a grid of 100 square cells. High contrast, bright sunny day, clean vector lines, ample negative space on the left.. Clear lighting, vibrant colors, clear negative space for layout. No text drawn by AI.</w:t>
+              <w:t xml:space="preserve">Modern anime style 16:9 widescreen illustration. Two 13-year-old student explorers, a girl with braided hair and a boy in a teal jacket, standing on a sunny school rooftop looking at a large square solar panel divided into a grid of 100 square cells. High contrast, bright sunny day, clean vector lines, ample negative space on the left. Clear lighting, vibrant colors. No text drawn by AI.</w:t>
             </w:r>
           </w:p>
           <w:p>
@@ -1425,6 +1425,28 @@
                 <w:szCs w:val="17"/>
               </w:rPr>
               <w:t xml:space="preserve">Panel solar cuadrado dividido en cuadrícula de 10x10 celdas</w:t>
+            </w:r>
+          </w:p>
+          <w:p>
+            <w:pPr>
+              <w:spacing w:after="20"/>
+            </w:pPr>
+            <w:r>
+              <w:rPr>
+                <w:b/>
+                <w:bCs/>
+                <w:color w:val="0F766E"/>
+                <w:sz w:val="17"/>
+                <w:szCs w:val="17"/>
+              </w:rPr>
+              <w:t xml:space="preserve">• Logotipo Oficial: </w:t>
+            </w:r>
+            <w:r>
+              <w:rPr>
+                <w:sz w:val="17"/>
+                <w:szCs w:val="17"/>
+              </w:rPr>
+              <w:t xml:space="preserve">Logo blanco de EstudioSimple en la esquina inferior derecha, tamaño del video de referencia.</w:t>
             </w:r>
           </w:p>
         </w:tc>
@@ -1602,6 +1624,28 @@
               <w:t xml:space="preserve">Ilustración esquemática de cuadrícula con celdas que brillan en color azul cian</w:t>
             </w:r>
           </w:p>
+          <w:p>
+            <w:pPr>
+              <w:spacing w:after="20"/>
+            </w:pPr>
+            <w:r>
+              <w:rPr>
+                <w:b/>
+                <w:bCs/>
+                <w:color w:val="0F766E"/>
+                <w:sz w:val="17"/>
+                <w:szCs w:val="17"/>
+              </w:rPr>
+              <w:t xml:space="preserve">• Logotipo Oficial: </w:t>
+            </w:r>
+            <w:r>
+              <w:rPr>
+                <w:sz w:val="17"/>
+                <w:szCs w:val="17"/>
+              </w:rPr>
+              <w:t xml:space="preserve">Logo blanco de EstudioSimple en la esquina inferior derecha, tamaño del video de referencia.</w:t>
+            </w:r>
+          </w:p>
         </w:tc>
         <w:tc>
           <w:tcPr>
@@ -1777,6 +1821,28 @@
               <w:t xml:space="preserve">Símbolo de porcentaje estilizado con flechas indicando proporción</w:t>
             </w:r>
           </w:p>
+          <w:p>
+            <w:pPr>
+              <w:spacing w:after="20"/>
+            </w:pPr>
+            <w:r>
+              <w:rPr>
+                <w:b/>
+                <w:bCs/>
+                <w:color w:val="0F766E"/>
+                <w:sz w:val="17"/>
+                <w:szCs w:val="17"/>
+              </w:rPr>
+              <w:t xml:space="preserve">• Logotipo Oficial: </w:t>
+            </w:r>
+            <w:r>
+              <w:rPr>
+                <w:sz w:val="17"/>
+                <w:szCs w:val="17"/>
+              </w:rPr>
+              <w:t xml:space="preserve">Logo blanco de EstudioSimple en la esquina inferior derecha, tamaño del video de referencia.</w:t>
+            </w:r>
+          </w:p>
         </w:tc>
         <w:tc>
           <w:tcPr>
@@ -1952,6 +2018,28 @@
               <w:t xml:space="preserve">Cuadrícula regular de 100 unidades con una celda destacada en amarillo</w:t>
             </w:r>
           </w:p>
+          <w:p>
+            <w:pPr>
+              <w:spacing w:after="20"/>
+            </w:pPr>
+            <w:r>
+              <w:rPr>
+                <w:b/>
+                <w:bCs/>
+                <w:color w:val="0F766E"/>
+                <w:sz w:val="17"/>
+                <w:szCs w:val="17"/>
+              </w:rPr>
+              <w:t xml:space="preserve">• Logotipo Oficial: </w:t>
+            </w:r>
+            <w:r>
+              <w:rPr>
+                <w:sz w:val="17"/>
+                <w:szCs w:val="17"/>
+              </w:rPr>
+              <w:t xml:space="preserve">Logo blanco de EstudioSimple en la esquina inferior derecha, tamaño del video de referencia.</w:t>
+            </w:r>
+          </w:p>
         </w:tc>
         <w:tc>
           <w:tcPr>
@@ -2127,6 +2215,28 @@
               <w:t xml:space="preserve">Cuatro filas de diez celdas sombreadas en azul brillante</w:t>
             </w:r>
           </w:p>
+          <w:p>
+            <w:pPr>
+              <w:spacing w:after="20"/>
+            </w:pPr>
+            <w:r>
+              <w:rPr>
+                <w:b/>
+                <w:bCs/>
+                <w:color w:val="0F766E"/>
+                <w:sz w:val="17"/>
+                <w:szCs w:val="17"/>
+              </w:rPr>
+              <w:t xml:space="preserve">• Logotipo Oficial: </w:t>
+            </w:r>
+            <w:r>
+              <w:rPr>
+                <w:sz w:val="17"/>
+                <w:szCs w:val="17"/>
+              </w:rPr>
+              <w:t xml:space="preserve">Logo blanco de EstudioSimple en la esquina inferior derecha, tamaño del video de referencia.</w:t>
+            </w:r>
+          </w:p>
         </w:tc>
         <w:tc>
           <w:tcPr>
@@ -2302,6 +2412,28 @@
               <w:t xml:space="preserve">Fórmula limpia: 40 celdas de 100 = 40%</w:t>
             </w:r>
           </w:p>
+          <w:p>
+            <w:pPr>
+              <w:spacing w:after="20"/>
+            </w:pPr>
+            <w:r>
+              <w:rPr>
+                <w:b/>
+                <w:bCs/>
+                <w:color w:val="0F766E"/>
+                <w:sz w:val="17"/>
+                <w:szCs w:val="17"/>
+              </w:rPr>
+              <w:t xml:space="preserve">• Logotipo Oficial: </w:t>
+            </w:r>
+            <w:r>
+              <w:rPr>
+                <w:sz w:val="17"/>
+                <w:szCs w:val="17"/>
+              </w:rPr>
+              <w:t xml:space="preserve">Logo blanco de EstudioSimple en la esquina inferior derecha, tamaño del video de referencia.</w:t>
+            </w:r>
+          </w:p>
         </w:tc>
         <w:tc>
           <w:tcPr>
@@ -2475,6 +2607,28 @@
                 <w:szCs w:val="17"/>
               </w:rPr>
               <w:t xml:space="preserve">Íconos limpios conectando cuadrícula, fracción y porcentaje</w:t>
+            </w:r>
+          </w:p>
+          <w:p>
+            <w:pPr>
+              <w:spacing w:after="20"/>
+            </w:pPr>
+            <w:r>
+              <w:rPr>
+                <w:b/>
+                <w:bCs/>
+                <w:color w:val="0F766E"/>
+                <w:sz w:val="17"/>
+                <w:szCs w:val="17"/>
+              </w:rPr>
+              <w:t xml:space="preserve">• Logotipo Oficial: </w:t>
+            </w:r>
+            <w:r>
+              <w:rPr>
+                <w:sz w:val="17"/>
+                <w:szCs w:val="17"/>
+              </w:rPr>
+              <w:t xml:space="preserve">Logo blanco de EstudioSimple en la esquina inferior derecha, tamaño del video de referencia.</w:t>
             </w:r>
           </w:p>
         </w:tc>
@@ -3004,7 +3158,7 @@
                 <w:sz w:val="18"/>
                 <w:szCs w:val="18"/>
               </w:rPr>
-              <w:t xml:space="preserve">Comprender el porcentaje y su modelo pictórico en cuadrícula de 100</w:t>
+              <w:t xml:space="preserve">Comprender el porcentaje en cuadrículas de 100</w:t>
             </w:r>
           </w:p>
         </w:tc>
@@ -3032,7 +3186,7 @@
                 <w:sz w:val="17"/>
                 <w:szCs w:val="17"/>
               </w:rPr>
-              <w:t xml:space="preserve">Modern anime style 16:9 widescreen illustration. Two 13-year-old student explorers, a girl with braided hair and a boy in a teal jacket, , a girl with braided hair and a boy in a teal jacket, in a clean modern classroom looking at a digital blackboard. Generous negative space on the left. High contrast, bright flat colors.. Clear lighting, vibrant colors, clear negative space for layout. No text drawn by AI.</w:t>
+              <w:t xml:space="preserve">Modern anime style 16:9 widescreen illustration. Two 13-year-old student explorers, a girl with braided hair and a boy in a teal jacket, in a clean modern classroom looking at a digital blackboard. Generous negative space on the left. High contrast, bright flat colors. Clear lighting, vibrant colors. No text drawn by AI.</w:t>
             </w:r>
           </w:p>
           <w:p>
@@ -3055,6 +3209,28 @@
                 <w:szCs w:val="17"/>
               </w:rPr>
               <w:t xml:space="preserve">Cuadro limpio con el Objetivo de Aprendizaje MINEDUC OA 4</w:t>
+            </w:r>
+          </w:p>
+          <w:p>
+            <w:pPr>
+              <w:spacing w:after="20"/>
+            </w:pPr>
+            <w:r>
+              <w:rPr>
+                <w:b/>
+                <w:bCs/>
+                <w:color w:val="0F766E"/>
+                <w:sz w:val="17"/>
+                <w:szCs w:val="17"/>
+              </w:rPr>
+              <w:t xml:space="preserve">• Logotipo Oficial: </w:t>
+            </w:r>
+            <w:r>
+              <w:rPr>
+                <w:sz w:val="17"/>
+                <w:szCs w:val="17"/>
+              </w:rPr>
+              <w:t xml:space="preserve">Logo blanco de EstudioSimple en la esquina inferior derecha, tamaño del video de referencia.</w:t>
             </w:r>
           </w:p>
         </w:tc>
@@ -3232,6 +3408,28 @@
               <w:t xml:space="preserve">Diagrama conceptual: p% = p ÷ 100 (razón con consecuente 100)</w:t>
             </w:r>
           </w:p>
+          <w:p>
+            <w:pPr>
+              <w:spacing w:after="20"/>
+            </w:pPr>
+            <w:r>
+              <w:rPr>
+                <w:b/>
+                <w:bCs/>
+                <w:color w:val="0F766E"/>
+                <w:sz w:val="17"/>
+                <w:szCs w:val="17"/>
+              </w:rPr>
+              <w:t xml:space="preserve">• Logotipo Oficial: </w:t>
+            </w:r>
+            <w:r>
+              <w:rPr>
+                <w:sz w:val="17"/>
+                <w:szCs w:val="17"/>
+              </w:rPr>
+              <w:t xml:space="preserve">Logo blanco de EstudioSimple en la esquina inferior derecha, tamaño del video de referencia.</w:t>
+            </w:r>
+          </w:p>
         </w:tc>
         <w:tc>
           <w:tcPr>
@@ -3407,6 +3605,28 @@
               <w:t xml:space="preserve">Un solo cuadrito coloreado en amarillo con la etiqueta 1% destacada</w:t>
             </w:r>
           </w:p>
+          <w:p>
+            <w:pPr>
+              <w:spacing w:after="20"/>
+            </w:pPr>
+            <w:r>
+              <w:rPr>
+                <w:b/>
+                <w:bCs/>
+                <w:color w:val="0F766E"/>
+                <w:sz w:val="17"/>
+                <w:szCs w:val="17"/>
+              </w:rPr>
+              <w:t xml:space="preserve">• Logotipo Oficial: </w:t>
+            </w:r>
+            <w:r>
+              <w:rPr>
+                <w:sz w:val="17"/>
+                <w:szCs w:val="17"/>
+              </w:rPr>
+              <w:t xml:space="preserve">Logo blanco de EstudioSimple en la esquina inferior derecha, tamaño del video de referencia.</w:t>
+            </w:r>
+          </w:p>
         </w:tc>
         <w:tc>
           <w:tcPr>
@@ -3582,6 +3802,28 @@
               <w:t xml:space="preserve">Ejemplos claros: 15% se lee quince por ciento, 50% se lee cincuenta por ciento</w:t>
             </w:r>
           </w:p>
+          <w:p>
+            <w:pPr>
+              <w:spacing w:after="20"/>
+            </w:pPr>
+            <w:r>
+              <w:rPr>
+                <w:b/>
+                <w:bCs/>
+                <w:color w:val="0F766E"/>
+                <w:sz w:val="17"/>
+                <w:szCs w:val="17"/>
+              </w:rPr>
+              <w:t xml:space="preserve">• Logotipo Oficial: </w:t>
+            </w:r>
+            <w:r>
+              <w:rPr>
+                <w:sz w:val="17"/>
+                <w:szCs w:val="17"/>
+              </w:rPr>
+              <w:t xml:space="preserve">Logo blanco de EstudioSimple en la esquina inferior derecha, tamaño del video de referencia.</w:t>
+            </w:r>
+          </w:p>
         </w:tc>
         <w:tc>
           <w:tcPr>
@@ -3757,6 +3999,28 @@
               <w:t xml:space="preserve">Cuadrícula 10x10 totalmente iluminada con la igualdad 100/100 = 1 = 100%</w:t>
             </w:r>
           </w:p>
+          <w:p>
+            <w:pPr>
+              <w:spacing w:after="20"/>
+            </w:pPr>
+            <w:r>
+              <w:rPr>
+                <w:b/>
+                <w:bCs/>
+                <w:color w:val="0F766E"/>
+                <w:sz w:val="17"/>
+                <w:szCs w:val="17"/>
+              </w:rPr>
+              <w:t xml:space="preserve">• Logotipo Oficial: </w:t>
+            </w:r>
+            <w:r>
+              <w:rPr>
+                <w:sz w:val="17"/>
+                <w:szCs w:val="17"/>
+              </w:rPr>
+              <w:t xml:space="preserve">Logo blanco de EstudioSimple en la esquina inferior derecha, tamaño del video de referencia.</w:t>
+            </w:r>
+          </w:p>
         </w:tc>
         <w:tc>
           <w:tcPr>
@@ -3879,7 +4143,7 @@
                 <w:sz w:val="18"/>
                 <w:szCs w:val="18"/>
               </w:rPr>
-              <w:t xml:space="preserve">En una cuadrícula de 100 cuadritos iguales, se colorean exactamente 40 cuadritos</w:t>
+              <w:t xml:space="preserve">40 cuadritos de 100 representan el 40%</w:t>
             </w:r>
           </w:p>
         </w:tc>
@@ -3907,7 +4171,7 @@
                 <w:sz w:val="17"/>
                 <w:szCs w:val="17"/>
               </w:rPr>
-              <w:t xml:space="preserve">Modern anime style 16:9 widescreen illustration. Two 13-year-old student explorers, a girl with braided hair and a boy in a teal jacket, The 13-year-old girl and boy pointing together at a grid of 100 cells where exactly 40 blue cells are neatly colored. Perfect visual clarity, spacious negative space for practice step.. Clear lighting, vibrant colors, clear negative space for layout. No text drawn by AI.</w:t>
+              <w:t xml:space="preserve">Modern anime style 16:9 widescreen illustration. Two 13-year-old student explorers, a girl with braided hair and a boy in a teal jacket, pointing together at a grid of 100 cells where exactly 40 blue cells are neatly colored. Perfect visual clarity, spacious negative space on the left. Clear lighting, vibrant colors. No text drawn by AI.</w:t>
             </w:r>
           </w:p>
           <w:p>
@@ -3930,6 +4194,28 @@
                 <w:szCs w:val="17"/>
               </w:rPr>
               <w:t xml:space="preserve">Resolución canónica: La razón es 40/100, lo que por definición es 40%.</w:t>
+            </w:r>
+          </w:p>
+          <w:p>
+            <w:pPr>
+              <w:spacing w:after="20"/>
+            </w:pPr>
+            <w:r>
+              <w:rPr>
+                <w:b/>
+                <w:bCs/>
+                <w:color w:val="0F766E"/>
+                <w:sz w:val="17"/>
+                <w:szCs w:val="17"/>
+              </w:rPr>
+              <w:t xml:space="preserve">• Logotipo Oficial: </w:t>
+            </w:r>
+            <w:r>
+              <w:rPr>
+                <w:sz w:val="17"/>
+                <w:szCs w:val="17"/>
+              </w:rPr>
+              <w:t xml:space="preserve">Logo blanco de EstudioSimple en la esquina inferior derecha, tamaño del video de referencia.</w:t>
             </w:r>
           </w:p>
         </w:tc>
@@ -4105,6 +4391,28 @@
                 <w:szCs w:val="17"/>
               </w:rPr>
               <w:t xml:space="preserve">Regla de oro: p% = p ÷ 100. ¡A practicar!</w:t>
+            </w:r>
+          </w:p>
+          <w:p>
+            <w:pPr>
+              <w:spacing w:after="20"/>
+            </w:pPr>
+            <w:r>
+              <w:rPr>
+                <w:b/>
+                <w:bCs/>
+                <w:color w:val="0F766E"/>
+                <w:sz w:val="17"/>
+                <w:szCs w:val="17"/>
+              </w:rPr>
+              <w:t xml:space="preserve">• Logotipo Oficial: </w:t>
+            </w:r>
+            <w:r>
+              <w:rPr>
+                <w:sz w:val="17"/>
+                <w:szCs w:val="17"/>
+              </w:rPr>
+              <w:t xml:space="preserve">Logo blanco de EstudioSimple en la esquina inferior derecha, tamaño del video de referencia.</w:t>
             </w:r>
           </w:p>
         </w:tc>
@@ -5773,7 +6081,7 @@
                 <w:sz w:val="17"/>
                 <w:szCs w:val="17"/>
               </w:rPr>
-              <w:t xml:space="preserve">Modern anime style 16:9 widescreen illustration. Two 13-year-old student explorers, a girl with braided hair and a boy in a teal jacket, Two 13-year-old student explorers, a girl with braided hair and a boy in a teal jacket, in a bright home economics kitchen classroom looking at a recipe chalkboard. Clean kitchen counters, glass measuring cups, bright daylight, generous negative space on the left.. Clear lighting, vibrant colors, clear negative space for layout. No text drawn by AI.</w:t>
+              <w:t xml:space="preserve">Modern anime style 16:9 widescreen illustration. Two 13-year-old student explorers, a girl with braided hair and a boy in a teal jacket, in a bright home economics kitchen classroom looking at a recipe chalkboard. Clean kitchen counters, glass measuring cups, bright daylight, generous negative space on the left. Clear lighting, vibrant colors. No text drawn by AI.</w:t>
             </w:r>
           </w:p>
           <w:p>
@@ -5796,6 +6104,28 @@
                 <w:szCs w:val="17"/>
               </w:rPr>
               <w:t xml:space="preserve">Diagrama triangular conectando: Porcentaje, Fracción y Decimal</w:t>
+            </w:r>
+          </w:p>
+          <w:p>
+            <w:pPr>
+              <w:spacing w:after="20"/>
+            </w:pPr>
+            <w:r>
+              <w:rPr>
+                <w:b/>
+                <w:bCs/>
+                <w:color w:val="0F766E"/>
+                <w:sz w:val="17"/>
+                <w:szCs w:val="17"/>
+              </w:rPr>
+              <w:t xml:space="preserve">• Logotipo Oficial: </w:t>
+            </w:r>
+            <w:r>
+              <w:rPr>
+                <w:sz w:val="17"/>
+                <w:szCs w:val="17"/>
+              </w:rPr>
+              <w:t xml:space="preserve">Logo blanco de EstudioSimple en la esquina inferior derecha, tamaño del video de referencia.</w:t>
             </w:r>
           </w:p>
         </w:tc>
@@ -5973,6 +6303,28 @@
               <w:t xml:space="preserve">Taza medidora dividida en cuatro cuartos con 1/4 resaltado</w:t>
             </w:r>
           </w:p>
+          <w:p>
+            <w:pPr>
+              <w:spacing w:after="20"/>
+            </w:pPr>
+            <w:r>
+              <w:rPr>
+                <w:b/>
+                <w:bCs/>
+                <w:color w:val="0F766E"/>
+                <w:sz w:val="17"/>
+                <w:szCs w:val="17"/>
+              </w:rPr>
+              <w:t xml:space="preserve">• Logotipo Oficial: </w:t>
+            </w:r>
+            <w:r>
+              <w:rPr>
+                <w:sz w:val="17"/>
+                <w:szCs w:val="17"/>
+              </w:rPr>
+              <w:t xml:space="preserve">Logo blanco de EstudioSimple en la esquina inferior derecha, tamaño del video de referencia.</w:t>
+            </w:r>
+          </w:p>
         </w:tc>
         <w:tc>
           <w:tcPr>
@@ -6123,7 +6475,7 @@
                 <w:sz w:val="17"/>
                 <w:szCs w:val="17"/>
               </w:rPr>
-              <w:t xml:space="preserve">Modern anime style 16:9 widescreen illustration. Two 13-year-old student explorers, a girl with braided hair and a boy in a teal jacket, The 13-year-old boy in a teal jacket pointing to the digital scale display showing decimal numbers. Inquisitive expression, clean scientific aesthetic, negative space.. Clear lighting, vibrant colors, clear negative space for layout. No text drawn by AI.</w:t>
+              <w:t xml:space="preserve">Modern anime style 16:9 widescreen illustration. Two 13-year-old student explorers, a girl with braided hair and a boy in a teal jacket, observing a digital kitchen scale on the counter. Inquisitive expression, clean scientific aesthetic, ample negative space on the left. Clear lighting, vibrant colors. No text drawn by AI.</w:t>
             </w:r>
           </w:p>
           <w:p>
@@ -6146,6 +6498,28 @@
                 <w:szCs w:val="17"/>
               </w:rPr>
               <w:t xml:space="preserve">Pantalla digital mostrando la conversión: 25 / 100 = 0,25</w:t>
+            </w:r>
+          </w:p>
+          <w:p>
+            <w:pPr>
+              <w:spacing w:after="20"/>
+            </w:pPr>
+            <w:r>
+              <w:rPr>
+                <w:b/>
+                <w:bCs/>
+                <w:color w:val="0F766E"/>
+                <w:sz w:val="17"/>
+                <w:szCs w:val="17"/>
+              </w:rPr>
+              <w:t xml:space="preserve">• Logotipo Oficial: </w:t>
+            </w:r>
+            <w:r>
+              <w:rPr>
+                <w:sz w:val="17"/>
+                <w:szCs w:val="17"/>
+              </w:rPr>
+              <w:t xml:space="preserve">Logo blanco de EstudioSimple en la esquina inferior derecha, tamaño del video de referencia.</w:t>
             </w:r>
           </w:p>
         </w:tc>
@@ -6270,7 +6644,7 @@
                 <w:sz w:val="18"/>
                 <w:szCs w:val="18"/>
               </w:rPr>
-              <w:t xml:space="preserve">La coma se desplaza dos lugares a la izquierda</w:t>
+              <w:t xml:space="preserve">Mover la coma dos lugares a la izquierda</w:t>
             </w:r>
           </w:p>
         </w:tc>
@@ -6298,7 +6672,7 @@
                 <w:sz w:val="17"/>
                 <w:szCs w:val="17"/>
               </w:rPr>
-              <w:t xml:space="preserve">Modern anime style 16:9 widescreen illustration. Two 13-year-old student explorers, a girl with braided hair and a boy in a teal jacket, calculating on a digital whiteboard, showing the decimal point shifting two places to the left. Sharp focus, clean graphics, negative space on the right.. Clear lighting, vibrant colors, clear negative space for layout. No text drawn by AI.</w:t>
+              <w:t xml:space="preserve">Modern anime style 16:9 widescreen illustration. Two 13-year-old student explorers, a girl with braided hair and a boy in a teal jacket, calculating on a digital whiteboard. Sharp focus, clean graphics, negative space on the right. Clear lighting, vibrant colors. No text drawn by AI.</w:t>
             </w:r>
           </w:p>
           <w:p>
@@ -6321,6 +6695,28 @@
                 <w:szCs w:val="17"/>
               </w:rPr>
               <w:t xml:space="preserve">Visualización animada del desplazamiento decimal: 25,0 -&gt; 0,25</w:t>
+            </w:r>
+          </w:p>
+          <w:p>
+            <w:pPr>
+              <w:spacing w:after="20"/>
+            </w:pPr>
+            <w:r>
+              <w:rPr>
+                <w:b/>
+                <w:bCs/>
+                <w:color w:val="0F766E"/>
+                <w:sz w:val="17"/>
+                <w:szCs w:val="17"/>
+              </w:rPr>
+              <w:t xml:space="preserve">• Logotipo Oficial: </w:t>
+            </w:r>
+            <w:r>
+              <w:rPr>
+                <w:sz w:val="17"/>
+                <w:szCs w:val="17"/>
+              </w:rPr>
+              <w:t xml:space="preserve">Logo blanco de EstudioSimple en la esquina inferior derecha, tamaño del video de referencia.</w:t>
             </w:r>
           </w:p>
         </w:tc>
@@ -6498,6 +6894,28 @@
               <w:t xml:space="preserve">Fórmula central destacada: 25% = 25/100 = 1/4 = 0,25</w:t>
             </w:r>
           </w:p>
+          <w:p>
+            <w:pPr>
+              <w:spacing w:after="20"/>
+            </w:pPr>
+            <w:r>
+              <w:rPr>
+                <w:b/>
+                <w:bCs/>
+                <w:color w:val="0F766E"/>
+                <w:sz w:val="17"/>
+                <w:szCs w:val="17"/>
+              </w:rPr>
+              <w:t xml:space="preserve">• Logotipo Oficial: </w:t>
+            </w:r>
+            <w:r>
+              <w:rPr>
+                <w:sz w:val="17"/>
+                <w:szCs w:val="17"/>
+              </w:rPr>
+              <w:t xml:space="preserve">Logo blanco de EstudioSimple en la esquina inferior derecha, tamaño del video de referencia.</w:t>
+            </w:r>
+          </w:p>
         </w:tc>
         <w:tc>
           <w:tcPr>
@@ -6673,6 +7091,28 @@
               <w:t xml:space="preserve">Ecuación matemática en construcción: 20% = 20/100 = ?/5 = 0,?</w:t>
             </w:r>
           </w:p>
+          <w:p>
+            <w:pPr>
+              <w:spacing w:after="20"/>
+            </w:pPr>
+            <w:r>
+              <w:rPr>
+                <w:b/>
+                <w:bCs/>
+                <w:color w:val="0F766E"/>
+                <w:sz w:val="17"/>
+                <w:szCs w:val="17"/>
+              </w:rPr>
+              <w:t xml:space="preserve">• Logotipo Oficial: </w:t>
+            </w:r>
+            <w:r>
+              <w:rPr>
+                <w:sz w:val="17"/>
+                <w:szCs w:val="17"/>
+              </w:rPr>
+              <w:t xml:space="preserve">Logo blanco de EstudioSimple en la esquina inferior derecha, tamaño del video de referencia.</w:t>
+            </w:r>
+          </w:p>
         </w:tc>
         <w:tc>
           <w:tcPr>
@@ -6846,6 +7286,28 @@
                 <w:szCs w:val="17"/>
               </w:rPr>
               <w:t xml:space="preserve">Iconos conectando la flecha bidireccional entre %, Fracción y Decimal</w:t>
+            </w:r>
+          </w:p>
+          <w:p>
+            <w:pPr>
+              <w:spacing w:after="20"/>
+            </w:pPr>
+            <w:r>
+              <w:rPr>
+                <w:b/>
+                <w:bCs/>
+                <w:color w:val="0F766E"/>
+                <w:sz w:val="17"/>
+                <w:szCs w:val="17"/>
+              </w:rPr>
+              <w:t xml:space="preserve">• Logotipo Oficial: </w:t>
+            </w:r>
+            <w:r>
+              <w:rPr>
+                <w:sz w:val="17"/>
+                <w:szCs w:val="17"/>
+              </w:rPr>
+              <w:t xml:space="preserve">Logo blanco de EstudioSimple en la esquina inferior derecha, tamaño del video de referencia.</w:t>
             </w:r>
           </w:p>
         </w:tc>
@@ -7375,7 +7837,7 @@
                 <w:sz w:val="18"/>
                 <w:szCs w:val="18"/>
               </w:rPr>
-              <w:t xml:space="preserve">Equivalencia triple: porcentaje, fracción simplificada y número decimal</w:t>
+              <w:t xml:space="preserve">Equivalencia triple: porcentaje, fracción y número decimal</w:t>
             </w:r>
           </w:p>
         </w:tc>
@@ -7403,7 +7865,7 @@
                 <w:sz w:val="17"/>
                 <w:szCs w:val="17"/>
               </w:rPr>
-              <w:t xml:space="preserve">Modern anime style 16:9 widescreen illustration. Two 13-year-old student explorers, a girl with braided hair and a boy in a teal jacket, , a girl with braided hair and a boy in a teal jacket, standing beside a digital display in a bright classroom. Spacious negative space on left. Clean vector style.. Clear lighting, vibrant colors, clear negative space for layout. No text drawn by AI.</w:t>
+              <w:t xml:space="preserve">Modern anime style 16:9 widescreen illustration. Two 13-year-old student explorers, a girl with braided hair and a boy in a teal jacket, standing beside a digital display in a bright classroom. Spacious negative space on the left. Clean vector style. Clear lighting, vibrant colors. No text drawn by AI.</w:t>
             </w:r>
           </w:p>
           <w:p>
@@ -7426,6 +7888,28 @@
                 <w:szCs w:val="17"/>
               </w:rPr>
               <w:t xml:space="preserve">Título de la lección y Objetivo de Aprendizaje oficial</w:t>
+            </w:r>
+          </w:p>
+          <w:p>
+            <w:pPr>
+              <w:spacing w:after="20"/>
+            </w:pPr>
+            <w:r>
+              <w:rPr>
+                <w:b/>
+                <w:bCs/>
+                <w:color w:val="0F766E"/>
+                <w:sz w:val="17"/>
+                <w:szCs w:val="17"/>
+              </w:rPr>
+              <w:t xml:space="preserve">• Logotipo Oficial: </w:t>
+            </w:r>
+            <w:r>
+              <w:rPr>
+                <w:sz w:val="17"/>
+                <w:szCs w:val="17"/>
+              </w:rPr>
+              <w:t xml:space="preserve">Logo blanco de EstudioSimple en la esquina inferior derecha, tamaño del video de referencia.</w:t>
             </w:r>
           </w:p>
         </w:tc>
@@ -7550,7 +8034,7 @@
                 <w:sz w:val="18"/>
                 <w:szCs w:val="18"/>
               </w:rPr>
-              <w:t xml:space="preserve">El porcentaje se convierte en el numerador y 100 en el denominador</w:t>
+              <w:t xml:space="preserve">Numerador es el porcentaje y denominador es 100</w:t>
             </w:r>
           </w:p>
         </w:tc>
@@ -7578,7 +8062,7 @@
                 <w:sz w:val="17"/>
                 <w:szCs w:val="17"/>
               </w:rPr>
-              <w:t xml:space="preserve">Modern anime style 16:9 widescreen illustration. Two 13-year-old student explorers, a girl with braided hair and a boy in a teal jacket, The 13-year-old girl writing a fraction on a chalkboard. Clean neat numbers, bright daytime light, negative space on the right.. Clear lighting, vibrant colors, clear negative space for layout. No text drawn by AI.</w:t>
+              <w:t xml:space="preserve">Modern anime style 16:9 widescreen illustration. Two 13-year-old student explorers, a girl with braided hair and a boy in a teal jacket, working with chalk at a large classroom blackboard. Bright daytime light, ample negative space on the left. Clear lighting, vibrant colors. No text drawn by AI.</w:t>
             </w:r>
           </w:p>
           <w:p>
@@ -7601,6 +8085,28 @@
                 <w:szCs w:val="17"/>
               </w:rPr>
               <w:t xml:space="preserve">Fórmula: p% = p / 100</w:t>
+            </w:r>
+          </w:p>
+          <w:p>
+            <w:pPr>
+              <w:spacing w:after="20"/>
+            </w:pPr>
+            <w:r>
+              <w:rPr>
+                <w:b/>
+                <w:bCs/>
+                <w:color w:val="0F766E"/>
+                <w:sz w:val="17"/>
+                <w:szCs w:val="17"/>
+              </w:rPr>
+              <w:t xml:space="preserve">• Logotipo Oficial: </w:t>
+            </w:r>
+            <w:r>
+              <w:rPr>
+                <w:sz w:val="17"/>
+                <w:szCs w:val="17"/>
+              </w:rPr>
+              <w:t xml:space="preserve">Logo blanco de EstudioSimple en la esquina inferior derecha, tamaño del video de referencia.</w:t>
             </w:r>
           </w:p>
         </w:tc>
@@ -7725,7 +8231,7 @@
                 <w:sz w:val="18"/>
                 <w:szCs w:val="18"/>
               </w:rPr>
-              <w:t xml:space="preserve">Dividir numerador y denominador por el máximo común divisor</w:t>
+              <w:t xml:space="preserve">Dividir por el máximo común divisor</w:t>
             </w:r>
           </w:p>
         </w:tc>
@@ -7753,7 +8259,7 @@
                 <w:sz w:val="17"/>
                 <w:szCs w:val="17"/>
               </w:rPr>
-              <w:t xml:space="preserve">Modern anime style 16:9 widescreen illustration. Two 13-year-old student explorers, a girl with braided hair and a boy in a teal jacket, The 13-year-old boy demonstrating step-by-step division by common factors on a notebook. High contrast, clear diagrams, negative space.. Clear lighting, vibrant colors, clear negative space for layout. No text drawn by AI.</w:t>
+              <w:t xml:space="preserve">Modern anime style 16:9 widescreen illustration. Two 13-year-old student explorers, a girl with braided hair and a boy in a teal jacket, demonstrating step-by-step division by common factors on a notebook. High contrast, clear diagrams, negative space.. Clear lighting, vibrant colors, clear negative space for layout. No text drawn by AI.</w:t>
             </w:r>
           </w:p>
           <w:p>
@@ -7776,6 +8282,28 @@
                 <w:szCs w:val="17"/>
               </w:rPr>
               <w:t xml:space="preserve">Ejemplo paso a paso: 50/100 -&gt; dividir por 50 -&gt; 1/2</w:t>
+            </w:r>
+          </w:p>
+          <w:p>
+            <w:pPr>
+              <w:spacing w:after="20"/>
+            </w:pPr>
+            <w:r>
+              <w:rPr>
+                <w:b/>
+                <w:bCs/>
+                <w:color w:val="0F766E"/>
+                <w:sz w:val="17"/>
+                <w:szCs w:val="17"/>
+              </w:rPr>
+              <w:t xml:space="preserve">• Logotipo Oficial: </w:t>
+            </w:r>
+            <w:r>
+              <w:rPr>
+                <w:sz w:val="17"/>
+                <w:szCs w:val="17"/>
+              </w:rPr>
+              <w:t xml:space="preserve">Logo blanco de EstudioSimple en la esquina inferior derecha, tamaño del video de referencia.</w:t>
             </w:r>
           </w:p>
         </w:tc>
@@ -7953,6 +8481,28 @@
               <w:t xml:space="preserve">Regla: p% = p ÷ 100 (ej. 75% = 75 ÷ 100 = 0,75; 8% = 8 ÷ 100 = 0,08)</w:t>
             </w:r>
           </w:p>
+          <w:p>
+            <w:pPr>
+              <w:spacing w:after="20"/>
+            </w:pPr>
+            <w:r>
+              <w:rPr>
+                <w:b/>
+                <w:bCs/>
+                <w:color w:val="0F766E"/>
+                <w:sz w:val="17"/>
+                <w:szCs w:val="17"/>
+              </w:rPr>
+              <w:t xml:space="preserve">• Logotipo Oficial: </w:t>
+            </w:r>
+            <w:r>
+              <w:rPr>
+                <w:sz w:val="17"/>
+                <w:szCs w:val="17"/>
+              </w:rPr>
+              <w:t xml:space="preserve">Logo blanco de EstudioSimple en la esquina inferior derecha, tamaño del video de referencia.</w:t>
+            </w:r>
+          </w:p>
         </w:tc>
         <w:tc>
           <w:tcPr>
@@ -8128,6 +8678,28 @@
               <w:t xml:space="preserve">Tabla: 50% = 1/2 = 0,5 | 25% = 1/4 = 0,25 | 75% = 3/4 = 0,75 | 10% = 1/10 = 0,1</w:t>
             </w:r>
           </w:p>
+          <w:p>
+            <w:pPr>
+              <w:spacing w:after="20"/>
+            </w:pPr>
+            <w:r>
+              <w:rPr>
+                <w:b/>
+                <w:bCs/>
+                <w:color w:val="0F766E"/>
+                <w:sz w:val="17"/>
+                <w:szCs w:val="17"/>
+              </w:rPr>
+              <w:t xml:space="preserve">• Logotipo Oficial: </w:t>
+            </w:r>
+            <w:r>
+              <w:rPr>
+                <w:sz w:val="17"/>
+                <w:szCs w:val="17"/>
+              </w:rPr>
+              <w:t xml:space="preserve">Logo blanco de EstudioSimple en la esquina inferior derecha, tamaño del video de referencia.</w:t>
+            </w:r>
+          </w:p>
         </w:tc>
         <w:tc>
           <w:tcPr>
@@ -8250,7 +8822,7 @@
                 <w:sz w:val="18"/>
                 <w:szCs w:val="18"/>
               </w:rPr>
-              <w:t xml:space="preserve">Queremos transformar el 20% en su expresión fraccionaria irreductible y en su nú</w:t>
+              <w:t xml:space="preserve">20% equivale a 1/5 y a 0,2</w:t>
             </w:r>
           </w:p>
         </w:tc>
@@ -8301,6 +8873,28 @@
                 <w:szCs w:val="17"/>
               </w:rPr>
               <w:t xml:space="preserve">Resolución canónica: 20% = 20/100 = 1/5 = 0,2.</w:t>
+            </w:r>
+          </w:p>
+          <w:p>
+            <w:pPr>
+              <w:spacing w:after="20"/>
+            </w:pPr>
+            <w:r>
+              <w:rPr>
+                <w:b/>
+                <w:bCs/>
+                <w:color w:val="0F766E"/>
+                <w:sz w:val="17"/>
+                <w:szCs w:val="17"/>
+              </w:rPr>
+              <w:t xml:space="preserve">• Logotipo Oficial: </w:t>
+            </w:r>
+            <w:r>
+              <w:rPr>
+                <w:sz w:val="17"/>
+                <w:szCs w:val="17"/>
+              </w:rPr>
+              <w:t xml:space="preserve">Logo blanco de EstudioSimple en la esquina inferior derecha, tamaño del video de referencia.</w:t>
             </w:r>
           </w:p>
         </w:tc>
@@ -8476,6 +9070,28 @@
                 <w:szCs w:val="17"/>
               </w:rPr>
               <w:t xml:space="preserve">Regla de oro: p% = p ÷ 100. ¡Ahora ponlo en práctica!</w:t>
+            </w:r>
+          </w:p>
+          <w:p>
+            <w:pPr>
+              <w:spacing w:after="20"/>
+            </w:pPr>
+            <w:r>
+              <w:rPr>
+                <w:b/>
+                <w:bCs/>
+                <w:color w:val="0F766E"/>
+                <w:sz w:val="17"/>
+                <w:szCs w:val="17"/>
+              </w:rPr>
+              <w:t xml:space="preserve">• Logotipo Oficial: </w:t>
+            </w:r>
+            <w:r>
+              <w:rPr>
+                <w:sz w:val="17"/>
+                <w:szCs w:val="17"/>
+              </w:rPr>
+              <w:t xml:space="preserve">Logo blanco de EstudioSimple en la esquina inferior derecha, tamaño del video de referencia.</w:t>
             </w:r>
           </w:p>
         </w:tc>
@@ -10129,7 +10745,7 @@
                 <w:sz w:val="17"/>
                 <w:szCs w:val="17"/>
               </w:rPr>
-              <w:t xml:space="preserve">Modern anime style 16:9 widescreen illustration. Two 13-year-old student explorers, a girl with braided hair and a boy in a teal jacket, , a girl with braided hair and a boy in a teal jacket, walking through a lively school book fair with colorful discount banners. High contrast, bright sunny afternoon, spacious negative space on the left.. Clear lighting, vibrant colors, clear negative space for layout. No text drawn by AI.</w:t>
+              <w:t xml:space="preserve">Modern anime style 16:9 widescreen illustration. Two 13-year-old student explorers, a girl with braided hair and a boy in a teal jacket, walking through a lively school book fair with colorful discount banners. High contrast, bright sunny afternoon, spacious negative space on the left. Clear lighting, vibrant colors. No text drawn by AI.</w:t>
             </w:r>
           </w:p>
           <w:p>
@@ -10152,6 +10768,28 @@
                 <w:szCs w:val="17"/>
               </w:rPr>
               <w:t xml:space="preserve">Banners limpios con descuentos destacados: 50%, 25%, 20% y 10%</w:t>
+            </w:r>
+          </w:p>
+          <w:p>
+            <w:pPr>
+              <w:spacing w:after="20"/>
+            </w:pPr>
+            <w:r>
+              <w:rPr>
+                <w:b/>
+                <w:bCs/>
+                <w:color w:val="0F766E"/>
+                <w:sz w:val="17"/>
+                <w:szCs w:val="17"/>
+              </w:rPr>
+              <w:t xml:space="preserve">• Logotipo Oficial: </w:t>
+            </w:r>
+            <w:r>
+              <w:rPr>
+                <w:sz w:val="17"/>
+                <w:szCs w:val="17"/>
+              </w:rPr>
+              <w:t xml:space="preserve">Logo blanco de EstudioSimple en la esquina inferior derecha, tamaño del video de referencia.</w:t>
             </w:r>
           </w:p>
         </w:tc>
@@ -10329,6 +10967,28 @@
               <w:t xml:space="preserve">Operación mental destacada: $8.000 : 2 = $4.000</w:t>
             </w:r>
           </w:p>
+          <w:p>
+            <w:pPr>
+              <w:spacing w:after="20"/>
+            </w:pPr>
+            <w:r>
+              <w:rPr>
+                <w:b/>
+                <w:bCs/>
+                <w:color w:val="0F766E"/>
+                <w:sz w:val="17"/>
+                <w:szCs w:val="17"/>
+              </w:rPr>
+              <w:t xml:space="preserve">• Logotipo Oficial: </w:t>
+            </w:r>
+            <w:r>
+              <w:rPr>
+                <w:sz w:val="17"/>
+                <w:szCs w:val="17"/>
+              </w:rPr>
+              <w:t xml:space="preserve">Logo blanco de EstudioSimple en la esquina inferior derecha, tamaño del video de referencia.</w:t>
+            </w:r>
+          </w:p>
         </w:tc>
         <w:tc>
           <w:tcPr>
@@ -10451,7 +11111,7 @@
                 <w:sz w:val="18"/>
                 <w:szCs w:val="18"/>
               </w:rPr>
-              <w:t xml:space="preserve">Un cuarto del total o la mitad de la mitad</w:t>
+              <w:t xml:space="preserve">Un cuarto o la mitad de la mitad</w:t>
             </w:r>
           </w:p>
         </w:tc>
@@ -10502,6 +11162,28 @@
                 <w:szCs w:val="17"/>
               </w:rPr>
               <w:t xml:space="preserve">Diagrama de cuatro partes iguales: 100% / 4 = 25%</w:t>
+            </w:r>
+          </w:p>
+          <w:p>
+            <w:pPr>
+              <w:spacing w:after="20"/>
+            </w:pPr>
+            <w:r>
+              <w:rPr>
+                <w:b/>
+                <w:bCs/>
+                <w:color w:val="0F766E"/>
+                <w:sz w:val="17"/>
+                <w:szCs w:val="17"/>
+              </w:rPr>
+              <w:t xml:space="preserve">• Logotipo Oficial: </w:t>
+            </w:r>
+            <w:r>
+              <w:rPr>
+                <w:sz w:val="17"/>
+                <w:szCs w:val="17"/>
+              </w:rPr>
+              <w:t xml:space="preserve">Logo blanco de EstudioSimple en la esquina inferior derecha, tamaño del video de referencia.</w:t>
             </w:r>
           </w:p>
         </w:tc>
@@ -10679,6 +11361,28 @@
               <w:t xml:space="preserve">Esquema de atajos rápidos: 10% -&gt; :10 | 20% -&gt; :5</w:t>
             </w:r>
           </w:p>
+          <w:p>
+            <w:pPr>
+              <w:spacing w:after="20"/>
+            </w:pPr>
+            <w:r>
+              <w:rPr>
+                <w:b/>
+                <w:bCs/>
+                <w:color w:val="0F766E"/>
+                <w:sz w:val="17"/>
+                <w:szCs w:val="17"/>
+              </w:rPr>
+              <w:t xml:space="preserve">• Logotipo Oficial: </w:t>
+            </w:r>
+            <w:r>
+              <w:rPr>
+                <w:sz w:val="17"/>
+                <w:szCs w:val="17"/>
+              </w:rPr>
+              <w:t xml:space="preserve">Logo blanco de EstudioSimple en la esquina inferior derecha, tamaño del video de referencia.</w:t>
+            </w:r>
+          </w:p>
         </w:tc>
         <w:tc>
           <w:tcPr>
@@ -10854,6 +11558,28 @@
               <w:t xml:space="preserve">Paso 1: Mitad de $80 -&gt; $40. Paso 2: Mitad de $40 -&gt; $20</w:t>
             </w:r>
           </w:p>
+          <w:p>
+            <w:pPr>
+              <w:spacing w:after="20"/>
+            </w:pPr>
+            <w:r>
+              <w:rPr>
+                <w:b/>
+                <w:bCs/>
+                <w:color w:val="0F766E"/>
+                <w:sz w:val="17"/>
+                <w:szCs w:val="17"/>
+              </w:rPr>
+              <w:t xml:space="preserve">• Logotipo Oficial: </w:t>
+            </w:r>
+            <w:r>
+              <w:rPr>
+                <w:sz w:val="17"/>
+                <w:szCs w:val="17"/>
+              </w:rPr>
+              <w:t xml:space="preserve">Logo blanco de EstudioSimple en la esquina inferior derecha, tamaño del video de referencia.</w:t>
+            </w:r>
+          </w:p>
         </w:tc>
         <w:tc>
           <w:tcPr>
@@ -11029,6 +11755,28 @@
               <w:t xml:space="preserve">Cálculo limpio: 150 : 5 = 30 páginas</w:t>
             </w:r>
           </w:p>
+          <w:p>
+            <w:pPr>
+              <w:spacing w:after="20"/>
+            </w:pPr>
+            <w:r>
+              <w:rPr>
+                <w:b/>
+                <w:bCs/>
+                <w:color w:val="0F766E"/>
+                <w:sz w:val="17"/>
+                <w:szCs w:val="17"/>
+              </w:rPr>
+              <w:t xml:space="preserve">• Logotipo Oficial: </w:t>
+            </w:r>
+            <w:r>
+              <w:rPr>
+                <w:sz w:val="17"/>
+                <w:szCs w:val="17"/>
+              </w:rPr>
+              <w:t xml:space="preserve">Logo blanco de EstudioSimple en la esquina inferior derecha, tamaño del video de referencia.</w:t>
+            </w:r>
+          </w:p>
         </w:tc>
         <w:tc>
           <w:tcPr>
@@ -11202,6 +11950,28 @@
                 <w:szCs w:val="17"/>
               </w:rPr>
               <w:t xml:space="preserve">Resumen visual de los 4 atajos: :2, :4, :5, :10</w:t>
+            </w:r>
+          </w:p>
+          <w:p>
+            <w:pPr>
+              <w:spacing w:after="20"/>
+            </w:pPr>
+            <w:r>
+              <w:rPr>
+                <w:b/>
+                <w:bCs/>
+                <w:color w:val="0F766E"/>
+                <w:sz w:val="17"/>
+                <w:szCs w:val="17"/>
+              </w:rPr>
+              <w:t xml:space="preserve">• Logotipo Oficial: </w:t>
+            </w:r>
+            <w:r>
+              <w:rPr>
+                <w:sz w:val="17"/>
+                <w:szCs w:val="17"/>
+              </w:rPr>
+              <w:t xml:space="preserve">Logo blanco de EstudioSimple en la esquina inferior derecha, tamaño del video de referencia.</w:t>
             </w:r>
           </w:p>
         </w:tc>
@@ -11731,7 +12501,7 @@
                 <w:sz w:val="18"/>
                 <w:szCs w:val="18"/>
               </w:rPr>
-              <w:t xml:space="preserve">Estrategias de cálculo mental usando división por fracciones canónicas</w:t>
+              <w:t xml:space="preserve">Cálculo mental mediante división por fracciones canónicas</w:t>
             </w:r>
           </w:p>
         </w:tc>
@@ -11759,7 +12529,7 @@
                 <w:sz w:val="17"/>
                 <w:szCs w:val="17"/>
               </w:rPr>
-              <w:t xml:space="preserve">Modern anime style 16:9 widescreen illustration. Two 13-year-old student explorers, a girl with braided hair and a boy in a teal jacket, , a girl with braided hair and a boy in a teal jacket, in front of a modern smartboard displaying mental math icons. Clean classroom setting, ample negative space on the left.. Clear lighting, vibrant colors, clear negative space for layout. No text drawn by AI.</w:t>
+              <w:t xml:space="preserve">Modern anime style 16:9 widescreen illustration. Two 13-year-old student explorers, a girl with braided hair and a boy in a teal jacket, in front of a modern smartboard displaying mental math icons. Clean classroom setting, ample negative space on the left. Clear lighting, vibrant colors. No text drawn by AI.</w:t>
             </w:r>
           </w:p>
           <w:p>
@@ -11782,6 +12552,28 @@
                 <w:szCs w:val="17"/>
               </w:rPr>
               <w:t xml:space="preserve">Título y estándar curricular del cálculo mental con porcentajes</w:t>
+            </w:r>
+          </w:p>
+          <w:p>
+            <w:pPr>
+              <w:spacing w:after="20"/>
+            </w:pPr>
+            <w:r>
+              <w:rPr>
+                <w:b/>
+                <w:bCs/>
+                <w:color w:val="0F766E"/>
+                <w:sz w:val="17"/>
+                <w:szCs w:val="17"/>
+              </w:rPr>
+              <w:t xml:space="preserve">• Logotipo Oficial: </w:t>
+            </w:r>
+            <w:r>
+              <w:rPr>
+                <w:sz w:val="17"/>
+                <w:szCs w:val="17"/>
+              </w:rPr>
+              <w:t xml:space="preserve">Logo blanco de EstudioSimple en la esquina inferior derecha, tamaño del video de referencia.</w:t>
             </w:r>
           </w:p>
         </w:tc>
@@ -11959,6 +12751,28 @@
               <w:t xml:space="preserve">Regla: 50% de N = N : 2 (ej. 50% de 600 = 300)</w:t>
             </w:r>
           </w:p>
+          <w:p>
+            <w:pPr>
+              <w:spacing w:after="20"/>
+            </w:pPr>
+            <w:r>
+              <w:rPr>
+                <w:b/>
+                <w:bCs/>
+                <w:color w:val="0F766E"/>
+                <w:sz w:val="17"/>
+                <w:szCs w:val="17"/>
+              </w:rPr>
+              <w:t xml:space="preserve">• Logotipo Oficial: </w:t>
+            </w:r>
+            <w:r>
+              <w:rPr>
+                <w:sz w:val="17"/>
+                <w:szCs w:val="17"/>
+              </w:rPr>
+              <w:t xml:space="preserve">Logo blanco de EstudioSimple en la esquina inferior derecha, tamaño del video de referencia.</w:t>
+            </w:r>
+          </w:p>
         </w:tc>
         <w:tc>
           <w:tcPr>
@@ -12081,7 +12895,7 @@
                 <w:sz w:val="18"/>
                 <w:szCs w:val="18"/>
               </w:rPr>
-              <w:t xml:space="preserve">25% = 1/4 del total | Cuarta parte (mitad de la mitad)</w:t>
+              <w:t xml:space="preserve">25% es dividir por 4: cuarta parte</w:t>
             </w:r>
           </w:p>
         </w:tc>
@@ -12132,6 +12946,28 @@
                 <w:szCs w:val="17"/>
               </w:rPr>
               <w:t xml:space="preserve">Regla: 25% de N = N : 4 (ej. 25% de 80 = 20)</w:t>
+            </w:r>
+          </w:p>
+          <w:p>
+            <w:pPr>
+              <w:spacing w:after="20"/>
+            </w:pPr>
+            <w:r>
+              <w:rPr>
+                <w:b/>
+                <w:bCs/>
+                <w:color w:val="0F766E"/>
+                <w:sz w:val="17"/>
+                <w:szCs w:val="17"/>
+              </w:rPr>
+              <w:t xml:space="preserve">• Logotipo Oficial: </w:t>
+            </w:r>
+            <w:r>
+              <w:rPr>
+                <w:sz w:val="17"/>
+                <w:szCs w:val="17"/>
+              </w:rPr>
+              <w:t xml:space="preserve">Logo blanco de EstudioSimple en la esquina inferior derecha, tamaño del video de referencia.</w:t>
             </w:r>
           </w:p>
         </w:tc>
@@ -12309,6 +13145,28 @@
               <w:t xml:space="preserve">Regla: 20% de N = N : 5 (ej. 20% de 100 = 20)</w:t>
             </w:r>
           </w:p>
+          <w:p>
+            <w:pPr>
+              <w:spacing w:after="20"/>
+            </w:pPr>
+            <w:r>
+              <w:rPr>
+                <w:b/>
+                <w:bCs/>
+                <w:color w:val="0F766E"/>
+                <w:sz w:val="17"/>
+                <w:szCs w:val="17"/>
+              </w:rPr>
+              <w:t xml:space="preserve">• Logotipo Oficial: </w:t>
+            </w:r>
+            <w:r>
+              <w:rPr>
+                <w:sz w:val="17"/>
+                <w:szCs w:val="17"/>
+              </w:rPr>
+              <w:t xml:space="preserve">Logo blanco de EstudioSimple en la esquina inferior derecha, tamaño del video de referencia.</w:t>
+            </w:r>
+          </w:p>
         </w:tc>
         <w:tc>
           <w:tcPr>
@@ -12431,7 +13289,7 @@
                 <w:sz w:val="18"/>
                 <w:szCs w:val="18"/>
               </w:rPr>
-              <w:t xml:space="preserve">10% = 1/10 | Quitar un cero o desplazar la coma un lugar</w:t>
+              <w:t xml:space="preserve">10% es dividir por 10: décima parte</w:t>
             </w:r>
           </w:p>
         </w:tc>
@@ -12482,6 +13340,28 @@
                 <w:szCs w:val="17"/>
               </w:rPr>
               <w:t xml:space="preserve">Regla: 10% de N = N : 10 (ej. 10% de 340 = 34 | 10% de 85 = 8,5)</w:t>
+            </w:r>
+          </w:p>
+          <w:p>
+            <w:pPr>
+              <w:spacing w:after="20"/>
+            </w:pPr>
+            <w:r>
+              <w:rPr>
+                <w:b/>
+                <w:bCs/>
+                <w:color w:val="0F766E"/>
+                <w:sz w:val="17"/>
+                <w:szCs w:val="17"/>
+              </w:rPr>
+              <w:t xml:space="preserve">• Logotipo Oficial: </w:t>
+            </w:r>
+            <w:r>
+              <w:rPr>
+                <w:sz w:val="17"/>
+                <w:szCs w:val="17"/>
+              </w:rPr>
+              <w:t xml:space="preserve">Logo blanco de EstudioSimple en la esquina inferior derecha, tamaño del video de referencia.</w:t>
             </w:r>
           </w:p>
         </w:tc>
@@ -12606,7 +13486,7 @@
                 <w:sz w:val="18"/>
                 <w:szCs w:val="18"/>
               </w:rPr>
-              <w:t xml:space="preserve">Se requiere calcular mentalmente el 20% de 150 utilizando la división directa po</w:t>
+              <w:t xml:space="preserve">20% de 150: 150 : 5 = 30</w:t>
             </w:r>
           </w:p>
         </w:tc>
@@ -12634,7 +13514,7 @@
                 <w:sz w:val="17"/>
                 <w:szCs w:val="17"/>
               </w:rPr>
-              <w:t xml:space="preserve">Modern anime style 16:9 widescreen illustration. Two 13-year-old student explorers, a girl with braided hair and a boy in a teal jacket, solving the problem 20% of 150 on the tablet together. Clean and bright, spacious negative space on the right.. Clear lighting, vibrant colors, clear negative space for layout. No text drawn by AI.</w:t>
+              <w:t xml:space="preserve">Modern anime style 16:9 widescreen illustration. Two 13-year-old student explorers, a girl with braided hair and a boy in a teal jacket, solving a mental math calculation on a tablet together. Clean and bright, spacious negative space on the right. Clear lighting, vibrant colors, clear negative space for layout. No text drawn by AI.</w:t>
             </w:r>
           </w:p>
           <w:p>
@@ -12657,6 +13537,28 @@
                 <w:szCs w:val="17"/>
               </w:rPr>
               <w:t xml:space="preserve">Resolución canónica: 150 : 5 = 30.</w:t>
+            </w:r>
+          </w:p>
+          <w:p>
+            <w:pPr>
+              <w:spacing w:after="20"/>
+            </w:pPr>
+            <w:r>
+              <w:rPr>
+                <w:b/>
+                <w:bCs/>
+                <w:color w:val="0F766E"/>
+                <w:sz w:val="17"/>
+                <w:szCs w:val="17"/>
+              </w:rPr>
+              <w:t xml:space="preserve">• Logotipo Oficial: </w:t>
+            </w:r>
+            <w:r>
+              <w:rPr>
+                <w:sz w:val="17"/>
+                <w:szCs w:val="17"/>
+              </w:rPr>
+              <w:t xml:space="preserve">Logo blanco de EstudioSimple en la esquina inferior derecha, tamaño del video de referencia.</w:t>
             </w:r>
           </w:p>
         </w:tc>
@@ -12781,7 +13683,7 @@
                 <w:sz w:val="18"/>
                 <w:szCs w:val="18"/>
               </w:rPr>
-              <w:t xml:space="preserve">Asocia el porcentaje con su división: 50%(:2), 25%(:4), 20%(:5), 10%(:10)</w:t>
+              <w:t xml:space="preserve">Atajos: 50%(:2), 25%(:4), 20%(:5) y 10%(:10)</w:t>
             </w:r>
           </w:p>
         </w:tc>
@@ -12832,6 +13734,28 @@
                 <w:szCs w:val="17"/>
               </w:rPr>
               <w:t xml:space="preserve">Cuadro resumen final con los 4 atajos maestros. ¡A practicar!</w:t>
+            </w:r>
+          </w:p>
+          <w:p>
+            <w:pPr>
+              <w:spacing w:after="20"/>
+            </w:pPr>
+            <w:r>
+              <w:rPr>
+                <w:b/>
+                <w:bCs/>
+                <w:color w:val="0F766E"/>
+                <w:sz w:val="17"/>
+                <w:szCs w:val="17"/>
+              </w:rPr>
+              <w:t xml:space="preserve">• Logotipo Oficial: </w:t>
+            </w:r>
+            <w:r>
+              <w:rPr>
+                <w:sz w:val="17"/>
+                <w:szCs w:val="17"/>
+              </w:rPr>
+              <w:t xml:space="preserve">Logo blanco de EstudioSimple en la esquina inferior derecha, tamaño del video de referencia.</w:t>
             </w:r>
           </w:p>
         </w:tc>
@@ -12852,7 +13776,7 @@
                 <w:sz w:val="18"/>
                 <w:szCs w:val="18"/>
               </w:rPr>
-              <w:t xml:space="preserve">Regla de oro: Asocia el porcentaje con su división: 50%(:2), 25%(:4), 20%(:5), 10%(:10). Ahora pon a prueba lo aprendido resolviendo los casos de práctica en la plataforma interactiva.</w:t>
+              <w:t xml:space="preserve">Regla de oro: Asocia el porcentaje con su división: cincuenta por ciento entre dos, veinticinco entre cuatro, veinte entre cinco y diez entre diez. Ahora pon a prueba lo aprendido resolviendo los casos de práctica en la plataforma interactiva.</w:t>
             </w:r>
           </w:p>
         </w:tc>
@@ -14500,7 +15424,7 @@
                 <w:sz w:val="17"/>
                 <w:szCs w:val="17"/>
               </w:rPr>
-              <w:t xml:space="preserve">Modern anime style 16:9 widescreen illustration. Two 13-year-old student explorers, a girl with braided hair and a boy in a teal jacket, , a girl with braided hair and a boy in a teal jacket, standing next to a large transparent rainwater tank with 500 liters marked on it in a green school garden. High contrast, sunny day, spacious negative space on the left.. Clear lighting, vibrant colors, clear negative space for layout. No text drawn by AI.</w:t>
+              <w:t xml:space="preserve">Modern anime style 16:9 widescreen illustration. Two 13-year-old student explorers, a girl with braided hair and a boy in a teal jacket, standing next to a large transparent rainwater tank with 500 liters marked on it in a green school garden. High contrast, sunny day, spacious negative space on the left. Clear lighting, vibrant colors. No text drawn by AI.</w:t>
             </w:r>
           </w:p>
           <w:p>
@@ -14523,6 +15447,28 @@
                 <w:szCs w:val="17"/>
               </w:rPr>
               <w:t xml:space="preserve">Tanque graduado mostrando 500 L de agua con marcador en 18%</w:t>
+            </w:r>
+          </w:p>
+          <w:p>
+            <w:pPr>
+              <w:spacing w:after="20"/>
+            </w:pPr>
+            <w:r>
+              <w:rPr>
+                <w:b/>
+                <w:bCs/>
+                <w:color w:val="0F766E"/>
+                <w:sz w:val="17"/>
+                <w:szCs w:val="17"/>
+              </w:rPr>
+              <w:t xml:space="preserve">• Logotipo Oficial: </w:t>
+            </w:r>
+            <w:r>
+              <w:rPr>
+                <w:sz w:val="17"/>
+                <w:szCs w:val="17"/>
+              </w:rPr>
+              <w:t xml:space="preserve">Logo blanco de EstudioSimple en la esquina inferior derecha, tamaño del video de referencia.</w:t>
             </w:r>
           </w:p>
         </w:tc>
@@ -14647,7 +15593,7 @@
                 <w:sz w:val="18"/>
                 <w:szCs w:val="18"/>
               </w:rPr>
-              <w:t xml:space="preserve">18% no es 50%, ni 25%, ni 20%, ni 10%</w:t>
+              <w:t xml:space="preserve">Porcentajes generales requieren un algoritmo universal</w:t>
             </w:r>
           </w:p>
         </w:tc>
@@ -14698,6 +15644,28 @@
                 <w:szCs w:val="17"/>
               </w:rPr>
               <w:t xml:space="preserve">Signo de interrogación sobre el número 18% junto a los atajos conocidos</w:t>
+            </w:r>
+          </w:p>
+          <w:p>
+            <w:pPr>
+              <w:spacing w:after="20"/>
+            </w:pPr>
+            <w:r>
+              <w:rPr>
+                <w:b/>
+                <w:bCs/>
+                <w:color w:val="0F766E"/>
+                <w:sz w:val="17"/>
+                <w:szCs w:val="17"/>
+              </w:rPr>
+              <w:t xml:space="preserve">• Logotipo Oficial: </w:t>
+            </w:r>
+            <w:r>
+              <w:rPr>
+                <w:sz w:val="17"/>
+                <w:szCs w:val="17"/>
+              </w:rPr>
+              <w:t xml:space="preserve">Logo blanco de EstudioSimple en la esquina inferior derecha, tamaño del video de referencia.</w:t>
             </w:r>
           </w:p>
         </w:tc>
@@ -14875,6 +15843,28 @@
               <w:t xml:space="preserve">Operación en pantalla: 500 x 0,18 = 90 litros</w:t>
             </w:r>
           </w:p>
+          <w:p>
+            <w:pPr>
+              <w:spacing w:after="20"/>
+            </w:pPr>
+            <w:r>
+              <w:rPr>
+                <w:b/>
+                <w:bCs/>
+                <w:color w:val="0F766E"/>
+                <w:sz w:val="17"/>
+                <w:szCs w:val="17"/>
+              </w:rPr>
+              <w:t xml:space="preserve">• Logotipo Oficial: </w:t>
+            </w:r>
+            <w:r>
+              <w:rPr>
+                <w:sz w:val="17"/>
+                <w:szCs w:val="17"/>
+              </w:rPr>
+              <w:t xml:space="preserve">Logo blanco de EstudioSimple en la esquina inferior derecha, tamaño del video de referencia.</w:t>
+            </w:r>
+          </w:p>
         </w:tc>
         <w:tc>
           <w:tcPr>
@@ -15050,6 +16040,28 @@
               <w:t xml:space="preserve">Ecuación de proporción: (18 x 500) / 100 = 9.000 / 100 = 90 litros</w:t>
             </w:r>
           </w:p>
+          <w:p>
+            <w:pPr>
+              <w:spacing w:after="20"/>
+            </w:pPr>
+            <w:r>
+              <w:rPr>
+                <w:b/>
+                <w:bCs/>
+                <w:color w:val="0F766E"/>
+                <w:sz w:val="17"/>
+                <w:szCs w:val="17"/>
+              </w:rPr>
+              <w:t xml:space="preserve">• Logotipo Oficial: </w:t>
+            </w:r>
+            <w:r>
+              <w:rPr>
+                <w:sz w:val="17"/>
+                <w:szCs w:val="17"/>
+              </w:rPr>
+              <w:t xml:space="preserve">Logo blanco de EstudioSimple en la esquina inferior derecha, tamaño del video de referencia.</w:t>
+            </w:r>
+          </w:p>
         </w:tc>
         <w:tc>
           <w:tcPr>
@@ -15172,7 +16184,7 @@
                 <w:sz w:val="18"/>
                 <w:szCs w:val="18"/>
               </w:rPr>
-              <w:t xml:space="preserve">500 x 0,18 = (18 x 500) / 100 = 90</w:t>
+              <w:t xml:space="preserve">Ambos procedimientos obtienen el mismo resultado: 90</w:t>
             </w:r>
           </w:p>
         </w:tc>
@@ -15223,6 +16235,28 @@
                 <w:szCs w:val="17"/>
               </w:rPr>
               <w:t xml:space="preserve">Balanza matemática mostrando la equivalencia perfecta de ambos métodos</w:t>
+            </w:r>
+          </w:p>
+          <w:p>
+            <w:pPr>
+              <w:spacing w:after="20"/>
+            </w:pPr>
+            <w:r>
+              <w:rPr>
+                <w:b/>
+                <w:bCs/>
+                <w:color w:val="0F766E"/>
+                <w:sz w:val="17"/>
+                <w:szCs w:val="17"/>
+              </w:rPr>
+              <w:t xml:space="preserve">• Logotipo Oficial: </w:t>
+            </w:r>
+            <w:r>
+              <w:rPr>
+                <w:sz w:val="17"/>
+                <w:szCs w:val="17"/>
+              </w:rPr>
+              <w:t xml:space="preserve">Logo blanco de EstudioSimple en la esquina inferior derecha, tamaño del video de referencia.</w:t>
             </w:r>
           </w:p>
         </w:tc>
@@ -15400,6 +16434,28 @@
               <w:t xml:space="preserve">Cálculo limpio: 40 x 0,35 = 14 estudiantes</w:t>
             </w:r>
           </w:p>
+          <w:p>
+            <w:pPr>
+              <w:spacing w:after="20"/>
+            </w:pPr>
+            <w:r>
+              <w:rPr>
+                <w:b/>
+                <w:bCs/>
+                <w:color w:val="0F766E"/>
+                <w:sz w:val="17"/>
+                <w:szCs w:val="17"/>
+              </w:rPr>
+              <w:t xml:space="preserve">• Logotipo Oficial: </w:t>
+            </w:r>
+            <w:r>
+              <w:rPr>
+                <w:sz w:val="17"/>
+                <w:szCs w:val="17"/>
+              </w:rPr>
+              <w:t xml:space="preserve">Logo blanco de EstudioSimple en la esquina inferior derecha, tamaño del video de referencia.</w:t>
+            </w:r>
+          </w:p>
         </w:tc>
         <w:tc>
           <w:tcPr>
@@ -15573,6 +16629,28 @@
                 <w:szCs w:val="17"/>
               </w:rPr>
               <w:t xml:space="preserve">Iconos conectando la fórmula decimal y la fórmula fraccionaria</w:t>
+            </w:r>
+          </w:p>
+          <w:p>
+            <w:pPr>
+              <w:spacing w:after="20"/>
+            </w:pPr>
+            <w:r>
+              <w:rPr>
+                <w:b/>
+                <w:bCs/>
+                <w:color w:val="0F766E"/>
+                <w:sz w:val="17"/>
+                <w:szCs w:val="17"/>
+              </w:rPr>
+              <w:t xml:space="preserve">• Logotipo Oficial: </w:t>
+            </w:r>
+            <w:r>
+              <w:rPr>
+                <w:sz w:val="17"/>
+                <w:szCs w:val="17"/>
+              </w:rPr>
+              <w:t xml:space="preserve">Logo blanco de EstudioSimple en la esquina inferior derecha, tamaño del video de referencia.</w:t>
             </w:r>
           </w:p>
         </w:tc>
@@ -16130,7 +17208,7 @@
                 <w:sz w:val="17"/>
                 <w:szCs w:val="17"/>
               </w:rPr>
-              <w:t xml:space="preserve">Modern anime style 16:9 widescreen illustration. Two 13-year-old student explorers, a girl with braided hair and a boy in a teal jacket, , a girl with braided hair and a boy in a teal jacket, looking at a math display showing calculation formulas. Clean modern classroom, ample negative space on the left.. Clear lighting, vibrant colors, clear negative space for layout. No text drawn by AI.</w:t>
+              <w:t xml:space="preserve">Modern anime style 16:9 widescreen illustration. Two 13-year-old student explorers, a girl with braided hair and a boy in a teal jacket, looking at a math display showing calculation formulas. Clean modern classroom, ample negative space on the left. Clear lighting, vibrant colors. No text drawn by AI.</w:t>
             </w:r>
           </w:p>
           <w:p>
@@ -16153,6 +17231,28 @@
                 <w:szCs w:val="17"/>
               </w:rPr>
               <w:t xml:space="preserve">Título de la lección y Objetivo de Aprendizaje oficial</w:t>
+            </w:r>
+          </w:p>
+          <w:p>
+            <w:pPr>
+              <w:spacing w:after="20"/>
+            </w:pPr>
+            <w:r>
+              <w:rPr>
+                <w:b/>
+                <w:bCs/>
+                <w:color w:val="0F766E"/>
+                <w:sz w:val="17"/>
+                <w:szCs w:val="17"/>
+              </w:rPr>
+              <w:t xml:space="preserve">• Logotipo Oficial: </w:t>
+            </w:r>
+            <w:r>
+              <w:rPr>
+                <w:sz w:val="17"/>
+                <w:szCs w:val="17"/>
+              </w:rPr>
+              <w:t xml:space="preserve">Logo blanco de EstudioSimple en la esquina inferior derecha, tamaño del video de referencia.</w:t>
             </w:r>
           </w:p>
         </w:tc>
@@ -16330,6 +17430,28 @@
               <w:t xml:space="preserve">Fórmula: Valor = Total x Decimal (ej. 35% de 40 = 40 x 0,35 = 14)</w:t>
             </w:r>
           </w:p>
+          <w:p>
+            <w:pPr>
+              <w:spacing w:after="20"/>
+            </w:pPr>
+            <w:r>
+              <w:rPr>
+                <w:b/>
+                <w:bCs/>
+                <w:color w:val="0F766E"/>
+                <w:sz w:val="17"/>
+                <w:szCs w:val="17"/>
+              </w:rPr>
+              <w:t xml:space="preserve">• Logotipo Oficial: </w:t>
+            </w:r>
+            <w:r>
+              <w:rPr>
+                <w:sz w:val="17"/>
+                <w:szCs w:val="17"/>
+              </w:rPr>
+              <w:t xml:space="preserve">Logo blanco de EstudioSimple en la esquina inferior derecha, tamaño del video de referencia.</w:t>
+            </w:r>
+          </w:p>
         </w:tc>
         <w:tc>
           <w:tcPr>
@@ -16505,6 +17627,28 @@
               <w:t xml:space="preserve">Ejemplo de advertencia: 8% de 250 = 250 x 0,08 = 20</w:t>
             </w:r>
           </w:p>
+          <w:p>
+            <w:pPr>
+              <w:spacing w:after="20"/>
+            </w:pPr>
+            <w:r>
+              <w:rPr>
+                <w:b/>
+                <w:bCs/>
+                <w:color w:val="0F766E"/>
+                <w:sz w:val="17"/>
+                <w:szCs w:val="17"/>
+              </w:rPr>
+              <w:t xml:space="preserve">• Logotipo Oficial: </w:t>
+            </w:r>
+            <w:r>
+              <w:rPr>
+                <w:sz w:val="17"/>
+                <w:szCs w:val="17"/>
+              </w:rPr>
+              <w:t xml:space="preserve">Logo blanco de EstudioSimple en la esquina inferior derecha, tamaño del video de referencia.</w:t>
+            </w:r>
+          </w:p>
         </w:tc>
         <w:tc>
           <w:tcPr>
@@ -16680,6 +17824,28 @@
               <w:t xml:space="preserve">Fórmula cruzada: Parte = (Porcentaje x Total) / 100</w:t>
             </w:r>
           </w:p>
+          <w:p>
+            <w:pPr>
+              <w:spacing w:after="20"/>
+            </w:pPr>
+            <w:r>
+              <w:rPr>
+                <w:b/>
+                <w:bCs/>
+                <w:color w:val="0F766E"/>
+                <w:sz w:val="17"/>
+                <w:szCs w:val="17"/>
+              </w:rPr>
+              <w:t xml:space="preserve">• Logotipo Oficial: </w:t>
+            </w:r>
+            <w:r>
+              <w:rPr>
+                <w:sz w:val="17"/>
+                <w:szCs w:val="17"/>
+              </w:rPr>
+              <w:t xml:space="preserve">Logo blanco de EstudioSimple en la esquina inferior derecha, tamaño del video de referencia.</w:t>
+            </w:r>
+          </w:p>
         </w:tc>
         <w:tc>
           <w:tcPr>
@@ -16802,7 +17968,7 @@
                 <w:sz w:val="18"/>
                 <w:szCs w:val="18"/>
               </w:rPr>
-              <w:t xml:space="preserve">(18 x 500) / 100 = 18 x 5 = 90</w:t>
+              <w:t xml:space="preserve">Simplificar ceros facilita el cálculo final: 90</w:t>
             </w:r>
           </w:p>
         </w:tc>
@@ -16830,7 +17996,7 @@
                 <w:sz w:val="17"/>
                 <w:szCs w:val="17"/>
               </w:rPr>
-              <w:t xml:space="preserve">Modern anime style 16:9 widescreen illustration. Two 13-year-old student explorers, a girl with braided hair and a boy in a teal jacket, Both students simplifying numbers with slashes before multiplying. High clarity, modern anime, negative space.. Clear lighting, vibrant colors, clear negative space for layout. No text drawn by AI.</w:t>
+              <w:t xml:space="preserve">Modern anime style 16:9 widescreen illustration. Two 13-year-old student explorers, a girl with braided hair and a boy in a teal jacket, working together with pencil and notebook at a study table. High clarity, modern anime aesthetic, ample negative space on the left. Clear lighting, vibrant colors. No text drawn by AI.</w:t>
             </w:r>
           </w:p>
           <w:p>
@@ -16853,6 +18019,28 @@
                 <w:szCs w:val="17"/>
               </w:rPr>
               <w:t xml:space="preserve">Técnica de cancelación de ceros: 500 / 100 se convierte directamente en 5</w:t>
+            </w:r>
+          </w:p>
+          <w:p>
+            <w:pPr>
+              <w:spacing w:after="20"/>
+            </w:pPr>
+            <w:r>
+              <w:rPr>
+                <w:b/>
+                <w:bCs/>
+                <w:color w:val="0F766E"/>
+                <w:sz w:val="17"/>
+                <w:szCs w:val="17"/>
+              </w:rPr>
+              <w:t xml:space="preserve">• Logotipo Oficial: </w:t>
+            </w:r>
+            <w:r>
+              <w:rPr>
+                <w:sz w:val="17"/>
+                <w:szCs w:val="17"/>
+              </w:rPr>
+              <w:t xml:space="preserve">Logo blanco de EstudioSimple en la esquina inferior derecha, tamaño del video de referencia.</w:t>
             </w:r>
           </w:p>
         </w:tc>
@@ -16977,7 +18165,7 @@
                 <w:sz w:val="18"/>
                 <w:szCs w:val="18"/>
               </w:rPr>
-              <w:t xml:space="preserve">Se requiere calcular el 18% de 500 utilizando cualquiera de los dos métodos apre</w:t>
+              <w:t xml:space="preserve">El 18% de 500 equivale a 90</w:t>
             </w:r>
           </w:p>
         </w:tc>
@@ -17005,7 +18193,7 @@
                 <w:sz w:val="17"/>
                 <w:szCs w:val="17"/>
               </w:rPr>
-              <w:t xml:space="preserve">Modern anime style 16:9 widescreen illustration. Two 13-year-old student explorers, a girl with braided hair and a boy in a teal jacket, solving 18% of 500 on an interactive tablet display. Clear numbers, spacious negative space on the right.. Clear lighting, vibrant colors, clear negative space for layout. No text drawn by AI.</w:t>
+              <w:t xml:space="preserve">Modern anime style 16:9 widescreen illustration. Two 13-year-old student explorers, a girl with braided hair and a boy in a teal jacket, studying and solving the case together on an interactive tablet display. Spacious negative space on the left, clear lighting. No text drawn by AI.</w:t>
             </w:r>
           </w:p>
           <w:p>
@@ -17028,6 +18216,28 @@
                 <w:szCs w:val="17"/>
               </w:rPr>
               <w:t xml:space="preserve">Resolución canónica: 500 x 0,18 = 90.</w:t>
+            </w:r>
+          </w:p>
+          <w:p>
+            <w:pPr>
+              <w:spacing w:after="20"/>
+            </w:pPr>
+            <w:r>
+              <w:rPr>
+                <w:b/>
+                <w:bCs/>
+                <w:color w:val="0F766E"/>
+                <w:sz w:val="17"/>
+                <w:szCs w:val="17"/>
+              </w:rPr>
+              <w:t xml:space="preserve">• Logotipo Oficial: </w:t>
+            </w:r>
+            <w:r>
+              <w:rPr>
+                <w:sz w:val="17"/>
+                <w:szCs w:val="17"/>
+              </w:rPr>
+              <w:t xml:space="preserve">Logo blanco de EstudioSimple en la esquina inferior derecha, tamaño del video de referencia.</w:t>
             </w:r>
           </w:p>
         </w:tc>
@@ -17203,6 +18413,28 @@
                 <w:szCs w:val="17"/>
               </w:rPr>
               <w:t xml:space="preserve">Resumen final de ambas fórmulas. ¡A practicar en la pantalla!</w:t>
+            </w:r>
+          </w:p>
+          <w:p>
+            <w:pPr>
+              <w:spacing w:after="20"/>
+            </w:pPr>
+            <w:r>
+              <w:rPr>
+                <w:b/>
+                <w:bCs/>
+                <w:color w:val="0F766E"/>
+                <w:sz w:val="17"/>
+                <w:szCs w:val="17"/>
+              </w:rPr>
+              <w:t xml:space="preserve">• Logotipo Oficial: </w:t>
+            </w:r>
+            <w:r>
+              <w:rPr>
+                <w:sz w:val="17"/>
+                <w:szCs w:val="17"/>
+              </w:rPr>
+              <w:t xml:space="preserve">Logo blanco de EstudioSimple en la esquina inferior derecha, tamaño del video de referencia.</w:t>
             </w:r>
           </w:p>
         </w:tc>
@@ -18856,7 +20088,7 @@
                 <w:sz w:val="17"/>
                 <w:szCs w:val="17"/>
               </w:rPr>
-              <w:t xml:space="preserve">Modern anime style 16:9 widescreen illustration. Two 13-year-old student explorers, a girl with braided hair and a boy in a teal jacket, Two 13-year-old student organizers, a girl with braided hair holding a calculator and clipboard, and a boy in a teal jacket arranging items on a wooden school market stall. Bright banners with percentage signs in the background, warm natural daylight, clean vector aesthetic, ample negative space on the left.. Clear lighting, vibrant colors, clear negative space for layout. No text drawn by AI.</w:t>
+              <w:t xml:space="preserve">Modern anime style 16:9 widescreen illustration. Two 13-year-old student explorers, a girl with braided hair holding a calculator and clipboard, and a boy in a teal jacket arranging items on a wooden school market stall. Bright banners in the background, warm natural daylight, clean vector aesthetic, ample negative space on the left. Clear lighting, vibrant colors. No text drawn by AI.</w:t>
             </w:r>
           </w:p>
           <w:p>
@@ -18879,6 +20111,28 @@
                 <w:szCs w:val="17"/>
               </w:rPr>
               <w:t xml:space="preserve">Carteles promocionales con símbolos de % y etiquetas de precios</w:t>
+            </w:r>
+          </w:p>
+          <w:p>
+            <w:pPr>
+              <w:spacing w:after="20"/>
+            </w:pPr>
+            <w:r>
+              <w:rPr>
+                <w:b/>
+                <w:bCs/>
+                <w:color w:val="0F766E"/>
+                <w:sz w:val="17"/>
+                <w:szCs w:val="17"/>
+              </w:rPr>
+              <w:t xml:space="preserve">• Logotipo Oficial: </w:t>
+            </w:r>
+            <w:r>
+              <w:rPr>
+                <w:sz w:val="17"/>
+                <w:szCs w:val="17"/>
+              </w:rPr>
+              <w:t xml:space="preserve">Logo blanco de EstudioSimple en la esquina inferior derecha, tamaño del video de referencia.</w:t>
             </w:r>
           </w:p>
         </w:tc>
@@ -19056,6 +20310,28 @@
               <w:t xml:space="preserve">Etiqueta de polerón: Precio de lista $30.000 - Oferta 20% OFF</w:t>
             </w:r>
           </w:p>
+          <w:p>
+            <w:pPr>
+              <w:spacing w:after="20"/>
+            </w:pPr>
+            <w:r>
+              <w:rPr>
+                <w:b/>
+                <w:bCs/>
+                <w:color w:val="0F766E"/>
+                <w:sz w:val="17"/>
+                <w:szCs w:val="17"/>
+              </w:rPr>
+              <w:t xml:space="preserve">• Logotipo Oficial: </w:t>
+            </w:r>
+            <w:r>
+              <w:rPr>
+                <w:sz w:val="17"/>
+                <w:szCs w:val="17"/>
+              </w:rPr>
+              <w:t xml:space="preserve">Logo blanco de EstudioSimple en la esquina inferior derecha, tamaño del video de referencia.</w:t>
+            </w:r>
+          </w:p>
         </w:tc>
         <w:tc>
           <w:tcPr>
@@ -19231,6 +20507,28 @@
               <w:t xml:space="preserve">Esquema comparativo: Ahorro ($6.000) vs Pago final ($24.000)</w:t>
             </w:r>
           </w:p>
+          <w:p>
+            <w:pPr>
+              <w:spacing w:after="20"/>
+            </w:pPr>
+            <w:r>
+              <w:rPr>
+                <w:b/>
+                <w:bCs/>
+                <w:color w:val="0F766E"/>
+                <w:sz w:val="17"/>
+                <w:szCs w:val="17"/>
+              </w:rPr>
+              <w:t xml:space="preserve">• Logotipo Oficial: </w:t>
+            </w:r>
+            <w:r>
+              <w:rPr>
+                <w:sz w:val="17"/>
+                <w:szCs w:val="17"/>
+              </w:rPr>
+              <w:t xml:space="preserve">Logo blanco de EstudioSimple en la esquina inferior derecha, tamaño del video de referencia.</w:t>
+            </w:r>
+          </w:p>
         </w:tc>
         <w:tc>
           <w:tcPr>
@@ -19353,7 +20651,7 @@
                 <w:sz w:val="18"/>
                 <w:szCs w:val="18"/>
               </w:rPr>
-              <w:t xml:space="preserve">Tributo legal del 19% que se aplica sobre operaciones afectas</w:t>
+              <w:t xml:space="preserve">Tributo legal del 19% en operaciones afectas</w:t>
             </w:r>
           </w:p>
         </w:tc>
@@ -19404,6 +20702,28 @@
                 <w:szCs w:val="17"/>
               </w:rPr>
               <w:t xml:space="preserve">Boleta de compra en operación afecta: Neto + IVA (19%) = Total Bruto</w:t>
+            </w:r>
+          </w:p>
+          <w:p>
+            <w:pPr>
+              <w:spacing w:after="20"/>
+            </w:pPr>
+            <w:r>
+              <w:rPr>
+                <w:b/>
+                <w:bCs/>
+                <w:color w:val="0F766E"/>
+                <w:sz w:val="17"/>
+                <w:szCs w:val="17"/>
+              </w:rPr>
+              <w:t xml:space="preserve">• Logotipo Oficial: </w:t>
+            </w:r>
+            <w:r>
+              <w:rPr>
+                <w:sz w:val="17"/>
+                <w:szCs w:val="17"/>
+              </w:rPr>
+              <w:t xml:space="preserve">Logo blanco de EstudioSimple en la esquina inferior derecha, tamaño del video de referencia.</w:t>
             </w:r>
           </w:p>
         </w:tc>
@@ -19581,6 +20901,28 @@
               <w:t xml:space="preserve">Flecha descendente verde (Descuento) vs Flecha ascendente azul (IVA)</w:t>
             </w:r>
           </w:p>
+          <w:p>
+            <w:pPr>
+              <w:spacing w:after="20"/>
+            </w:pPr>
+            <w:r>
+              <w:rPr>
+                <w:b/>
+                <w:bCs/>
+                <w:color w:val="0F766E"/>
+                <w:sz w:val="17"/>
+                <w:szCs w:val="17"/>
+              </w:rPr>
+              <w:t xml:space="preserve">• Logotipo Oficial: </w:t>
+            </w:r>
+            <w:r>
+              <w:rPr>
+                <w:sz w:val="17"/>
+                <w:szCs w:val="17"/>
+              </w:rPr>
+              <w:t xml:space="preserve">Logo blanco de EstudioSimple en la esquina inferior derecha, tamaño del video de referencia.</w:t>
+            </w:r>
+          </w:p>
         </w:tc>
         <w:tc>
           <w:tcPr>
@@ -19756,6 +21098,28 @@
               <w:t xml:space="preserve">Iconografía de boleta y calculadora indicando orden y método</w:t>
             </w:r>
           </w:p>
+          <w:p>
+            <w:pPr>
+              <w:spacing w:after="20"/>
+            </w:pPr>
+            <w:r>
+              <w:rPr>
+                <w:b/>
+                <w:bCs/>
+                <w:color w:val="0F766E"/>
+                <w:sz w:val="17"/>
+                <w:szCs w:val="17"/>
+              </w:rPr>
+              <w:t xml:space="preserve">• Logotipo Oficial: </w:t>
+            </w:r>
+            <w:r>
+              <w:rPr>
+                <w:sz w:val="17"/>
+                <w:szCs w:val="17"/>
+              </w:rPr>
+              <w:t xml:space="preserve">Logo blanco de EstudioSimple en la esquina inferior derecha, tamaño del video de referencia.</w:t>
+            </w:r>
+          </w:p>
         </w:tc>
         <w:tc>
           <w:tcPr>
@@ -19878,7 +21242,7 @@
                 <w:sz w:val="18"/>
                 <w:szCs w:val="18"/>
               </w:rPr>
-              <w:t xml:space="preserve">Paso 1: Base | Paso 2: Monto % | Paso 3: Operar</w:t>
+              <w:t xml:space="preserve">Tres pasos: base, porcentaje y operación final</w:t>
             </w:r>
           </w:p>
         </w:tc>
@@ -19929,6 +21293,28 @@
                 <w:szCs w:val="17"/>
               </w:rPr>
               <w:t xml:space="preserve">Diagrama de flujo de 3 pasos conectando hacia el cuaderno</w:t>
+            </w:r>
+          </w:p>
+          <w:p>
+            <w:pPr>
+              <w:spacing w:after="20"/>
+            </w:pPr>
+            <w:r>
+              <w:rPr>
+                <w:b/>
+                <w:bCs/>
+                <w:color w:val="0F766E"/>
+                <w:sz w:val="17"/>
+                <w:szCs w:val="17"/>
+              </w:rPr>
+              <w:t xml:space="preserve">• Logotipo Oficial: </w:t>
+            </w:r>
+            <w:r>
+              <w:rPr>
+                <w:sz w:val="17"/>
+                <w:szCs w:val="17"/>
+              </w:rPr>
+              <w:t xml:space="preserve">Logo blanco de EstudioSimple en la esquina inferior derecha, tamaño del video de referencia.</w:t>
             </w:r>
           </w:p>
         </w:tc>
@@ -20458,7 +21844,7 @@
                 <w:sz w:val="18"/>
                 <w:szCs w:val="18"/>
               </w:rPr>
-              <w:t xml:space="preserve">Cálculo de rebajas comerciales e IVA 19% en boletas chilenas</w:t>
+              <w:t xml:space="preserve">Rebajas comerciales e IVA en boletas chilenas</w:t>
             </w:r>
           </w:p>
         </w:tc>
@@ -20486,7 +21872,7 @@
                 <w:sz w:val="17"/>
                 <w:szCs w:val="17"/>
               </w:rPr>
-              <w:t xml:space="preserve">Modern anime style 16:9 widescreen illustration. Two 13-year-old student explorers, a girl with braided hair and a boy in a teal jacket, , a girl with braided hair and a boy in a teal jacket, in a clean modern classroom looking at a digital blackboard with price tags and receipts. Generous negative space on the left. High contrast, bright flat colors.. Clear lighting, vibrant colors, clear negative space for layout. No text drawn by AI.</w:t>
+              <w:t xml:space="preserve">Modern anime style 16:9 widescreen illustration. Two 13-year-old student explorers, a girl with braided hair and a boy in a teal jacket, in a clean modern classroom looking at a digital blackboard with price tags and receipts. Generous negative space on the left. High contrast, bright flat colors. Clear lighting, vibrant colors. No text drawn by AI.</w:t>
             </w:r>
           </w:p>
           <w:p>
@@ -20509,6 +21895,28 @@
                 <w:szCs w:val="17"/>
               </w:rPr>
               <w:t xml:space="preserve">Meta de aprendizaje: Calcular rebajas y recargos por IVA distinguiendo monto de precio final</w:t>
+            </w:r>
+          </w:p>
+          <w:p>
+            <w:pPr>
+              <w:spacing w:after="20"/>
+            </w:pPr>
+            <w:r>
+              <w:rPr>
+                <w:b/>
+                <w:bCs/>
+                <w:color w:val="0F766E"/>
+                <w:sz w:val="17"/>
+                <w:szCs w:val="17"/>
+              </w:rPr>
+              <w:t xml:space="preserve">• Logotipo Oficial: </w:t>
+            </w:r>
+            <w:r>
+              <w:rPr>
+                <w:sz w:val="17"/>
+                <w:szCs w:val="17"/>
+              </w:rPr>
+              <w:t xml:space="preserve">Logo blanco de EstudioSimple en la esquina inferior derecha, tamaño del video de referencia.</w:t>
             </w:r>
           </w:p>
         </w:tc>
@@ -20686,6 +22094,28 @@
               <w:t xml:space="preserve">Esquema de partida: Base (100%) y Tasa porcentual (p%)</w:t>
             </w:r>
           </w:p>
+          <w:p>
+            <w:pPr>
+              <w:spacing w:after="20"/>
+            </w:pPr>
+            <w:r>
+              <w:rPr>
+                <w:b/>
+                <w:bCs/>
+                <w:color w:val="0F766E"/>
+                <w:sz w:val="17"/>
+                <w:szCs w:val="17"/>
+              </w:rPr>
+              <w:t xml:space="preserve">• Logotipo Oficial: </w:t>
+            </w:r>
+            <w:r>
+              <w:rPr>
+                <w:sz w:val="17"/>
+                <w:szCs w:val="17"/>
+              </w:rPr>
+              <w:t xml:space="preserve">Logo blanco de EstudioSimple en la esquina inferior derecha, tamaño del video de referencia.</w:t>
+            </w:r>
+          </w:p>
         </w:tc>
         <w:tc>
           <w:tcPr>
@@ -20861,6 +22291,28 @@
               <w:t xml:space="preserve">Operación: Monto = Base x Decimal o Proporción cruzada</w:t>
             </w:r>
           </w:p>
+          <w:p>
+            <w:pPr>
+              <w:spacing w:after="20"/>
+            </w:pPr>
+            <w:r>
+              <w:rPr>
+                <w:b/>
+                <w:bCs/>
+                <w:color w:val="0F766E"/>
+                <w:sz w:val="17"/>
+                <w:szCs w:val="17"/>
+              </w:rPr>
+              <w:t xml:space="preserve">• Logotipo Oficial: </w:t>
+            </w:r>
+            <w:r>
+              <w:rPr>
+                <w:sz w:val="17"/>
+                <w:szCs w:val="17"/>
+              </w:rPr>
+              <w:t xml:space="preserve">Logo blanco de EstudioSimple en la esquina inferior derecha, tamaño del video de referencia.</w:t>
+            </w:r>
+          </w:p>
         </w:tc>
         <w:tc>
           <w:tcPr>
@@ -20983,7 +22435,7 @@
                 <w:sz w:val="18"/>
                 <w:szCs w:val="18"/>
               </w:rPr>
-              <w:t xml:space="preserve">Resta en rebajas | Suma en impuestos y recargos</w:t>
+              <w:t xml:space="preserve">Resta en rebajas y suma en impuestos</w:t>
             </w:r>
           </w:p>
         </w:tc>
@@ -21034,6 +22486,28 @@
                 <w:szCs w:val="17"/>
               </w:rPr>
               <w:t xml:space="preserve">Árbol de decisión: ¿Descuento? Restar. ¿Operación afecta a IVA? Sumar.</w:t>
+            </w:r>
+          </w:p>
+          <w:p>
+            <w:pPr>
+              <w:spacing w:after="20"/>
+            </w:pPr>
+            <w:r>
+              <w:rPr>
+                <w:b/>
+                <w:bCs/>
+                <w:color w:val="0F766E"/>
+                <w:sz w:val="17"/>
+                <w:szCs w:val="17"/>
+              </w:rPr>
+              <w:t xml:space="preserve">• Logotipo Oficial: </w:t>
+            </w:r>
+            <w:r>
+              <w:rPr>
+                <w:sz w:val="17"/>
+                <w:szCs w:val="17"/>
+              </w:rPr>
+              <w:t xml:space="preserve">Logo blanco de EstudioSimple en la esquina inferior derecha, tamaño del video de referencia.</w:t>
             </w:r>
           </w:p>
         </w:tc>
@@ -21158,7 +22632,7 @@
                 <w:sz w:val="18"/>
                 <w:szCs w:val="18"/>
               </w:rPr>
-              <w:t xml:space="preserve">Descuento 20% -&gt; x 0,80 | IVA 19% -&gt; x 1,19</w:t>
+              <w:t xml:space="preserve">Factores directos: multiplicar por 0,80 o 1,19</w:t>
             </w:r>
           </w:p>
         </w:tc>
@@ -21209,6 +22683,28 @@
                 <w:szCs w:val="17"/>
               </w:rPr>
               <w:t xml:space="preserve">Factores directos: 1 - 0,20 = 0,80 | Operación afecta a IVA: 1 + 0,19 = 1,19</w:t>
+            </w:r>
+          </w:p>
+          <w:p>
+            <w:pPr>
+              <w:spacing w:after="20"/>
+            </w:pPr>
+            <w:r>
+              <w:rPr>
+                <w:b/>
+                <w:bCs/>
+                <w:color w:val="0F766E"/>
+                <w:sz w:val="17"/>
+                <w:szCs w:val="17"/>
+              </w:rPr>
+              <w:t xml:space="preserve">• Logotipo Oficial: </w:t>
+            </w:r>
+            <w:r>
+              <w:rPr>
+                <w:sz w:val="17"/>
+                <w:szCs w:val="17"/>
+              </w:rPr>
+              <w:t xml:space="preserve">Logo blanco de EstudioSimple en la esquina inferior derecha, tamaño del video de referencia.</w:t>
             </w:r>
           </w:p>
         </w:tc>
@@ -21333,7 +22829,7 @@
                 <w:sz w:val="18"/>
                 <w:szCs w:val="18"/>
               </w:rPr>
-              <w:t xml:space="preserve">Un polerón escolar tiene un precio de lista de $30.000. Durante la liquidación d</w:t>
+              <w:t xml:space="preserve">Polerón de $30.000 con 20%: pagar $24.000</w:t>
             </w:r>
           </w:p>
         </w:tc>
@@ -21361,7 +22857,7 @@
                 <w:sz w:val="17"/>
                 <w:szCs w:val="17"/>
               </w:rPr>
-              <w:t xml:space="preserve">Modern anime style 16:9 widescreen illustration. Two 13-year-old student explorers, a girl with braided hair and a boy in a teal jacket, Close up of a student notebook page neatly filled with pencil writing: Original price $30.000, 20% calculation equals $6.000, and final subtraction $30.000 minus $6.000 equals $24.000. Lucas and Sofía looking at the completed page with satisfaction, ample negative space on the left.. Clear lighting, vibrant colors, clear negative space for layout. No text drawn by AI.</w:t>
+              <w:t xml:space="preserve">Modern anime style 16:9 widescreen illustration. Two 13-year-old student explorers, a girl with braided hair and a boy in a teal jacket, Close up of a student notebook page on a wooden desk. Lucas and Sofía looking at the notebook with satisfaction, modern anime style, ample negative space on the left. Clear lighting, vibrant colors. No text drawn by AI.</w:t>
             </w:r>
           </w:p>
           <w:p>
@@ -21384,6 +22880,28 @@
                 <w:szCs w:val="17"/>
               </w:rPr>
               <w:t xml:space="preserve">Resolución canónica: Descuento = 20% de 30.000 = (20 × 30.000) / 100 = $6.000. Precio final = 30.000 - 6.000 = $24.000.</w:t>
+            </w:r>
+          </w:p>
+          <w:p>
+            <w:pPr>
+              <w:spacing w:after="20"/>
+            </w:pPr>
+            <w:r>
+              <w:rPr>
+                <w:b/>
+                <w:bCs/>
+                <w:color w:val="0F766E"/>
+                <w:sz w:val="17"/>
+                <w:szCs w:val="17"/>
+              </w:rPr>
+              <w:t xml:space="preserve">• Logotipo Oficial: </w:t>
+            </w:r>
+            <w:r>
+              <w:rPr>
+                <w:sz w:val="17"/>
+                <w:szCs w:val="17"/>
+              </w:rPr>
+              <w:t xml:space="preserve">Logo blanco de EstudioSimple en la esquina inferior derecha, tamaño del video de referencia.</w:t>
             </w:r>
           </w:p>
         </w:tc>
@@ -21508,7 +23026,7 @@
                 <w:sz w:val="18"/>
                 <w:szCs w:val="18"/>
               </w:rPr>
-              <w:t xml:space="preserve">Verifica siempre si piden la rebaja o el precio final</w:t>
+              <w:t xml:space="preserve">Verifica si piden la rebaja o precio final</w:t>
             </w:r>
           </w:p>
         </w:tc>
@@ -21559,6 +23077,28 @@
                 <w:szCs w:val="17"/>
               </w:rPr>
               <w:t xml:space="preserve">Insignia dorada con la regla de oro: Distinguir monto vs precio final</w:t>
+            </w:r>
+          </w:p>
+          <w:p>
+            <w:pPr>
+              <w:spacing w:after="20"/>
+            </w:pPr>
+            <w:r>
+              <w:rPr>
+                <w:b/>
+                <w:bCs/>
+                <w:color w:val="0F766E"/>
+                <w:sz w:val="17"/>
+                <w:szCs w:val="17"/>
+              </w:rPr>
+              <w:t xml:space="preserve">• Logotipo Oficial: </w:t>
+            </w:r>
+            <w:r>
+              <w:rPr>
+                <w:sz w:val="17"/>
+                <w:szCs w:val="17"/>
+              </w:rPr>
+              <w:t xml:space="preserve">Logo blanco de EstudioSimple en la esquina inferior derecha, tamaño del video de referencia.</w:t>
             </w:r>
           </w:p>
         </w:tc>
@@ -22595,7 +24135,7 @@
         <w:t xml:space="preserve">• 3 Tarjetas de Foco de la Pantalla del Alumno: </w:t>
       </w:r>
       <w:r>
-        <w:t xml:space="preserve">[Cálculo Inverso: Hallar el 100% a partir de un valor parcial conocido] · [Gráficos Circulares: Lectura de distribución de datos en porcentajes] · [Variaciones Sucesivas: Comprensión de que el porcentaje depende de la base]</w:t>
+        <w:t xml:space="preserve">[Cálculo Inverso: Hallar el 100% a partir de un valor parcial conocido] · [Gráficos Circulares: Lectura de distribución de datos en porcentajes] · [Estrategias de Evaluación: Identificación de incógnitas y descarte crítico de distractores]</w:t>
       </w:r>
     </w:p>
     <w:p>
@@ -22908,7 +24448,7 @@
         <w:t xml:space="preserve">• Puntos de foco al observar el video: </w:t>
       </w:r>
       <w:r>
-        <w:t xml:space="preserve">Interpretar los resultados de una encuesta escolar presentados en un gráfico circular. · Deducir el total de la comunidad escolar a partir de un porcentaje parcial conocido. · Analizar por qué dos descuentos sucesivos del 10% no son equivalentes a un 20% de descuento directo.</w:t>
+        <w:t xml:space="preserve">Interpretar los resultados de una encuesta escolar presentados en un gráfico circular. · Deducir el total de la comunidad escolar a partir de un porcentaje parcial conocido. · Aplicar estrategias de verificación para resolver reactivos y descartar distractores en evaluaciones formales.</w:t>
       </w:r>
     </w:p>
     <w:p>
@@ -23199,7 +24739,7 @@
                 <w:sz w:val="18"/>
                 <w:szCs w:val="18"/>
               </w:rPr>
-              <w:t xml:space="preserve">Misión 6: Consolidación y Ensayo Final tipo MINEDUC</w:t>
+              <w:t xml:space="preserve">Misión 6: Consolidación y Ensayo Final</w:t>
             </w:r>
           </w:p>
         </w:tc>
@@ -23227,7 +24767,7 @@
                 <w:sz w:val="17"/>
                 <w:szCs w:val="17"/>
               </w:rPr>
-              <w:t xml:space="preserve">Modern anime style 16:9 widescreen illustration. Two 13-year-old student explorers, a girl with braided hair and a boy in a teal jacket, Two 13-year-old student organizers, a girl with braided hair and a boy in a teal jacket, standing before a large wooden presentation board in a bright school auditorium. A colorful pie chart is pinned to the board, sunlight streaming through tall windows, clean vector aesthetic, ample negative space on the left.. Clear lighting, vibrant colors, clear negative space for layout. No text drawn by AI.</w:t>
+              <w:t xml:space="preserve">Modern anime style 16:9 widescreen illustration. Two 13-year-old student explorers, a girl with braided hair and a boy in a teal jacket, standing before a large wooden presentation board in a bright school auditorium. A colorful pie chart is pinned to the board, sunlight streaming through tall windows, clean vector aesthetic, ample negative space on the left. Clear lighting, vibrant colors, clear negative space for layout. No text drawn by AI.</w:t>
             </w:r>
           </w:p>
           <w:p>
@@ -23250,6 +24790,28 @@
                 <w:szCs w:val="17"/>
               </w:rPr>
               <w:t xml:space="preserve">Panel de asamblea escolar con gráfico circular de participación estudiantil</w:t>
+            </w:r>
+          </w:p>
+          <w:p>
+            <w:pPr>
+              <w:spacing w:after="20"/>
+            </w:pPr>
+            <w:r>
+              <w:rPr>
+                <w:b/>
+                <w:bCs/>
+                <w:color w:val="0F766E"/>
+                <w:sz w:val="17"/>
+                <w:szCs w:val="17"/>
+              </w:rPr>
+              <w:t xml:space="preserve">• Logotipo Oficial: </w:t>
+            </w:r>
+            <w:r>
+              <w:rPr>
+                <w:sz w:val="17"/>
+                <w:szCs w:val="17"/>
+              </w:rPr>
+              <w:t xml:space="preserve">Logo blanco de EstudioSimple en la esquina inferior derecha, tamaño del video de referencia.</w:t>
             </w:r>
           </w:p>
         </w:tc>
@@ -23374,7 +24936,7 @@
                 <w:sz w:val="18"/>
                 <w:szCs w:val="18"/>
               </w:rPr>
-              <w:t xml:space="preserve">El círculo completo equivale al 100% de la muestra</w:t>
+              <w:t xml:space="preserve">El círculo completo representa el 100%</w:t>
             </w:r>
           </w:p>
         </w:tc>
@@ -23402,7 +24964,7 @@
                 <w:sz w:val="17"/>
                 <w:szCs w:val="17"/>
               </w:rPr>
-              <w:t xml:space="preserve">Modern anime style 16:9 widescreen illustration. Two 13-year-old student explorers, a girl with braided hair and a boy in a teal jacket, Close up of the presentation board showing a large circular chart divided into three distinct colored slices: blue for 50%, yellow for 25%, and coral for 25%. Lucas is pointing with a wooden ruler while Sofía holds her notes, focused engaged expressions, clear clean lines, negative space on the left.. Clear lighting, vibrant colors, clear negative space for layout. No text drawn by AI.</w:t>
+              <w:t xml:space="preserve">Modern anime style 16:9 widescreen illustration. Two 13-year-old student explorers, a girl with braided hair and a boy in a teal jacket, close up of the presentation board showing a large circular chart divided into three distinct colored slices. Lucas is pointing with a wooden ruler while Sofía holds her notes, focused engaged expressions, clear clean lines, negative space on the left. Clear lighting, vibrant colors, clear negative space for layout. No text drawn by AI.</w:t>
             </w:r>
           </w:p>
           <w:p>
@@ -23425,6 +24987,28 @@
                 <w:szCs w:val="17"/>
               </w:rPr>
               <w:t xml:space="preserve">Diagrama circular con sectores: 50% (semicírculo), 25% (cuadrante) y 25% (cuadrante)</w:t>
+            </w:r>
+          </w:p>
+          <w:p>
+            <w:pPr>
+              <w:spacing w:after="20"/>
+            </w:pPr>
+            <w:r>
+              <w:rPr>
+                <w:b/>
+                <w:bCs/>
+                <w:color w:val="0F766E"/>
+                <w:sz w:val="17"/>
+                <w:szCs w:val="17"/>
+              </w:rPr>
+              <w:t xml:space="preserve">• Logotipo Oficial: </w:t>
+            </w:r>
+            <w:r>
+              <w:rPr>
+                <w:sz w:val="17"/>
+                <w:szCs w:val="17"/>
+              </w:rPr>
+              <w:t xml:space="preserve">Logo blanco de EstudioSimple en la esquina inferior derecha, tamaño del video de referencia.</w:t>
             </w:r>
           </w:p>
         </w:tc>
@@ -23549,7 +25133,7 @@
                 <w:sz w:val="18"/>
                 <w:szCs w:val="18"/>
               </w:rPr>
-              <w:t xml:space="preserve">Si el 10% son 15 estudiantes, ¿cuántos son el 100%?</w:t>
+              <w:t xml:space="preserve">Si 10% son 15 estudiantes: total 150</w:t>
             </w:r>
           </w:p>
         </w:tc>
@@ -23577,7 +25161,7 @@
                 <w:sz w:val="17"/>
                 <w:szCs w:val="17"/>
               </w:rPr>
-              <w:t xml:space="preserve">Modern anime style 16:9 widescreen illustration. Two 13-year-old student explorers, a girl with braided hair and a boy in a teal jacket, Sofía writing on a chalkboard with neat chalk figures, drawing a balance scale where one side shows 15 students and the other side shows a 10% tag. Lucas is calculating in his notebook, bright classroom ambiance, clean anime shading.. Clear lighting, vibrant colors, clear negative space for layout. No text drawn by AI.</w:t>
+              <w:t xml:space="preserve">Modern anime style 16:9 widescreen illustration. Two 13-year-old student explorers, a girl with braided hair and a boy in a teal jacket, Sofía writing on a chalkboard, illustrating a balance scale with student group silhouettes on one side and a fraction icon on the other. Lucas is calculating in his notebook, bright classroom ambiance, clean anime shading. Clear lighting, vibrant colors, clear negative space for layout. No text drawn by AI.</w:t>
             </w:r>
           </w:p>
           <w:p>
@@ -23600,6 +25184,28 @@
                 <w:szCs w:val="17"/>
               </w:rPr>
               <w:t xml:space="preserve">Esquema de proporción directa: 10% -&gt; 15 | 100% -&gt; X = (15 · 100) / 10 = 150</w:t>
+            </w:r>
+          </w:p>
+          <w:p>
+            <w:pPr>
+              <w:spacing w:after="20"/>
+            </w:pPr>
+            <w:r>
+              <w:rPr>
+                <w:b/>
+                <w:bCs/>
+                <w:color w:val="0F766E"/>
+                <w:sz w:val="17"/>
+                <w:szCs w:val="17"/>
+              </w:rPr>
+              <w:t xml:space="preserve">• Logotipo Oficial: </w:t>
+            </w:r>
+            <w:r>
+              <w:rPr>
+                <w:sz w:val="17"/>
+                <w:szCs w:val="17"/>
+              </w:rPr>
+              <w:t xml:space="preserve">Logo blanco de EstudioSimple en la esquina inferior derecha, tamaño del video de referencia.</w:t>
             </w:r>
           </w:p>
         </w:tc>
@@ -23724,7 +25330,7 @@
                 <w:sz w:val="18"/>
                 <w:szCs w:val="18"/>
               </w:rPr>
-              <w:t xml:space="preserve">Multiplicamos 15 por 10 = 150 estudiantes en total</w:t>
+              <w:t xml:space="preserve">Multiplicar 15 por 10: total 150</w:t>
             </w:r>
           </w:p>
         </w:tc>
@@ -23752,7 +25358,7 @@
                 <w:sz w:val="17"/>
                 <w:szCs w:val="17"/>
               </w:rPr>
-              <w:t xml:space="preserve">Modern anime style 16:9 widescreen illustration. Two 13-year-old student explorers, a girl with braided hair and a boy in a teal jacket, Lucas showing his notebook to the audience with an enthusiastic smile, revealing a diagram with 10 identical blocks of 15 students lined up to form a large bar of 150. Crisp lineart, warm studio lighting, negative space on the left.. Clear lighting, vibrant colors, clear negative space for layout. No text drawn by AI.</w:t>
+              <w:t xml:space="preserve">Modern anime style 16:9 widescreen illustration. Two 13-year-old student explorers, a girl with braided hair and a boy in a teal jacket, Lucas showing his notebook to the audience with an enthusiastic smile, revealing a diagram with 10 identical blocks lined up to form a large bar. Crisp lineart, warm studio lighting, negative space on the left. Clear lighting, vibrant colors, clear negative space for layout. No text drawn by AI.</w:t>
             </w:r>
           </w:p>
           <w:p>
@@ -23775,6 +25381,28 @@
                 <w:szCs w:val="17"/>
               </w:rPr>
               <w:t xml:space="preserve">Barra modular de 10 bloques de 15 unidades: 10 · 15 = 150</w:t>
+            </w:r>
+          </w:p>
+          <w:p>
+            <w:pPr>
+              <w:spacing w:after="20"/>
+            </w:pPr>
+            <w:r>
+              <w:rPr>
+                <w:b/>
+                <w:bCs/>
+                <w:color w:val="0F766E"/>
+                <w:sz w:val="17"/>
+                <w:szCs w:val="17"/>
+              </w:rPr>
+              <w:t xml:space="preserve">• Logotipo Oficial: </w:t>
+            </w:r>
+            <w:r>
+              <w:rPr>
+                <w:sz w:val="17"/>
+                <w:szCs w:val="17"/>
+              </w:rPr>
+              <w:t xml:space="preserve">Logo blanco de EstudioSimple en la esquina inferior derecha, tamaño del video de referencia.</w:t>
             </w:r>
           </w:p>
         </w:tc>
@@ -23877,7 +25505,7 @@
                 <w:sz w:val="18"/>
                 <w:szCs w:val="18"/>
               </w:rPr>
-              <w:t xml:space="preserve">¿SUMAR DESCUENTOS ES LO MISMO?</w:t>
+              <w:t xml:space="preserve">SUMA DE SECTORES EN EL GRÁFICO</w:t>
             </w:r>
           </w:p>
           <w:p>
@@ -23899,7 +25527,7 @@
                 <w:sz w:val="18"/>
                 <w:szCs w:val="18"/>
               </w:rPr>
-              <w:t xml:space="preserve">Comparando 20% directo versus 10% + 10% sucesivo</w:t>
+              <w:t xml:space="preserve">Todos los sectores suman exactamente el 100%</w:t>
             </w:r>
           </w:p>
         </w:tc>
@@ -23927,7 +25555,7 @@
                 <w:sz w:val="17"/>
                 <w:szCs w:val="17"/>
               </w:rPr>
-              <w:t xml:space="preserve">Modern anime style 16:9 widescreen illustration. Two 13-year-old student explorers, a girl with braided hair and a boy in a teal jacket, Two shop posters in a bookstore window: one claims 20% direct discount, and another claims 10% plus an additional 10% discount. Sofía and Lucas analyzing the difference with furrowed brows, dramatic curious expressions, clean lighting.. Clear lighting, vibrant colors, clear negative space for layout. No text drawn by AI.</w:t>
+              <w:t xml:space="preserve">Modern anime style 16:9 widescreen illustration. Two 13-year-old student explorers, a girl with braided hair and a boy in a teal jacket, analyzing circular chart sectors on the presentation board together. Sofía verifying each colorful slice while Lucas checks calculations on his clipboard, bright auditorium daylight, clean vector aesthetic, ample negative space on the left. Clear lighting, vibrant colors, clear negative space for layout. No text drawn by AI.</w:t>
             </w:r>
           </w:p>
           <w:p>
@@ -23949,7 +25577,29 @@
                 <w:sz w:val="17"/>
                 <w:szCs w:val="17"/>
               </w:rPr>
-              <w:t xml:space="preserve">Comparación: Descuento 20% sobre $10.000 ($8.000) vs 10% sobre $10.000 y 10% sobre $9.000 ($8.100)</w:t>
+              <w:t xml:space="preserve">Verificación gráfica: 50% + 25% + 25% = 100%</w:t>
+            </w:r>
+          </w:p>
+          <w:p>
+            <w:pPr>
+              <w:spacing w:after="20"/>
+            </w:pPr>
+            <w:r>
+              <w:rPr>
+                <w:b/>
+                <w:bCs/>
+                <w:color w:val="0F766E"/>
+                <w:sz w:val="17"/>
+                <w:szCs w:val="17"/>
+              </w:rPr>
+              <w:t xml:space="preserve">• Logotipo Oficial: </w:t>
+            </w:r>
+            <w:r>
+              <w:rPr>
+                <w:sz w:val="17"/>
+                <w:szCs w:val="17"/>
+              </w:rPr>
+              <w:t xml:space="preserve">Logo blanco de EstudioSimple en la esquina inferior derecha, tamaño del video de referencia.</w:t>
             </w:r>
           </w:p>
         </w:tc>
@@ -23970,7 +25620,7 @@
                 <w:sz w:val="18"/>
                 <w:szCs w:val="18"/>
               </w:rPr>
-              <w:t xml:space="preserve">Un puesto escolar anuncia una rebaja del 10% y luego otro 10% adicional. ¿Es lo mismo que una rebaja del 20% de una sola vez? Sofía advierte que hay una trampa sutil.</w:t>
+              <w:t xml:space="preserve">Al interpretar un gráfico circular, siempre debemos comprobar que la suma de todos los sectores coincida con el cien por ciento total. Si conocemos dos sectores, calculamos el tercero por sustracción.</w:t>
             </w:r>
           </w:p>
         </w:tc>
@@ -24052,7 +25702,7 @@
                 <w:sz w:val="18"/>
                 <w:szCs w:val="18"/>
               </w:rPr>
-              <w:t xml:space="preserve">EL SEGUNDO PORCENTAJE TIENE NUEVA BASE</w:t>
+              <w:t xml:space="preserve">ESTRATEGIA PARA LA EVALUACIÓN</w:t>
             </w:r>
           </w:p>
           <w:p>
@@ -24074,7 +25724,7 @@
                 <w:sz w:val="18"/>
                 <w:szCs w:val="18"/>
               </w:rPr>
-              <w:t xml:space="preserve">10% de $10.000 = $1.000 | 10% de $9.000 = $900 | Total = $8.100</w:t>
+              <w:t xml:space="preserve">Verifica siempre si es parte o total</w:t>
             </w:r>
           </w:p>
         </w:tc>
@@ -24102,7 +25752,7 @@
                 <w:sz w:val="17"/>
                 <w:szCs w:val="17"/>
               </w:rPr>
-              <w:t xml:space="preserve">Modern anime style 16:9 widescreen illustration. Two 13-year-old student explorers, a girl with braided hair and a boy in a teal jacket, Sofía and Lucas pointing at a comparison table on their chalkboard, showing that the second 10% se calcula sobre el nuevo precio rebajado de $9.000, resultando en $900 y no en $1.000. Clean modern flat colors, ample negative space.. Clear lighting, vibrant colors, clear negative space for layout. No text drawn by AI.</w:t>
+              <w:t xml:space="preserve">Modern anime style 16:9 widescreen illustration. Two 13-year-old student explorers, a girl with braided hair and a boy in a teal jacket, reviewing study notes and evaluation guidelines at a clean wooden table. Focused and confident expressions, checklist diagram on their board, soft afternoon sunlight, ample negative space on the left. Clear lighting, vibrant colors, clear negative space for layout. No text drawn by AI.</w:t>
             </w:r>
           </w:p>
           <w:p>
@@ -24124,7 +25774,29 @@
                 <w:sz w:val="17"/>
                 <w:szCs w:val="17"/>
               </w:rPr>
-              <w:t xml:space="preserve">Cálculo paso a paso: $10.000 - $1.000 = $9.000 -&gt; $9.000 - $900 = $8.100 (Ahorro real: 19%)</w:t>
+              <w:t xml:space="preserve">Pregunta clave: ¿El valor conocido es parte o total?</w:t>
+            </w:r>
+          </w:p>
+          <w:p>
+            <w:pPr>
+              <w:spacing w:after="20"/>
+            </w:pPr>
+            <w:r>
+              <w:rPr>
+                <w:b/>
+                <w:bCs/>
+                <w:color w:val="0F766E"/>
+                <w:sz w:val="17"/>
+                <w:szCs w:val="17"/>
+              </w:rPr>
+              <w:t xml:space="preserve">• Logotipo Oficial: </w:t>
+            </w:r>
+            <w:r>
+              <w:rPr>
+                <w:sz w:val="17"/>
+                <w:szCs w:val="17"/>
+              </w:rPr>
+              <w:t xml:space="preserve">Logo blanco de EstudioSimple en la esquina inferior derecha, tamaño del video de referencia.</w:t>
             </w:r>
           </w:p>
         </w:tc>
@@ -24145,7 +25817,7 @@
                 <w:sz w:val="18"/>
                 <w:szCs w:val="18"/>
               </w:rPr>
-              <w:t xml:space="preserve">Al aplicar el segundo descuento, la base ya no es 10.000, sino 9.000 pesos. Por eso el segundo ahorro es de 900 pesos, pagando 8.100 en lugar de 8.000. ¡El porcentaje siempre depende de la base sobre la que actúa!</w:t>
+              <w:t xml:space="preserve">Antes de calcular en una evaluación, pregúntate siempre si el dato entregado corresponde a una parte o al total. Esta distinción evita errores comunes y permite elegir la operación correcta.</w:t>
             </w:r>
           </w:p>
         </w:tc>
@@ -24249,7 +25921,7 @@
                 <w:sz w:val="18"/>
                 <w:szCs w:val="18"/>
               </w:rPr>
-              <w:t xml:space="preserve">Dominamos las 4 operaciones y las estrategias de porcentajes</w:t>
+              <w:t xml:space="preserve">Dominamos las estrategias y el cálculo inverso</w:t>
             </w:r>
           </w:p>
         </w:tc>
@@ -24277,7 +25949,7 @@
                 <w:sz w:val="17"/>
                 <w:szCs w:val="17"/>
               </w:rPr>
-              <w:t xml:space="preserve">Modern anime style 16:9 widescreen illustration. Two 13-year-old student explorers, a girl with braided hair and a boy in a teal jacket, Sofía and Lucas high-fiving in front of the finished presentation board, holding their study guides with proud smiles, warm golden afternoon glow entering the hall, tidy minimalist room.. Clear lighting, vibrant colors, clear negative space for layout. No text drawn by AI.</w:t>
+              <w:t xml:space="preserve">Modern anime style 16:9 widescreen illustration. Two 13-year-old student explorers, a girl with braided hair and a boy in a teal jacket, Sofía and Lucas high-fiving in front of the finished presentation board, holding their study guides with proud smiles, warm golden afternoon glow entering the hall, tidy minimalist room. Clear lighting, vibrant colors, clear negative space for layout. No text drawn by AI.</w:t>
             </w:r>
           </w:p>
           <w:p>
@@ -24300,6 +25972,28 @@
                 <w:szCs w:val="17"/>
               </w:rPr>
               <w:t xml:space="preserve">Insignia de maestría: 100% de la unidad dominada</w:t>
+            </w:r>
+          </w:p>
+          <w:p>
+            <w:pPr>
+              <w:spacing w:after="20"/>
+            </w:pPr>
+            <w:r>
+              <w:rPr>
+                <w:b/>
+                <w:bCs/>
+                <w:color w:val="0F766E"/>
+                <w:sz w:val="17"/>
+                <w:szCs w:val="17"/>
+              </w:rPr>
+              <w:t xml:space="preserve">• Logotipo Oficial: </w:t>
+            </w:r>
+            <w:r>
+              <w:rPr>
+                <w:sz w:val="17"/>
+                <w:szCs w:val="17"/>
+              </w:rPr>
+              <w:t xml:space="preserve">Logo blanco de EstudioSimple en la esquina inferior derecha, tamaño del video de referencia.</w:t>
             </w:r>
           </w:p>
         </w:tc>
@@ -24829,7 +26523,7 @@
                 <w:sz w:val="18"/>
                 <w:szCs w:val="18"/>
               </w:rPr>
-              <w:t xml:space="preserve">Hallar el total conociendo una parte y el porcentaje correspondiente</w:t>
+              <w:t xml:space="preserve">Hallar el total a partir de una parte</w:t>
             </w:r>
           </w:p>
         </w:tc>
@@ -24857,7 +26551,7 @@
                 <w:sz w:val="17"/>
                 <w:szCs w:val="17"/>
               </w:rPr>
-              <w:t xml:space="preserve">Modern anime style 16:9 widescreen illustration. Two 13-year-old student explorers, a girl with braided hair and a boy in a teal jacket, Two 13-year-old student explorers, a girl with braided hair and a boy in a teal jacket, standing confidently before a modern digital board displaying summary diagrams and sample questions. Clean classroom, high clarity, ample negative space on the left.. Clear lighting, vibrant colors, clear negative space for layout. No text drawn by AI.</w:t>
+              <w:t xml:space="preserve">Modern anime style 16:9 widescreen illustration. Two 13-year-old student explorers, a girl with braided hair and a boy in a teal jacket, standing confidently before a modern digital board displaying summary diagrams and geometric circular charts. Clean classroom, high clarity, ample negative space on the left. Clear lighting, vibrant colors, clear negative space for layout. No text drawn by AI.</w:t>
             </w:r>
           </w:p>
           <w:p>
@@ -24880,6 +26574,28 @@
                 <w:szCs w:val="17"/>
               </w:rPr>
               <w:t xml:space="preserve">Meta de aprendizaje: Dominar cálculo inverso, gráficos de sectores y resolución formal de reactivos</w:t>
+            </w:r>
+          </w:p>
+          <w:p>
+            <w:pPr>
+              <w:spacing w:after="20"/>
+            </w:pPr>
+            <w:r>
+              <w:rPr>
+                <w:b/>
+                <w:bCs/>
+                <w:color w:val="0F766E"/>
+                <w:sz w:val="17"/>
+                <w:szCs w:val="17"/>
+              </w:rPr>
+              <w:t xml:space="preserve">• Logotipo Oficial: </w:t>
+            </w:r>
+            <w:r>
+              <w:rPr>
+                <w:sz w:val="17"/>
+                <w:szCs w:val="17"/>
+              </w:rPr>
+              <w:t xml:space="preserve">Logo blanco de EstudioSimple en la esquina inferior derecha, tamaño del video de referencia.</w:t>
             </w:r>
           </w:p>
         </w:tc>
@@ -25004,7 +26720,7 @@
                 <w:sz w:val="18"/>
                 <w:szCs w:val="18"/>
               </w:rPr>
-              <w:t xml:space="preserve">18 libros corresponden al 15% -&gt; Total = 120 libros</w:t>
+              <w:t xml:space="preserve">18 libros son el 15%: total 120</w:t>
             </w:r>
           </w:p>
         </w:tc>
@@ -25032,7 +26748,7 @@
                 <w:sz w:val="17"/>
                 <w:szCs w:val="17"/>
               </w:rPr>
-              <w:t xml:space="preserve">Modern anime style 16:9 widescreen illustration. Two 13-year-old student explorers, a girl with braided hair and a boy in a teal jacket, Detailed chalkboard split into three vertical sections demonstrating the calculation step by step: 15% -&gt; 18 libros, 18 · 100 = 1.800, 1.800 : 15 = 120 libros. Lucas pointing to each step, calm organized atmosphere.. Clear lighting, vibrant colors, clear negative space for layout. No text drawn by AI.</w:t>
+              <w:t xml:space="preserve">Modern anime style 16:9 widescreen illustration. Two 13-year-old student explorers, a girl with braided hair and a boy in a teal jacket, Lucas pointing to a chalkboard divided into three vertical process sections with clean geometric block diagrams, calm organized atmosphere. Clear lighting, vibrant colors, clear negative space for layout. No text drawn by AI.</w:t>
             </w:r>
           </w:p>
           <w:p>
@@ -25055,6 +26771,28 @@
                 <w:szCs w:val="17"/>
               </w:rPr>
               <w:t xml:space="preserve">Resolución: X = (18 · 100) / 15 = 1.800 / 15 = 120 libros</w:t>
+            </w:r>
+          </w:p>
+          <w:p>
+            <w:pPr>
+              <w:spacing w:after="20"/>
+            </w:pPr>
+            <w:r>
+              <w:rPr>
+                <w:b/>
+                <w:bCs/>
+                <w:color w:val="0F766E"/>
+                <w:sz w:val="17"/>
+                <w:szCs w:val="17"/>
+              </w:rPr>
+              <w:t xml:space="preserve">• Logotipo Oficial: </w:t>
+            </w:r>
+            <w:r>
+              <w:rPr>
+                <w:sz w:val="17"/>
+                <w:szCs w:val="17"/>
+              </w:rPr>
+              <w:t xml:space="preserve">Logo blanco de EstudioSimple en la esquina inferior derecha, tamaño del video de referencia.</w:t>
             </w:r>
           </w:p>
         </w:tc>
@@ -25179,7 +26917,7 @@
                 <w:sz w:val="18"/>
                 <w:szCs w:val="18"/>
               </w:rPr>
-              <w:t xml:space="preserve">La suma de todos los sectores siempre equivale al 100%</w:t>
+              <w:t xml:space="preserve">Suma de todos los sectores equivale al 100%</w:t>
             </w:r>
           </w:p>
         </w:tc>
@@ -25207,7 +26945,7 @@
                 <w:sz w:val="17"/>
                 <w:szCs w:val="17"/>
               </w:rPr>
-              <w:t xml:space="preserve">Modern anime style 16:9 widescreen illustration. Two 13-year-old student explorers, a girl with braided hair and a boy in a teal jacket, Clean educational infographic style slide showing a 360-degree circle with protractor markings. Slices clearly labeled with fraction equivalents: 50% = 1/2, 25% = 1/4, 10% = 1/10. Sofía explaining with a pointer, bright colors.. Clear lighting, vibrant colors, clear negative space for layout. No text drawn by AI.</w:t>
+              <w:t xml:space="preserve">Modern anime style 16:9 widescreen illustration. Two 13-year-old student explorers, a girl with braided hair and a boy in a teal jacket, standing beside an educational infographic display showing a divided circular geometry diagram. Sofía explaining with a wooden pointer, bright colors, ample negative space on the left. Clear lighting, vibrant colors, clear negative space for layout. No text drawn by AI.</w:t>
             </w:r>
           </w:p>
           <w:p>
@@ -25230,6 +26968,28 @@
                 <w:szCs w:val="17"/>
               </w:rPr>
               <w:t xml:space="preserve">Círculo trigonométrico de porcentajes: 360° = 100% | 180° = 50% | 90° = 25% | 36° = 10%</w:t>
+            </w:r>
+          </w:p>
+          <w:p>
+            <w:pPr>
+              <w:spacing w:after="20"/>
+            </w:pPr>
+            <w:r>
+              <w:rPr>
+                <w:b/>
+                <w:bCs/>
+                <w:color w:val="0F766E"/>
+                <w:sz w:val="17"/>
+                <w:szCs w:val="17"/>
+              </w:rPr>
+              <w:t xml:space="preserve">• Logotipo Oficial: </w:t>
+            </w:r>
+            <w:r>
+              <w:rPr>
+                <w:sz w:val="17"/>
+                <w:szCs w:val="17"/>
+              </w:rPr>
+              <w:t xml:space="preserve">Logo blanco de EstudioSimple en la esquina inferior derecha, tamaño del video de referencia.</w:t>
             </w:r>
           </w:p>
         </w:tc>
@@ -25332,7 +27092,7 @@
                 <w:sz w:val="18"/>
                 <w:szCs w:val="18"/>
               </w:rPr>
-              <w:t xml:space="preserve">VARIACIONES PORCENTUALES SUCESIVAS</w:t>
+              <w:t xml:space="preserve">CANTIDADES EN GRÁFICOS CIRCULARES</w:t>
             </w:r>
           </w:p>
           <w:p>
@@ -25354,7 +27114,7 @@
                 <w:sz w:val="18"/>
                 <w:szCs w:val="18"/>
               </w:rPr>
-              <w:t xml:space="preserve">El porcentaje se aplica siempre sobre el saldo anterior</w:t>
+              <w:t xml:space="preserve">Multiplicar el total por el decimal del sector</w:t>
             </w:r>
           </w:p>
         </w:tc>
@@ -25382,7 +27142,7 @@
                 <w:sz w:val="17"/>
                 <w:szCs w:val="17"/>
               </w:rPr>
-              <w:t xml:space="preserve">Modern anime style 16:9 widescreen illustration. Two 13-year-old student explorers, a girl with braided hair and a boy in a teal jacket, Infographic comparison slide with a flow diagram showing two sequential arrows: from $10.000 minus 10% to $9.000, and from $9.000 minus 10% to $8.100. Lucas analyzing the flow, clean corporate aesthetic.. Clear lighting, vibrant colors, clear negative space for layout. No text drawn by AI.</w:t>
+              <w:t xml:space="preserve">Modern anime style 16:9 widescreen illustration. Two 13-year-old student explorers, a girl with braided hair and a boy in a teal jacket, Lucas analyzing a circular graph chart on a display screen, taking notes on a clipboard. Clean academic setting, vibrant contrasting slice colors, ample negative space on the left. Clear lighting, vibrant colors, clear negative space for layout. No text drawn by AI.</w:t>
             </w:r>
           </w:p>
           <w:p>
@@ -25404,7 +27164,29 @@
                 <w:sz w:val="17"/>
                 <w:szCs w:val="17"/>
               </w:rPr>
-              <w:t xml:space="preserve">Diagrama de flujo: $10.000 -&gt; -10% -&gt; $9.000 -&gt; -10% -&gt; $8.100 (Rebaja efectiva: 19%)</w:t>
+              <w:t xml:space="preserve">Cálculo por sector: Cantidad = Total · (Porcentaje / 100)</w:t>
+            </w:r>
+          </w:p>
+          <w:p>
+            <w:pPr>
+              <w:spacing w:after="20"/>
+            </w:pPr>
+            <w:r>
+              <w:rPr>
+                <w:b/>
+                <w:bCs/>
+                <w:color w:val="0F766E"/>
+                <w:sz w:val="17"/>
+                <w:szCs w:val="17"/>
+              </w:rPr>
+              <w:t xml:space="preserve">• Logotipo Oficial: </w:t>
+            </w:r>
+            <w:r>
+              <w:rPr>
+                <w:sz w:val="17"/>
+                <w:szCs w:val="17"/>
+              </w:rPr>
+              <w:t xml:space="preserve">Logo blanco de EstudioSimple en la esquina inferior derecha, tamaño del video de referencia.</w:t>
             </w:r>
           </w:p>
         </w:tc>
@@ -25425,7 +27207,7 @@
                 <w:sz w:val="18"/>
                 <w:szCs w:val="18"/>
               </w:rPr>
-              <w:t xml:space="preserve">Recuerda que en aumentos o descuentos sucesivos, la base cambia en cada etapa. Por eso dos rebajas sucesivas del diez por ciento producen un descuento real del diecinueve por ciento, no del veinte.</w:t>
+              <w:t xml:space="preserve">Para determinar la cantidad exacta que representa cada sector en un gráfico circular, multiplicamos el total de datos por la forma decimal o fraccionaria del porcentaje correspondiente.</w:t>
             </w:r>
           </w:p>
         </w:tc>
@@ -25529,7 +27311,7 @@
                 <w:sz w:val="18"/>
                 <w:szCs w:val="18"/>
               </w:rPr>
-              <w:t xml:space="preserve">Lee con atención si el número dado es la parte o el total</w:t>
+              <w:t xml:space="preserve">Distingue siempre si es parte o total</w:t>
             </w:r>
           </w:p>
         </w:tc>
@@ -25557,7 +27339,7 @@
                 <w:sz w:val="17"/>
                 <w:szCs w:val="17"/>
               </w:rPr>
-              <w:t xml:space="preserve">Modern anime style 16:9 widescreen illustration. Two 13-year-old student explorers, a girl with braided hair and a boy in a teal jacket, Chalkboard showing a red alert icon next to a common error: calculating 20% OF 12 instead of solving for the total. Sofía crossing out the error with a gentle smile and writing the correct formula.. Clear lighting, vibrant colors, clear negative space for layout. No text drawn by AI.</w:t>
+              <w:t xml:space="preserve">Modern anime style 16:9 widescreen illustration. Two 13-year-old student explorers, a girl with braided hair and a boy in a teal jacket, standing beside a board with a warning icon highlighting a common calculation step. Sofía gesturing with a gentle smile toward the correct proportion diagram, ample negative space on the left. Clear lighting, vibrant colors, clear negative space for layout. No text drawn by AI.</w:t>
             </w:r>
           </w:p>
           <w:p>
@@ -25580,6 +27362,28 @@
                 <w:szCs w:val="17"/>
               </w:rPr>
               <w:t xml:space="preserve">Cuadro comparativo: "Calcular el 20% de 12" = 2,4 vs "12 es el 20%" = 60</w:t>
+            </w:r>
+          </w:p>
+          <w:p>
+            <w:pPr>
+              <w:spacing w:after="20"/>
+            </w:pPr>
+            <w:r>
+              <w:rPr>
+                <w:b/>
+                <w:bCs/>
+                <w:color w:val="0F766E"/>
+                <w:sz w:val="17"/>
+                <w:szCs w:val="17"/>
+              </w:rPr>
+              <w:t xml:space="preserve">• Logotipo Oficial: </w:t>
+            </w:r>
+            <w:r>
+              <w:rPr>
+                <w:sz w:val="17"/>
+                <w:szCs w:val="17"/>
+              </w:rPr>
+              <w:t xml:space="preserve">Logo blanco de EstudioSimple en la esquina inferior derecha, tamaño del video de referencia.</w:t>
             </w:r>
           </w:p>
         </w:tc>
@@ -25682,7 +27486,7 @@
                 <w:sz w:val="18"/>
                 <w:szCs w:val="18"/>
               </w:rPr>
-              <w:t xml:space="preserve">EJEMPLO MODELADO: CASO 1</w:t>
+              <w:t xml:space="preserve">CASO MODELADO: TOTAL DE LIBROS</w:t>
             </w:r>
           </w:p>
           <w:p>
@@ -25704,7 +27508,7 @@
                 <w:sz w:val="18"/>
                 <w:szCs w:val="18"/>
               </w:rPr>
-              <w:t xml:space="preserve">En una biblioteca pública, 18 libros de literatura juvenil representan el 15% de</w:t>
+              <w:t xml:space="preserve">18 libros son el 15%: total 120</w:t>
             </w:r>
           </w:p>
         </w:tc>
@@ -25732,7 +27536,7 @@
                 <w:sz w:val="17"/>
                 <w:szCs w:val="17"/>
               </w:rPr>
-              <w:t xml:space="preserve">Modern anime style 16:9 widescreen illustration. Two 13-year-old student explorers, a girl with braided hair and a boy in a teal jacket, Sofía and Lucas in formal school uniforms, standing beside a projected sample test question with 4 multiple choice letters A, B, C, D clearly highlighted in clean boxes. Focused confident attitudes.. Clear lighting, vibrant colors, clear negative space for layout. No text drawn by AI.</w:t>
+              <w:t xml:space="preserve">Modern anime style 16:9 widescreen illustration. Two 13-year-old student explorers, a girl with braided hair and a boy in a teal jacket, studying and organizing books at a wooden table in a bright school library with tall bookshelves in the background. Natural soft daylight, calm focused expressions, clean vector aesthetic, ample negative space on the left. Clear lighting, vibrant colors, clear negative space for layout. No text drawn by AI.</w:t>
             </w:r>
           </w:p>
           <w:p>
@@ -25754,7 +27558,29 @@
                 <w:sz w:val="17"/>
                 <w:szCs w:val="17"/>
               </w:rPr>
-              <w:t xml:space="preserve">Resolución canónica: Total = (18 · 100) / 15 = 1.800 / 15 = 120 libros.</w:t>
+              <w:t xml:space="preserve">Resolución: Total = (18 · 100) / 15 = 1.800 / 15 = 120 libros</w:t>
+            </w:r>
+          </w:p>
+          <w:p>
+            <w:pPr>
+              <w:spacing w:after="20"/>
+            </w:pPr>
+            <w:r>
+              <w:rPr>
+                <w:b/>
+                <w:bCs/>
+                <w:color w:val="0F766E"/>
+                <w:sz w:val="17"/>
+                <w:szCs w:val="17"/>
+              </w:rPr>
+              <w:t xml:space="preserve">• Logotipo Oficial: </w:t>
+            </w:r>
+            <w:r>
+              <w:rPr>
+                <w:sz w:val="17"/>
+                <w:szCs w:val="17"/>
+              </w:rPr>
+              <w:t xml:space="preserve">Logo blanco de EstudioSimple en la esquina inferior derecha, tamaño del video de referencia.</w:t>
             </w:r>
           </w:p>
         </w:tc>
@@ -25775,7 +27601,7 @@
                 <w:sz w:val="18"/>
                 <w:szCs w:val="18"/>
               </w:rPr>
-              <w:t xml:space="preserve">Analicemos paso a paso el caso modelado: En una biblioteca pública, 18 libros de literatura juvenil representan el 15% del total de libros prestados este mes. ¿Cuántos libros prestó la biblioteca en total? Total = (18 · 100) / 15 = 1.800 / 15 = 120 libros. Por lo tanto, el resultado esperado es: Se prestaron 120 libros en total..</w:t>
+              <w:t xml:space="preserve">Analicemos el caso: 18 libros representan el 15% del total prestado. Multiplicamos 18 por 100 y dividimos por 15: el total es 120 libros.</w:t>
             </w:r>
           </w:p>
         </w:tc>
@@ -25907,7 +27733,7 @@
                 <w:sz w:val="17"/>
                 <w:szCs w:val="17"/>
               </w:rPr>
-              <w:t xml:space="preserve">Modern anime style 16:9 widescreen illustration. Two 13-year-old student explorers, a girl with braided hair and a boy in a teal jacket, Both students smiling warmly at the camera from their study desks, laptop open showing the practice portal interface with green checkmarks. Clean bright study room, ample negative space.. Clear lighting, vibrant colors, clear negative space for layout. No text drawn by AI.</w:t>
+              <w:t xml:space="preserve">Modern anime style 16:9 widescreen illustration. Two 13-year-old student explorers, a girl with braided hair and a boy in a teal jacket, both students smiling warmly at the camera from their study desks, laptop open showing a clean learning platform interface. Clean bright study room, ample negative space on the left. Clear lighting, vibrant colors, clear negative space for layout. No text drawn by AI.</w:t>
             </w:r>
           </w:p>
           <w:p>
@@ -25930,6 +27756,28 @@
                 <w:szCs w:val="17"/>
               </w:rPr>
               <w:t xml:space="preserve">Logotipo de EstudioSimple con botón: Iniciar Práctica Interactiva</w:t>
+            </w:r>
+          </w:p>
+          <w:p>
+            <w:pPr>
+              <w:spacing w:after="20"/>
+            </w:pPr>
+            <w:r>
+              <w:rPr>
+                <w:b/>
+                <w:bCs/>
+                <w:color w:val="0F766E"/>
+                <w:sz w:val="17"/>
+                <w:szCs w:val="17"/>
+              </w:rPr>
+              <w:t xml:space="preserve">• Logotipo Oficial: </w:t>
+            </w:r>
+            <w:r>
+              <w:rPr>
+                <w:sz w:val="17"/>
+                <w:szCs w:val="17"/>
+              </w:rPr>
+              <w:t xml:space="preserve">Logo blanco de EstudioSimple en la esquina inferior derecha, tamaño del video de referencia.</w:t>
             </w:r>
           </w:p>
         </w:tc>
@@ -26187,10 +28035,10 @@
           <w:b/>
           <w:bCs/>
         </w:rPr>
-        <w:t xml:space="preserve">Ejercicio 3 (Un microscopio escolar tiene un precio neto de $50.000 en una compraventa afecta a IVA. Se aplica un 10% de descuento y luego se agrega el 19% de IVA sobre el valor resultante.): </w:t>
-      </w:r>
-      <w:r>
-        <w:t xml:space="preserve">¿Cuál es el valor final a pagar con el IVA incluido?</w:t>
+        <w:t xml:space="preserve">Ejercicio 3 (En la biblioteca escolar, 24 libros de poesía representan el 20% del total de libros de literatura.): </w:t>
+      </w:r>
+      <w:r>
+        <w:t xml:space="preserve">¿Cuántos libros de literatura tiene la biblioteca en total?</w:t>
       </w:r>
     </w:p>
     <w:p>
@@ -26206,7 +28054,7 @@
         <w:t xml:space="preserve">• Respuesta esperada: </w:t>
       </w:r>
       <w:r>
-        <w:t xml:space="preserve">El valor final a pagar es $53.550.</w:t>
+        <w:t xml:space="preserve">La biblioteca tiene 120 libros de literatura en total.</w:t>
       </w:r>
       <w:r>
         <w:rPr>
@@ -26217,7 +28065,7 @@
         <w:t xml:space="preserve"> | Pista socrática de modelado: </w:t>
       </w:r>
       <w:r>
-        <w:t xml:space="preserve">Paso 1: $50.000 - $5.000 = $45.000. Paso 2: IVA = 45.000 · 0,19 = $8.550. Paso 3: $45.000 + $8.550 = $53.550.</w:t>
+        <w:t xml:space="preserve">Multiplica la parte por 100 y divide por el porcentaje: (24 · 100) : 20 = 2.400 : 20 = 120.</w:t>
       </w:r>
     </w:p>
     <w:p>
@@ -26371,10 +28219,10 @@
           <w:b/>
           <w:bCs/>
         </w:rPr>
-        <w:t xml:space="preserve">   • Variaciones Porcentuales Sucesivas: </w:t>
-      </w:r>
-      <w:r>
-        <w:t xml:space="preserve">En aumentos o descuentos sucesivos, cada porcentaje se calcula sobre la base del saldo anterior y no se suman directamente.</w:t>
+        <w:t xml:space="preserve">   • Estrategia de Resolución en Evaluaciones: </w:t>
+      </w:r>
+      <w:r>
+        <w:t xml:space="preserve">Para resolver reactivos formales, identifica si el valor conocido es parte o total, plantea la proporción correspondiente y descarta distractores con análisis de procedimiento.</w:t>
       </w:r>
     </w:p>
     <w:p>
@@ -26463,7 +28311,7 @@
         <w:t xml:space="preserve">Opciones: </w:t>
       </w:r>
       <w:r>
-        <w:t xml:space="preserve">50 estudiantes | 39 estudiantes | 3,92 estudiantes | 200 estudiantes</w:t>
+        <w:t xml:space="preserve">A) 50 estudiantes | B) 14 estudiantes | C) 3,92 estudiantes | D) 200 estudiantes</w:t>
       </w:r>
     </w:p>
     <w:p>
@@ -26479,7 +28327,7 @@
         <w:t xml:space="preserve">• Respuesta correcta: </w:t>
       </w:r>
       <w:r>
-        <w:t xml:space="preserve">50 estudiantes</w:t>
+        <w:t xml:space="preserve">A) 50 estudiantes</w:t>
       </w:r>
     </w:p>
     <w:p>
@@ -26515,7 +28363,7 @@
           <w:i/>
           <w:iCs/>
         </w:rPr>
-        <w:t xml:space="preserve">Total = (14 · 100) / 28 = 1.400 / 28 = 50 estudiantes (39 resulta de restar 28 - 14 equivocadamente; 3,92 resulta de calcular el 28% de 14 en vez de hallar el total).</w:t>
+        <w:t xml:space="preserve">Respuesta correcta: A) 50 estudiantes. Resolución: Total = (14 · 100) / 28 = 1.400 / 28 = 50 estudiantes. Análisis de distractores: B) 14 estudiantes resta directamente 28 − 14 = 14; C) 3,92 estudiantes calcula el 28% de 14 en vez del total; D) 200 estudiantes invierte los términos calculando (28 / 14) · 100 = 200.</w:t>
       </w:r>
     </w:p>
     <w:p>
@@ -26550,7 +28398,7 @@
         <w:t xml:space="preserve">Opciones: </w:t>
       </w:r>
       <w:r>
-        <w:t xml:space="preserve">160 libros | 240 libros | 40 libros | 100 libros</w:t>
+        <w:t xml:space="preserve">A) 160 libros | B) 240 libros | C) 40 libros | D) 100 libros</w:t>
       </w:r>
     </w:p>
     <w:p>
@@ -26566,7 +28414,7 @@
         <w:t xml:space="preserve">• Respuesta correcta: </w:t>
       </w:r>
       <w:r>
-        <w:t xml:space="preserve">160 libros</w:t>
+        <w:t xml:space="preserve">A) 160 libros</w:t>
       </w:r>
     </w:p>
     <w:p>
@@ -26602,7 +28450,7 @@
           <w:i/>
           <w:iCs/>
         </w:rPr>
-        <w:t xml:space="preserve">El porcentaje de ciencias es 100% - 60% = 40%. El 40% de 400 es 400 · 0,40 = 160 libros (240 corresponde a los libros de narrativa, no de ciencias; 40 confunde el porcentaje con la cantidad).</w:t>
+        <w:t xml:space="preserve">Respuesta correcta: A) 160 libros. Resolución: El porcentaje de ciencias es 100% − 60% = 40%. La cantidad es 400 · 0,40 = 160 libros. Análisis de distractores: B) 240 libros calcula los libros de narrativa (60%); C) 40 libros confunde el porcentaje restante (40%) con la cantidad de libros; D) 100 libros confunde el porcentaje total (100%) con una cantidad absoluta de libros.</w:t>
       </w:r>
     </w:p>
     <w:p>
@@ -26637,7 +28485,7 @@
         <w:t xml:space="preserve">Opciones: </w:t>
       </w:r>
       <w:r>
-        <w:t xml:space="preserve">Se ahorra $10.000 y paga $30.000 | Se ahorra $25.000 y paga $15.000 | Se ahorra $10.000 y paga $40.000 | Se ahorra $4.000 y paga $36.000</w:t>
+        <w:t xml:space="preserve">A) Se ahorra $10.000 y paga $30.000 | B) Se ahorra $25.000 y paga $15.000 | C) Se ahorra $10.000 y paga $40.000 | D) Se ahorra $4.000 y paga $36.000</w:t>
       </w:r>
     </w:p>
     <w:p>
@@ -26653,7 +28501,7 @@
         <w:t xml:space="preserve">• Respuesta correcta: </w:t>
       </w:r>
       <w:r>
-        <w:t xml:space="preserve">Se ahorra $10.000 y paga $30.000</w:t>
+        <w:t xml:space="preserve">A) Se ahorra $10.000 y paga $30.000</w:t>
       </w:r>
     </w:p>
     <w:p>
@@ -26689,7 +28537,7 @@
           <w:i/>
           <w:iCs/>
         </w:rPr>
-        <w:t xml:space="preserve">El 25% de $40.000 es la cuarta parte: $40.000 / 4 = $10.000 de rebaja. El precio final es $40.000 - $10.000 = $30.000.</w:t>
+        <w:t xml:space="preserve">Respuesta correcta: A) Se ahorra $10.000 y paga $30.000. Resolución: Descuento = $40.000 · 0,25 = $10.000. Precio final = $40.000 − $10.000 = $30.000. Análisis de distractores: B) confunde la tasa del 25% con un monto de $25.000; C) calcula el descuento pero no lo resta del precio de lista; D) divide $40.000 entre 10 en lugar de calcular la cuarta parte (25%).</w:t>
       </w:r>
     </w:p>
     <w:p>
@@ -26744,14 +28592,14 @@
 </w:t>
       </w:r>
       <w:r>
-        <w:t xml:space="preserve">Opciones: 30 personas | 27 personas | 90 personas | 3 personas | Correcta: 30 personas
+        <w:t xml:space="preserve">Opciones: A) 30 personas | B) 27 personas | C) 90 personas | D) 3 personas | Correcta: A) 30 personas
 </w:t>
       </w:r>
       <w:r>
         <w:rPr>
           <w:color w:val="B45309"/>
         </w:rPr>
-        <w:t xml:space="preserve">Refuerzo: Recuerda: multiplica 9 por 100 (900) y divide por 30 = 30 personas.</w:t>
+        <w:t xml:space="preserve">Refuerzo: Recuerda: multiplica 9 por 100 (900) y divide por 30: Total = 30 personas.</w:t>
       </w:r>
     </w:p>
     <w:p>

</xml_diff>